<commit_message>
docs: atualização na nomenclatura de Usuários e Máquinas
</commit_message>
<xml_diff>
--- a/docs/docs/Faculdade de Tecnologia Padre Danilo José de Oliveira Ohl.docx
+++ b/docs/docs/Faculdade de Tecnologia Padre Danilo José de Oliveira Ohl.docx
@@ -1,6 +1,6 @@
 
 <file path=word/document.xml><?xml version="1.0" encoding="utf-8"?>
-<w:document xmlns:wpc="http://schemas.microsoft.com/office/word/2010/wordprocessingCanvas" xmlns:cx="http://schemas.microsoft.com/office/drawing/2014/chartex" xmlns:cx1="http://schemas.microsoft.com/office/drawing/2015/9/8/chartex" xmlns:cx2="http://schemas.microsoft.com/office/drawing/2015/10/21/chartex" xmlns:cx3="http://schemas.microsoft.com/office/drawing/2016/5/9/chartex" xmlns:cx4="http://schemas.microsoft.com/office/drawing/2016/5/10/chartex" xmlns:cx5="http://schemas.microsoft.com/office/drawing/2016/5/11/chartex" xmlns:cx6="http://schemas.microsoft.com/office/drawing/2016/5/12/chartex" xmlns:cx7="http://schemas.microsoft.com/office/drawing/2016/5/13/chartex" xmlns:cx8="http://schemas.microsoft.com/office/drawing/2016/5/14/chartex" xmlns:mc="http://schemas.openxmlformats.org/markup-compatibility/2006" xmlns:aink="http://schemas.microsoft.com/office/drawing/2016/ink" xmlns:am3d="http://schemas.microsoft.com/office/drawing/2017/model3d" xmlns:o="urn:schemas-microsoft-com:office:office" xmlns:oel="http://schemas.microsoft.com/office/2019/extlst" xmlns:r="http://schemas.openxmlformats.org/officeDocument/2006/relationships" xmlns:m="http://schemas.openxmlformats.org/officeDocument/2006/math" xmlns:v="urn:schemas-microsoft-com:vml" xmlns:wp14="http://schemas.microsoft.com/office/word/2010/wordprocessingDrawing" xmlns:wp="http://schemas.openxmlformats.org/drawingml/2006/wordprocessingDrawing" xmlns:w10="urn:schemas-microsoft-com:office:word" xmlns:w="http://schemas.openxmlformats.org/wordprocessingml/2006/main" xmlns:w14="http://schemas.microsoft.com/office/word/2010/wordml" xmlns:w15="http://schemas.microsoft.com/office/word/2012/wordml" xmlns:w16cex="http://schemas.microsoft.com/office/word/2018/wordml/cex" xmlns:w16cid="http://schemas.microsoft.com/office/word/2016/wordml/cid" xmlns:w16="http://schemas.microsoft.com/office/word/2018/wordml" xmlns:w16sdtdh="http://schemas.microsoft.com/office/word/2020/wordml/sdtdatahash" xmlns:w16se="http://schemas.microsoft.com/office/word/2015/wordml/symex" xmlns:wpg="http://schemas.microsoft.com/office/word/2010/wordprocessingGroup" xmlns:wpi="http://schemas.microsoft.com/office/word/2010/wordprocessingInk" xmlns:wne="http://schemas.microsoft.com/office/word/2006/wordml" xmlns:wps="http://schemas.microsoft.com/office/word/2010/wordprocessingShape" mc:Ignorable="w14 w15 w16se w16cid w16 w16cex w16sdtdh wp14">
+<w:document xmlns:wpc="http://schemas.microsoft.com/office/word/2010/wordprocessingCanvas" xmlns:cx="http://schemas.microsoft.com/office/drawing/2014/chartex" xmlns:cx1="http://schemas.microsoft.com/office/drawing/2015/9/8/chartex" xmlns:cx2="http://schemas.microsoft.com/office/drawing/2015/10/21/chartex" xmlns:cx3="http://schemas.microsoft.com/office/drawing/2016/5/9/chartex" xmlns:cx4="http://schemas.microsoft.com/office/drawing/2016/5/10/chartex" xmlns:cx5="http://schemas.microsoft.com/office/drawing/2016/5/11/chartex" xmlns:cx6="http://schemas.microsoft.com/office/drawing/2016/5/12/chartex" xmlns:cx7="http://schemas.microsoft.com/office/drawing/2016/5/13/chartex" xmlns:cx8="http://schemas.microsoft.com/office/drawing/2016/5/14/chartex" xmlns:mc="http://schemas.openxmlformats.org/markup-compatibility/2006" xmlns:aink="http://schemas.microsoft.com/office/drawing/2016/ink" xmlns:am3d="http://schemas.microsoft.com/office/drawing/2017/model3d" xmlns:o="urn:schemas-microsoft-com:office:office" xmlns:oel="http://schemas.microsoft.com/office/2019/extlst" xmlns:r="http://schemas.openxmlformats.org/officeDocument/2006/relationships" xmlns:m="http://schemas.openxmlformats.org/officeDocument/2006/math" xmlns:v="urn:schemas-microsoft-com:vml" xmlns:wp14="http://schemas.microsoft.com/office/word/2010/wordprocessingDrawing" xmlns:wp="http://schemas.openxmlformats.org/drawingml/2006/wordprocessingDrawing" xmlns:w10="urn:schemas-microsoft-com:office:word" xmlns:w="http://schemas.openxmlformats.org/wordprocessingml/2006/main" xmlns:w14="http://schemas.microsoft.com/office/word/2010/wordml" xmlns:w15="http://schemas.microsoft.com/office/word/2012/wordml" xmlns:w16cex="http://schemas.microsoft.com/office/word/2018/wordml/cex" xmlns:w16cid="http://schemas.microsoft.com/office/word/2016/wordml/cid" xmlns:w16="http://schemas.microsoft.com/office/word/2018/wordml" xmlns:w16du="http://schemas.microsoft.com/office/word/2023/wordml/word16du" xmlns:w16sdtdh="http://schemas.microsoft.com/office/word/2020/wordml/sdtdatahash" xmlns:w16sdtfl="http://schemas.microsoft.com/office/word/2024/wordml/sdtformatlock" xmlns:w16se="http://schemas.microsoft.com/office/word/2015/wordml/symex" xmlns:wpg="http://schemas.microsoft.com/office/word/2010/wordprocessingGroup" xmlns:wpi="http://schemas.microsoft.com/office/word/2010/wordprocessingInk" xmlns:wne="http://schemas.microsoft.com/office/word/2006/wordml" xmlns:wps="http://schemas.microsoft.com/office/word/2010/wordprocessingShape" mc:Ignorable="w14 w15 w16se w16cid w16 w16cex w16sdtdh w16sdtfl w16du wp14">
   <w:body>
     <w:p>
       <w:pPr>
@@ -126,7 +126,7 @@
         <w:jc w:val="center"/>
       </w:pPr>
       <w:r>
-        <w:t>ROGER FERREIRA CARDOSO</w:t>
+        <w:t>MARCELO AUGUSTO SILVA</w:t>
       </w:r>
     </w:p>
     <w:p>
@@ -136,7 +136,7 @@
         <w:jc w:val="center"/>
       </w:pPr>
       <w:r>
-        <w:t>VICTOR HUGO MARCELINO SILVA</w:t>
+        <w:t>ROGER FERREIRA CARDOSO</w:t>
       </w:r>
     </w:p>
     <w:p>
@@ -145,6 +145,9 @@
         <w:ind w:left="0" w:firstLine="0"/>
         <w:jc w:val="center"/>
       </w:pPr>
+      <w:r>
+        <w:t>VICTOR HUGO MARCELINO SILVA</w:t>
+      </w:r>
     </w:p>
     <w:p>
       <w:pPr>
@@ -208,9 +211,6 @@
         <w:ind w:left="0" w:firstLine="0"/>
         <w:jc w:val="center"/>
       </w:pPr>
-      <w:r>
-        <w:t>PROJETO AD</w:t>
-      </w:r>
     </w:p>
     <w:p>
       <w:pPr>
@@ -218,6 +218,9 @@
         <w:ind w:left="0" w:firstLine="0"/>
         <w:jc w:val="center"/>
       </w:pPr>
+      <w:r>
+        <w:t>PROJETO AD</w:t>
+      </w:r>
     </w:p>
     <w:p>
       <w:pPr>
@@ -321,7 +324,6 @@
       <w:pPr>
         <w:spacing w:after="0" w:line="259" w:lineRule="auto"/>
         <w:ind w:left="0" w:firstLine="0"/>
-        <w:jc w:val="center"/>
       </w:pPr>
     </w:p>
     <w:p>
@@ -422,7 +424,7 @@
         <w:jc w:val="center"/>
       </w:pPr>
       <w:r>
-        <w:t>MIGUEL SANTANA MATOS</w:t>
+        <w:t>MARCELO AUGUSTO SILVA</w:t>
       </w:r>
     </w:p>
     <w:p>
@@ -649,14 +651,13 @@
     <w:p>
       <w:pPr>
         <w:spacing w:after="0" w:line="259" w:lineRule="auto"/>
-        <w:ind w:left="3540" w:firstLine="0"/>
+        <w:ind w:left="0" w:firstLine="0"/>
       </w:pPr>
     </w:p>
     <w:p>
       <w:pPr>
         <w:spacing w:after="0" w:line="259" w:lineRule="auto"/>
         <w:ind w:left="0" w:firstLine="0"/>
-        <w:jc w:val="center"/>
       </w:pPr>
     </w:p>
     <w:p>
@@ -990,7 +991,7 @@
       <w:sdtContent>
         <w:p>
           <w:pPr>
-            <w:pStyle w:val="CabealhodoSumrio"/>
+            <w:pStyle w:val="TOCHeading"/>
             <w:jc w:val="center"/>
             <w:rPr>
               <w:color w:val="auto"/>
@@ -1012,7 +1013,7 @@
         </w:p>
         <w:p>
           <w:pPr>
-            <w:pStyle w:val="Sumrio1"/>
+            <w:pStyle w:val="TOC1"/>
             <w:tabs>
               <w:tab w:val="right" w:leader="dot" w:pos="8560"/>
             </w:tabs>
@@ -1094,7 +1095,7 @@
         </w:p>
         <w:p>
           <w:pPr>
-            <w:pStyle w:val="Sumrio1"/>
+            <w:pStyle w:val="TOC1"/>
             <w:tabs>
               <w:tab w:val="left" w:pos="480"/>
               <w:tab w:val="right" w:leader="dot" w:pos="8560"/>
@@ -1180,7 +1181,7 @@
         </w:p>
         <w:p>
           <w:pPr>
-            <w:pStyle w:val="Sumrio1"/>
+            <w:pStyle w:val="TOC1"/>
             <w:tabs>
               <w:tab w:val="left" w:pos="480"/>
               <w:tab w:val="right" w:leader="dot" w:pos="8560"/>
@@ -1266,7 +1267,7 @@
         </w:p>
         <w:p>
           <w:pPr>
-            <w:pStyle w:val="Sumrio1"/>
+            <w:pStyle w:val="TOC1"/>
             <w:tabs>
               <w:tab w:val="left" w:pos="480"/>
               <w:tab w:val="right" w:leader="dot" w:pos="8560"/>
@@ -1352,7 +1353,7 @@
         </w:p>
         <w:p>
           <w:pPr>
-            <w:pStyle w:val="Sumrio1"/>
+            <w:pStyle w:val="TOC1"/>
             <w:tabs>
               <w:tab w:val="left" w:pos="480"/>
               <w:tab w:val="right" w:leader="dot" w:pos="8560"/>
@@ -1438,7 +1439,7 @@
         </w:p>
         <w:p>
           <w:pPr>
-            <w:pStyle w:val="Sumrio1"/>
+            <w:pStyle w:val="TOC1"/>
             <w:tabs>
               <w:tab w:val="left" w:pos="480"/>
               <w:tab w:val="right" w:leader="dot" w:pos="8560"/>
@@ -1524,7 +1525,7 @@
         </w:p>
         <w:p>
           <w:pPr>
-            <w:pStyle w:val="Sumrio2"/>
+            <w:pStyle w:val="TOC2"/>
             <w:tabs>
               <w:tab w:val="right" w:leader="dot" w:pos="8560"/>
             </w:tabs>
@@ -1594,7 +1595,7 @@
         </w:p>
         <w:p>
           <w:pPr>
-            <w:pStyle w:val="Sumrio2"/>
+            <w:pStyle w:val="TOC2"/>
             <w:tabs>
               <w:tab w:val="right" w:leader="dot" w:pos="8560"/>
             </w:tabs>
@@ -1664,7 +1665,7 @@
         </w:p>
         <w:p>
           <w:pPr>
-            <w:pStyle w:val="Sumrio2"/>
+            <w:pStyle w:val="TOC2"/>
             <w:tabs>
               <w:tab w:val="right" w:leader="dot" w:pos="8560"/>
             </w:tabs>
@@ -1734,7 +1735,7 @@
         </w:p>
         <w:p>
           <w:pPr>
-            <w:pStyle w:val="Sumrio2"/>
+            <w:pStyle w:val="TOC2"/>
             <w:tabs>
               <w:tab w:val="right" w:leader="dot" w:pos="8560"/>
             </w:tabs>
@@ -1804,7 +1805,7 @@
         </w:p>
         <w:p>
           <w:pPr>
-            <w:pStyle w:val="Sumrio1"/>
+            <w:pStyle w:val="TOC1"/>
             <w:tabs>
               <w:tab w:val="left" w:pos="480"/>
               <w:tab w:val="right" w:leader="dot" w:pos="8560"/>
@@ -1890,7 +1891,7 @@
         </w:p>
         <w:p>
           <w:pPr>
-            <w:pStyle w:val="Sumrio1"/>
+            <w:pStyle w:val="TOC1"/>
             <w:tabs>
               <w:tab w:val="left" w:pos="480"/>
               <w:tab w:val="right" w:leader="dot" w:pos="8560"/>
@@ -1976,7 +1977,7 @@
         </w:p>
         <w:p>
           <w:pPr>
-            <w:pStyle w:val="Sumrio1"/>
+            <w:pStyle w:val="TOC1"/>
             <w:tabs>
               <w:tab w:val="left" w:pos="480"/>
               <w:tab w:val="right" w:leader="dot" w:pos="8560"/>
@@ -2008,7 +2009,21 @@
                 <w:rStyle w:val="Hyperlink"/>
                 <w:noProof/>
               </w:rPr>
-              <w:t>Unidade Organizacional</w:t>
+              <w:t>Unidade Org</w:t>
+            </w:r>
+            <w:r>
+              <w:rPr>
+                <w:rStyle w:val="Hyperlink"/>
+                <w:noProof/>
+              </w:rPr>
+              <w:t>a</w:t>
+            </w:r>
+            <w:r>
+              <w:rPr>
+                <w:rStyle w:val="Hyperlink"/>
+                <w:noProof/>
+              </w:rPr>
+              <w:t>nizacional</w:t>
             </w:r>
             <w:r>
               <w:rPr>
@@ -2062,7 +2077,7 @@
         </w:p>
         <w:p>
           <w:pPr>
-            <w:pStyle w:val="Sumrio1"/>
+            <w:pStyle w:val="TOC1"/>
             <w:tabs>
               <w:tab w:val="left" w:pos="480"/>
               <w:tab w:val="right" w:leader="dot" w:pos="8560"/>
@@ -2148,7 +2163,7 @@
         </w:p>
         <w:p>
           <w:pPr>
-            <w:pStyle w:val="Sumrio2"/>
+            <w:pStyle w:val="TOC2"/>
             <w:tabs>
               <w:tab w:val="right" w:leader="dot" w:pos="8560"/>
             </w:tabs>
@@ -2218,7 +2233,7 @@
         </w:p>
         <w:p>
           <w:pPr>
-            <w:pStyle w:val="Sumrio1"/>
+            <w:pStyle w:val="TOC1"/>
             <w:tabs>
               <w:tab w:val="left" w:pos="720"/>
               <w:tab w:val="right" w:leader="dot" w:pos="8560"/>
@@ -2304,7 +2319,7 @@
         </w:p>
         <w:p>
           <w:pPr>
-            <w:pStyle w:val="Sumrio1"/>
+            <w:pStyle w:val="TOC1"/>
             <w:tabs>
               <w:tab w:val="left" w:pos="720"/>
               <w:tab w:val="right" w:leader="dot" w:pos="8560"/>
@@ -2390,7 +2405,7 @@
         </w:p>
         <w:p>
           <w:pPr>
-            <w:pStyle w:val="Sumrio1"/>
+            <w:pStyle w:val="TOC1"/>
             <w:tabs>
               <w:tab w:val="left" w:pos="720"/>
               <w:tab w:val="right" w:leader="dot" w:pos="8560"/>
@@ -2476,7 +2491,7 @@
         </w:p>
         <w:p>
           <w:pPr>
-            <w:pStyle w:val="Sumrio1"/>
+            <w:pStyle w:val="TOC1"/>
             <w:tabs>
               <w:tab w:val="left" w:pos="720"/>
               <w:tab w:val="right" w:leader="dot" w:pos="8560"/>
@@ -2562,7 +2577,7 @@
         </w:p>
         <w:p>
           <w:pPr>
-            <w:pStyle w:val="Sumrio1"/>
+            <w:pStyle w:val="TOC1"/>
             <w:tabs>
               <w:tab w:val="left" w:pos="720"/>
               <w:tab w:val="right" w:leader="dot" w:pos="8560"/>
@@ -2648,7 +2663,7 @@
         </w:p>
         <w:p>
           <w:pPr>
-            <w:pStyle w:val="Sumrio1"/>
+            <w:pStyle w:val="TOC1"/>
             <w:tabs>
               <w:tab w:val="left" w:pos="720"/>
               <w:tab w:val="right" w:leader="dot" w:pos="8560"/>
@@ -2734,7 +2749,7 @@
         </w:p>
         <w:p>
           <w:pPr>
-            <w:pStyle w:val="Sumrio1"/>
+            <w:pStyle w:val="TOC1"/>
             <w:tabs>
               <w:tab w:val="left" w:pos="720"/>
               <w:tab w:val="right" w:leader="dot" w:pos="8560"/>
@@ -2820,7 +2835,7 @@
         </w:p>
         <w:p>
           <w:pPr>
-            <w:pStyle w:val="Sumrio1"/>
+            <w:pStyle w:val="TOC1"/>
             <w:tabs>
               <w:tab w:val="left" w:pos="720"/>
               <w:tab w:val="right" w:leader="dot" w:pos="8560"/>
@@ -2906,7 +2921,7 @@
         </w:p>
         <w:p>
           <w:pPr>
-            <w:pStyle w:val="Sumrio1"/>
+            <w:pStyle w:val="TOC1"/>
             <w:tabs>
               <w:tab w:val="left" w:pos="720"/>
               <w:tab w:val="right" w:leader="dot" w:pos="8560"/>
@@ -2992,7 +3007,7 @@
         </w:p>
         <w:p>
           <w:pPr>
-            <w:pStyle w:val="Sumrio1"/>
+            <w:pStyle w:val="TOC1"/>
             <w:tabs>
               <w:tab w:val="left" w:pos="720"/>
               <w:tab w:val="right" w:leader="dot" w:pos="8560"/>
@@ -3078,7 +3093,7 @@
         </w:p>
         <w:p>
           <w:pPr>
-            <w:pStyle w:val="Sumrio1"/>
+            <w:pStyle w:val="TOC1"/>
             <w:tabs>
               <w:tab w:val="left" w:pos="720"/>
               <w:tab w:val="right" w:leader="dot" w:pos="8560"/>
@@ -3164,7 +3179,7 @@
         </w:p>
         <w:p>
           <w:pPr>
-            <w:pStyle w:val="Sumrio1"/>
+            <w:pStyle w:val="TOC1"/>
             <w:tabs>
               <w:tab w:val="left" w:pos="720"/>
               <w:tab w:val="right" w:leader="dot" w:pos="8560"/>
@@ -3250,7 +3265,7 @@
         </w:p>
         <w:p>
           <w:pPr>
-            <w:pStyle w:val="Sumrio1"/>
+            <w:pStyle w:val="TOC1"/>
             <w:tabs>
               <w:tab w:val="left" w:pos="720"/>
               <w:tab w:val="right" w:leader="dot" w:pos="8560"/>
@@ -3336,7 +3351,7 @@
         </w:p>
         <w:p>
           <w:pPr>
-            <w:pStyle w:val="Sumrio1"/>
+            <w:pStyle w:val="TOC1"/>
             <w:tabs>
               <w:tab w:val="left" w:pos="720"/>
               <w:tab w:val="right" w:leader="dot" w:pos="8560"/>
@@ -3422,7 +3437,7 @@
         </w:p>
         <w:p>
           <w:pPr>
-            <w:pStyle w:val="Sumrio1"/>
+            <w:pStyle w:val="TOC1"/>
             <w:tabs>
               <w:tab w:val="left" w:pos="720"/>
               <w:tab w:val="right" w:leader="dot" w:pos="8560"/>
@@ -3550,7 +3565,7 @@
     </w:p>
     <w:p>
       <w:pPr>
-        <w:pStyle w:val="Ttulo1"/>
+        <w:pStyle w:val="Heading1"/>
         <w:rPr>
           <w:b w:val="0"/>
         </w:rPr>
@@ -3635,10 +3650,9 @@
     <w:p/>
     <w:p/>
     <w:p/>
-    <w:p/>
-    <w:p>
-      <w:pPr>
-        <w:pStyle w:val="Ttulo1"/>
+    <w:p>
+      <w:pPr>
+        <w:pStyle w:val="Heading1"/>
         <w:numPr>
           <w:ilvl w:val="0"/>
           <w:numId w:val="38"/>
@@ -3646,6 +3660,7 @@
       </w:pPr>
       <w:bookmarkStart w:id="1" w:name="_Toc239406855"/>
       <w:r>
+        <w:lastRenderedPageBreak/>
         <w:t>Levantamento dos computadores</w:t>
       </w:r>
       <w:bookmarkEnd w:id="1"/>
@@ -3718,7 +3733,7 @@
     <w:p/>
     <w:p>
       <w:pPr>
-        <w:pStyle w:val="Ttulo1"/>
+        <w:pStyle w:val="Heading1"/>
         <w:numPr>
           <w:ilvl w:val="0"/>
           <w:numId w:val="38"/>
@@ -4183,7 +4198,7 @@
     <w:p/>
     <w:p>
       <w:pPr>
-        <w:pStyle w:val="Legenda"/>
+        <w:pStyle w:val="Caption"/>
         <w:ind w:left="0" w:firstLine="0"/>
       </w:pPr>
       <w:r>
@@ -4233,7 +4248,7 @@
     </w:p>
     <w:p>
       <w:pPr>
-        <w:pStyle w:val="Ttulo1"/>
+        <w:pStyle w:val="Heading1"/>
         <w:numPr>
           <w:ilvl w:val="0"/>
           <w:numId w:val="38"/>
@@ -4384,7 +4399,7 @@
     </w:tbl>
     <w:p>
       <w:pPr>
-        <w:pStyle w:val="Legenda"/>
+        <w:pStyle w:val="Caption"/>
       </w:pPr>
       <w:r>
         <w:t xml:space="preserve">Tabela </w:t>
@@ -4437,7 +4452,7 @@
     <w:p/>
     <w:p>
       <w:pPr>
-        <w:pStyle w:val="Ttulo1"/>
+        <w:pStyle w:val="Heading1"/>
         <w:numPr>
           <w:ilvl w:val="0"/>
           <w:numId w:val="38"/>
@@ -4824,7 +4839,7 @@
     </w:tbl>
     <w:p>
       <w:pPr>
-        <w:pStyle w:val="Legenda"/>
+        <w:pStyle w:val="Caption"/>
       </w:pPr>
       <w:r>
         <w:t xml:space="preserve">Tabela </w:t>
@@ -4860,7 +4875,7 @@
     <w:p/>
     <w:p>
       <w:pPr>
-        <w:pStyle w:val="Ttulo1"/>
+        <w:pStyle w:val="Heading1"/>
         <w:numPr>
           <w:ilvl w:val="0"/>
           <w:numId w:val="38"/>
@@ -4884,7 +4899,7 @@
     </w:p>
     <w:p>
       <w:pPr>
-        <w:pStyle w:val="Ttulo2"/>
+        <w:pStyle w:val="Heading2"/>
         <w:rPr>
           <w:b w:val="0"/>
         </w:rPr>
@@ -4905,7 +4920,7 @@
     </w:p>
     <w:p>
       <w:pPr>
-        <w:pStyle w:val="Ttulo2"/>
+        <w:pStyle w:val="Heading2"/>
         <w:rPr>
           <w:b w:val="0"/>
         </w:rPr>
@@ -4970,7 +4985,7 @@
     </w:p>
     <w:p>
       <w:pPr>
-        <w:pStyle w:val="Ttulo2"/>
+        <w:pStyle w:val="Heading2"/>
         <w:rPr>
           <w:b w:val="0"/>
         </w:rPr>
@@ -5035,7 +5050,7 @@
     </w:p>
     <w:p>
       <w:pPr>
-        <w:pStyle w:val="Ttulo2"/>
+        <w:pStyle w:val="Heading2"/>
         <w:rPr>
           <w:b w:val="0"/>
         </w:rPr>
@@ -5135,7 +5150,7 @@
     </w:p>
     <w:p>
       <w:pPr>
-        <w:pStyle w:val="Ttulo1"/>
+        <w:pStyle w:val="Heading1"/>
         <w:numPr>
           <w:ilvl w:val="0"/>
           <w:numId w:val="38"/>
@@ -5720,7 +5735,7 @@
     <w:p/>
     <w:p>
       <w:pPr>
-        <w:pStyle w:val="Ttulo1"/>
+        <w:pStyle w:val="Heading1"/>
         <w:numPr>
           <w:ilvl w:val="0"/>
           <w:numId w:val="38"/>
@@ -5955,7 +5970,7 @@
     </w:p>
     <w:p>
       <w:pPr>
-        <w:pStyle w:val="Ttulo1"/>
+        <w:pStyle w:val="Heading1"/>
         <w:numPr>
           <w:ilvl w:val="0"/>
           <w:numId w:val="38"/>
@@ -5999,77 +6014,101 @@
     <w:p/>
     <w:p>
       <w:r>
-        <w:t>DOMINIO: adm.fatecbarueri.local</w:t>
-      </w:r>
-    </w:p>
-    <w:p>
-      <w:r>
-        <w:t>|</w:t>
-      </w:r>
-    </w:p>
-    <w:p>
-      <w:r>
-        <w:t>|- AD-ACAD (Acadêmico)</w:t>
-      </w:r>
-    </w:p>
-    <w:p>
-      <w:r>
-        <w:t>|    |- OU_Usuarios</w:t>
-      </w:r>
-    </w:p>
-    <w:p>
-      <w:r>
-        <w:t>|    |      |- GRP_Alunos</w:t>
-      </w:r>
-    </w:p>
-    <w:p>
-      <w:r>
-        <w:t>|    |      |- GRP_Professores</w:t>
-      </w:r>
-    </w:p>
-    <w:p>
-      <w:r>
-        <w:t>|    |</w:t>
-      </w:r>
-    </w:p>
-    <w:p>
-      <w:r>
-        <w:t>|    |- OU_Computadores</w:t>
-      </w:r>
-    </w:p>
-    <w:p>
-      <w:r>
-        <w:t xml:space="preserve">|           </w:t>
-      </w:r>
-    </w:p>
-    <w:p>
-      <w:r>
-        <w:t>|</w:t>
-      </w:r>
-    </w:p>
-    <w:p>
-      <w:r>
-        <w:t>|- AD-ADM (Administrativo)</w:t>
-      </w:r>
-    </w:p>
-    <w:p>
-      <w:r>
-        <w:t xml:space="preserve">     |- OU_Usuarios</w:t>
-      </w:r>
-    </w:p>
-    <w:p>
-      <w:r>
-        <w:t xml:space="preserve">     |      |- GRP_Administrativo</w:t>
-      </w:r>
-    </w:p>
-    <w:p>
-      <w:r>
-        <w:t xml:space="preserve">     |</w:t>
-      </w:r>
-    </w:p>
-    <w:p>
-      <w:r>
-        <w:t xml:space="preserve">     |- OU_Computadores</w:t>
+        <w:t>Domínio: adm.fatecbarueri.local</w:t>
+      </w:r>
+    </w:p>
+    <w:p/>
+    <w:p>
+      <w:r>
+        <w:t>├── AD-ACAD</w:t>
+      </w:r>
+    </w:p>
+    <w:p>
+      <w:r>
+        <w:t>│   ├── OU_Usuarios</w:t>
+      </w:r>
+    </w:p>
+    <w:p>
+      <w:r>
+        <w:t>│   ├── OU_Computadores</w:t>
+      </w:r>
+    </w:p>
+    <w:p>
+      <w:r>
+        <w:t>│   │   ├── OU_Laboratorios</w:t>
+      </w:r>
+    </w:p>
+    <w:p>
+      <w:r>
+        <w:t>│   │   │   ├── LAB-</w:t>
+      </w:r>
+      <w:r>
+        <w:t>XX</w:t>
+      </w:r>
+    </w:p>
+    <w:p>
+      <w:r>
+        <w:t>│   ├── OU_Grupos</w:t>
+      </w:r>
+    </w:p>
+    <w:p>
+      <w:r>
+        <w:t>│       ├── GRP_Alunos</w:t>
+      </w:r>
+    </w:p>
+    <w:p>
+      <w:r>
+        <w:t>│       ├── GRP_Professores</w:t>
+      </w:r>
+    </w:p>
+    <w:p>
+      <w:r>
+        <w:t>│</w:t>
+      </w:r>
+    </w:p>
+    <w:p>
+      <w:r>
+        <w:t>├── AD-ADM</w:t>
+      </w:r>
+    </w:p>
+    <w:p>
+      <w:r>
+        <w:t>│   ├── OU_Usuarios</w:t>
+      </w:r>
+    </w:p>
+    <w:p>
+      <w:r>
+        <w:t>│   ├── OU_Computadores</w:t>
+      </w:r>
+    </w:p>
+    <w:p>
+      <w:r>
+        <w:t>│   ├── OU_Grupos</w:t>
+      </w:r>
+    </w:p>
+    <w:p>
+      <w:r>
+        <w:t>│       ├── GRP_Diretoria</w:t>
+      </w:r>
+    </w:p>
+    <w:p>
+      <w:r>
+        <w:t>│       ├── GRP_Coordenacao</w:t>
+      </w:r>
+    </w:p>
+    <w:p>
+      <w:r>
+        <w:t>│       ├── GRP_Secretaria</w:t>
+      </w:r>
+    </w:p>
+    <w:p>
+      <w:r>
+        <w:t>│       ├── GRP_Administrativo</w:t>
+      </w:r>
+    </w:p>
+    <w:p>
+      <w:r>
+        <w:t>│       ├── GRP_TI</w:t>
       </w:r>
     </w:p>
     <w:p>
@@ -6079,36 +6118,14 @@
     </w:p>
     <w:p>
       <w:r>
-        <w:t xml:space="preserve">           </w:t>
-      </w:r>
-    </w:p>
-    <w:p/>
-    <w:p/>
-    <w:p/>
-    <w:p/>
-    <w:p>
-      <w:pPr>
-        <w:ind w:left="0" w:firstLine="0"/>
-      </w:pPr>
-    </w:p>
-    <w:p>
-      <w:pPr>
-        <w:ind w:left="0" w:firstLine="0"/>
-      </w:pPr>
-    </w:p>
-    <w:p>
-      <w:pPr>
-        <w:ind w:left="0" w:firstLine="0"/>
-      </w:pPr>
-    </w:p>
-    <w:p>
-      <w:pPr>
-        <w:ind w:left="0" w:firstLine="0"/>
-      </w:pPr>
-    </w:p>
-    <w:p>
-      <w:pPr>
-        <w:pStyle w:val="Ttulo1"/>
+        <w:t xml:space="preserve">          </w:t>
+      </w:r>
+    </w:p>
+    <w:p/>
+    <w:p/>
+    <w:p>
+      <w:pPr>
+        <w:pStyle w:val="Heading1"/>
         <w:numPr>
           <w:ilvl w:val="0"/>
           <w:numId w:val="38"/>
@@ -6124,20 +6141,8 @@
     <w:p/>
     <w:p>
       <w:pPr>
-        <w:rPr>
-          <w:b/>
-          <w:bCs/>
-        </w:rPr>
-      </w:pPr>
-      <w:r>
-        <w:rPr>
-          <w:b/>
-          <w:bCs/>
-        </w:rPr>
-        <w:t>9. Requisitos de Segurança</w:t>
-      </w:r>
-    </w:p>
-    <w:p>
+        <w:ind w:left="0" w:firstLine="0"/>
+      </w:pPr>
       <w:r>
         <w:t xml:space="preserve">Os requisitos de segurança do Active Directory da Fatec Barueri foram moldados em conjunto com a própria instituição, considerando suas necessidades acadêmicas e administrativas, além de referências internacionais como </w:t>
       </w:r>
@@ -6332,7 +6337,7 @@
     </w:p>
     <w:p>
       <w:pPr>
-        <w:pStyle w:val="Ttulo2"/>
+        <w:pStyle w:val="Heading2"/>
       </w:pPr>
       <w:bookmarkStart w:id="14" w:name="_Toc239406868"/>
       <w:r>
@@ -6384,7 +6389,6 @@
           <w:b/>
           <w:bCs/>
         </w:rPr>
-        <w:lastRenderedPageBreak/>
         <w:t>Estrutura de OUs</w:t>
       </w:r>
       <w:r>
@@ -6403,6 +6407,7 @@
           <w:b/>
           <w:bCs/>
         </w:rPr>
+        <w:lastRenderedPageBreak/>
         <w:t>Grupos de usuários</w:t>
       </w:r>
       <w:r>
@@ -6556,7 +6561,17 @@
     </w:p>
     <w:p>
       <w:pPr>
-        <w:pStyle w:val="Ttulo1"/>
+        <w:ind w:left="0" w:firstLine="0"/>
+      </w:pPr>
+    </w:p>
+    <w:p>
+      <w:pPr>
+        <w:ind w:left="0" w:firstLine="0"/>
+      </w:pPr>
+    </w:p>
+    <w:p>
+      <w:pPr>
+        <w:pStyle w:val="Heading1"/>
         <w:numPr>
           <w:ilvl w:val="0"/>
           <w:numId w:val="38"/>
@@ -6565,15 +6580,10 @@
       <w:bookmarkStart w:id="15" w:name="_Toc239406869"/>
       <w:r>
         <w:lastRenderedPageBreak/>
-        <w:t>Políticas de segurança (</w:t>
-      </w:r>
-      <w:proofErr w:type="spellStart"/>
-      <w:r>
-        <w:t>GPOs</w:t>
-      </w:r>
-      <w:proofErr w:type="spellEnd"/>
-      <w:r>
-        <w:t>)</w:t>
+        <w:t xml:space="preserve"> </w:t>
+      </w:r>
+      <w:r>
+        <w:t>Políticas de segurança (GPOs)</w:t>
       </w:r>
       <w:bookmarkEnd w:id="15"/>
     </w:p>
@@ -7038,7 +7048,7 @@
     <w:p/>
     <w:p>
       <w:pPr>
-        <w:pStyle w:val="Ttulo1"/>
+        <w:pStyle w:val="Heading1"/>
         <w:numPr>
           <w:ilvl w:val="0"/>
           <w:numId w:val="38"/>
@@ -9485,7 +9495,7 @@
     <w:p/>
     <w:p>
       <w:pPr>
-        <w:pStyle w:val="Ttulo1"/>
+        <w:pStyle w:val="Heading1"/>
         <w:numPr>
           <w:ilvl w:val="0"/>
           <w:numId w:val="38"/>
@@ -9494,15 +9504,7 @@
       <w:bookmarkStart w:id="17" w:name="_Toc239406871"/>
       <w:r>
         <w:lastRenderedPageBreak/>
-        <w:t>Requisitos Não Funcionais (</w:t>
-      </w:r>
-      <w:proofErr w:type="spellStart"/>
-      <w:r>
-        <w:t>RNFs</w:t>
-      </w:r>
-      <w:proofErr w:type="spellEnd"/>
-      <w:r>
-        <w:t>)</w:t>
+        <w:t>Requisitos Não Funcionais (RNFs)</w:t>
       </w:r>
       <w:bookmarkEnd w:id="17"/>
     </w:p>
@@ -10234,7 +10236,7 @@
     <w:p/>
     <w:p>
       <w:pPr>
-        <w:pStyle w:val="Ttulo1"/>
+        <w:pStyle w:val="Heading1"/>
         <w:numPr>
           <w:ilvl w:val="0"/>
           <w:numId w:val="38"/>
@@ -10243,15 +10245,7 @@
       <w:bookmarkStart w:id="18" w:name="_Toc239406872"/>
       <w:r>
         <w:lastRenderedPageBreak/>
-        <w:t>Requisitos Funcionais (</w:t>
-      </w:r>
-      <w:proofErr w:type="spellStart"/>
-      <w:r>
-        <w:t>RFs</w:t>
-      </w:r>
-      <w:proofErr w:type="spellEnd"/>
-      <w:r>
-        <w:t>)</w:t>
+        <w:t>Requisitos Funcionais (RFs)</w:t>
       </w:r>
       <w:bookmarkEnd w:id="18"/>
     </w:p>
@@ -10719,7 +10713,7 @@
     <w:p/>
     <w:p>
       <w:pPr>
-        <w:pStyle w:val="Ttulo1"/>
+        <w:pStyle w:val="Heading1"/>
         <w:numPr>
           <w:ilvl w:val="0"/>
           <w:numId w:val="38"/>
@@ -10803,7 +10797,7 @@
     <w:p/>
     <w:p>
       <w:pPr>
-        <w:pStyle w:val="Ttulo1"/>
+        <w:pStyle w:val="Heading1"/>
         <w:numPr>
           <w:ilvl w:val="0"/>
           <w:numId w:val="38"/>
@@ -10912,7 +10906,7 @@
     <w:p/>
     <w:p>
       <w:pPr>
-        <w:pStyle w:val="Ttulo1"/>
+        <w:pStyle w:val="Heading1"/>
         <w:numPr>
           <w:ilvl w:val="0"/>
           <w:numId w:val="38"/>
@@ -11053,7 +11047,7 @@
     <w:p/>
     <w:p>
       <w:pPr>
-        <w:pStyle w:val="Ttulo1"/>
+        <w:pStyle w:val="Heading1"/>
         <w:numPr>
           <w:ilvl w:val="0"/>
           <w:numId w:val="38"/>
@@ -11131,7 +11125,7 @@
     <w:p/>
     <w:p>
       <w:pPr>
-        <w:pStyle w:val="Ttulo1"/>
+        <w:pStyle w:val="Heading1"/>
         <w:numPr>
           <w:ilvl w:val="0"/>
           <w:numId w:val="38"/>
@@ -11400,7 +11394,7 @@
     </w:p>
     <w:p>
       <w:pPr>
-        <w:pStyle w:val="Ttulo1"/>
+        <w:pStyle w:val="Heading1"/>
         <w:numPr>
           <w:ilvl w:val="0"/>
           <w:numId w:val="38"/>
@@ -11514,7 +11508,7 @@
     <w:p/>
     <w:p>
       <w:pPr>
-        <w:pStyle w:val="Ttulo1"/>
+        <w:pStyle w:val="Heading1"/>
         <w:numPr>
           <w:ilvl w:val="0"/>
           <w:numId w:val="38"/>
@@ -11845,7 +11839,7 @@
     </w:p>
     <w:p>
       <w:pPr>
-        <w:pStyle w:val="Ttulo1"/>
+        <w:pStyle w:val="Heading1"/>
         <w:numPr>
           <w:ilvl w:val="0"/>
           <w:numId w:val="38"/>
@@ -11915,7 +11909,7 @@
     <w:p/>
     <w:p>
       <w:pPr>
-        <w:pStyle w:val="Ttulo1"/>
+        <w:pStyle w:val="Heading1"/>
         <w:numPr>
           <w:ilvl w:val="0"/>
           <w:numId w:val="38"/>
@@ -12485,7 +12479,7 @@
     <w:p/>
     <w:p>
       <w:pPr>
-        <w:pStyle w:val="Ttulo1"/>
+        <w:pStyle w:val="Heading1"/>
         <w:numPr>
           <w:ilvl w:val="0"/>
           <w:numId w:val="38"/>
@@ -12795,7 +12789,7 @@
     </w:p>
     <w:p>
       <w:pPr>
-        <w:pStyle w:val="Ttulo1"/>
+        <w:pStyle w:val="Heading1"/>
         <w:numPr>
           <w:ilvl w:val="0"/>
           <w:numId w:val="38"/>
@@ -12894,6 +12888,324 @@
         </w:drawing>
       </w:r>
     </w:p>
+    <w:p/>
+    <w:p/>
+    <w:p/>
+    <w:p/>
+    <w:p/>
+    <w:p/>
+    <w:p/>
+    <w:p/>
+    <w:p/>
+    <w:p/>
+    <w:p/>
+    <w:p/>
+    <w:p/>
+    <w:p/>
+    <w:p>
+      <w:pPr>
+        <w:pStyle w:val="Heading1"/>
+        <w:numPr>
+          <w:ilvl w:val="0"/>
+          <w:numId w:val="38"/>
+        </w:numPr>
+      </w:pPr>
+      <w:r>
+        <w:lastRenderedPageBreak/>
+        <w:t xml:space="preserve"> </w:t>
+      </w:r>
+      <w:r>
+        <w:t>Convenção de Nomenclatura de Usuários</w:t>
+      </w:r>
+    </w:p>
+    <w:p>
+      <w:r>
+        <w:t>A nomenclatura de usuários no Active Directory da Fatec Barueri seguirá o padrão institucional definido pelo Centro Paula Souza (CPS), utilizando o e-mail institucional como login.</w:t>
+      </w:r>
+    </w:p>
+    <w:p>
+      <w:pPr>
+        <w:numPr>
+          <w:ilvl w:val="0"/>
+          <w:numId w:val="41"/>
+        </w:numPr>
+      </w:pPr>
+      <w:r>
+        <w:rPr>
+          <w:b/>
+          <w:bCs/>
+        </w:rPr>
+        <w:t>Formato principal</w:t>
+      </w:r>
+      <w:r>
+        <w:t>: o login será composto por nome.sobrenome.</w:t>
+      </w:r>
+    </w:p>
+    <w:p>
+      <w:pPr>
+        <w:numPr>
+          <w:ilvl w:val="0"/>
+          <w:numId w:val="41"/>
+        </w:numPr>
+      </w:pPr>
+      <w:r>
+        <w:rPr>
+          <w:b/>
+          <w:bCs/>
+        </w:rPr>
+        <w:t>Repetição de nomes</w:t>
+      </w:r>
+      <w:r>
+        <w:t>: em caso de duplicidade, serão adicionados números sequenciais após o sobrenome (ex.: nome.sobrenome1, nome.sobrenome2).</w:t>
+      </w:r>
+    </w:p>
+    <w:p>
+      <w:pPr>
+        <w:numPr>
+          <w:ilvl w:val="0"/>
+          <w:numId w:val="41"/>
+        </w:numPr>
+      </w:pPr>
+      <w:r>
+        <w:rPr>
+          <w:b/>
+          <w:bCs/>
+        </w:rPr>
+        <w:t>Domínios institucionais</w:t>
+      </w:r>
+      <w:r>
+        <w:t>:</w:t>
+      </w:r>
+    </w:p>
+    <w:p>
+      <w:pPr>
+        <w:numPr>
+          <w:ilvl w:val="1"/>
+          <w:numId w:val="41"/>
+        </w:numPr>
+      </w:pPr>
+      <w:r>
+        <w:t>Alunos → @aluno.cps.sp.gov.br</w:t>
+      </w:r>
+    </w:p>
+    <w:p>
+      <w:pPr>
+        <w:numPr>
+          <w:ilvl w:val="1"/>
+          <w:numId w:val="41"/>
+        </w:numPr>
+      </w:pPr>
+      <w:r>
+        <w:t>Professores e colaboradores → @cps.sp.gov.br</w:t>
+      </w:r>
+    </w:p>
+    <w:p>
+      <w:pPr>
+        <w:numPr>
+          <w:ilvl w:val="0"/>
+          <w:numId w:val="41"/>
+        </w:numPr>
+      </w:pPr>
+      <w:r>
+        <w:rPr>
+          <w:b/>
+          <w:bCs/>
+        </w:rPr>
+        <w:t>Identificador único</w:t>
+      </w:r>
+      <w:r>
+        <w:t>: cada login será exclusivo, evitando duplicidade de contas.</w:t>
+      </w:r>
+    </w:p>
+    <w:p>
+      <w:pPr>
+        <w:numPr>
+          <w:ilvl w:val="0"/>
+          <w:numId w:val="41"/>
+        </w:numPr>
+      </w:pPr>
+      <w:r>
+        <w:rPr>
+          <w:b/>
+          <w:bCs/>
+        </w:rPr>
+        <w:t>Compatibilidade técnica</w:t>
+      </w:r>
+      <w:r>
+        <w:t>: sem acentos, espaços ou caracteres especiais, garantindo integração com o Active Directory e sistemas acadêmicos.</w:t>
+      </w:r>
+    </w:p>
+    <w:p>
+      <w:pPr>
+        <w:numPr>
+          <w:ilvl w:val="0"/>
+          <w:numId w:val="41"/>
+        </w:numPr>
+      </w:pPr>
+      <w:r>
+        <w:rPr>
+          <w:b/>
+          <w:bCs/>
+        </w:rPr>
+        <w:t>Política de aplicação</w:t>
+      </w:r>
+      <w:r>
+        <w:t>: todos os usuários cadastrados no domínio adm.fatecbarueri.local deverão seguir obrigatoriamente esta convenção; alterações ou exceções deverão ser registradas e aprovadas pela equipe de TI.</w:t>
+      </w:r>
+    </w:p>
+    <w:p>
+      <w:pPr>
+        <w:numPr>
+          <w:ilvl w:val="0"/>
+          <w:numId w:val="41"/>
+        </w:numPr>
+      </w:pPr>
+      <w:r>
+        <w:rPr>
+          <w:b/>
+          <w:bCs/>
+        </w:rPr>
+        <w:t>Gestão e auditoria</w:t>
+      </w:r>
+      <w:r>
+        <w:t>: auditorias periódicas serão realizadas para assegurar conformidade e manter a integridade da infraestrutura.</w:t>
+      </w:r>
+    </w:p>
+    <w:p/>
+    <w:p/>
+    <w:p/>
+    <w:p/>
+    <w:p/>
+    <w:p/>
+    <w:p/>
+    <w:p/>
+    <w:p/>
+    <w:p/>
+    <w:p/>
+    <w:p/>
+    <w:p/>
+    <w:p/>
+    <w:p/>
+    <w:p/>
+    <w:p/>
+    <w:p>
+      <w:pPr>
+        <w:pStyle w:val="Heading1"/>
+        <w:numPr>
+          <w:ilvl w:val="0"/>
+          <w:numId w:val="38"/>
+        </w:numPr>
+      </w:pPr>
+      <w:r>
+        <w:t xml:space="preserve"> </w:t>
+      </w:r>
+      <w:r>
+        <w:t>Convenção de Nomenclatura de Computadores</w:t>
+      </w:r>
+    </w:p>
+    <w:p>
+      <w:r>
+        <w:t>A padronização da nomenclatura de computadores é um requisito essencial para a administração do Active Directory da Fatec Barueri. O padrão definido garante consistência, facilita a identificação dos equipamentos e assegura conformidade com as diretrizes institucionais do Centro Paula Souza (CPS).</w:t>
+      </w:r>
+    </w:p>
+    <w:p>
+      <w:r>
+        <w:t>A nomenclatura será composta por quatro elementos principais, organizados de forma sequencial e sem o uso de hífens ou caracteres especiais:</w:t>
+      </w:r>
+    </w:p>
+    <w:p>
+      <w:pPr>
+        <w:numPr>
+          <w:ilvl w:val="0"/>
+          <w:numId w:val="39"/>
+        </w:numPr>
+      </w:pPr>
+      <w:r>
+        <w:rPr>
+          <w:b/>
+          <w:bCs/>
+        </w:rPr>
+        <w:t>Unidade</w:t>
+      </w:r>
+      <w:r>
+        <w:t>: código numérico atribuído pela CPS, que identifica a Fatec responsável pelo equipamento.</w:t>
+      </w:r>
+    </w:p>
+    <w:p>
+      <w:pPr>
+        <w:numPr>
+          <w:ilvl w:val="0"/>
+          <w:numId w:val="39"/>
+        </w:numPr>
+      </w:pPr>
+      <w:r>
+        <w:rPr>
+          <w:b/>
+          <w:bCs/>
+        </w:rPr>
+        <w:t>Local</w:t>
+      </w:r>
+      <w:r>
+        <w:t>: código alfanumérico que representa o laboratório, sala ou setor em que o computador está instalado.</w:t>
+      </w:r>
+    </w:p>
+    <w:p>
+      <w:pPr>
+        <w:numPr>
+          <w:ilvl w:val="0"/>
+          <w:numId w:val="39"/>
+        </w:numPr>
+      </w:pPr>
+      <w:r>
+        <w:rPr>
+          <w:b/>
+          <w:bCs/>
+        </w:rPr>
+        <w:t>Número do Local</w:t>
+      </w:r>
+      <w:r>
+        <w:t>: número que detalha o espaço físico específico dentro da unidade.</w:t>
+      </w:r>
+    </w:p>
+    <w:p>
+      <w:pPr>
+        <w:numPr>
+          <w:ilvl w:val="0"/>
+          <w:numId w:val="39"/>
+        </w:numPr>
+      </w:pPr>
+      <w:r>
+        <w:rPr>
+          <w:b/>
+          <w:bCs/>
+        </w:rPr>
+        <w:t>Número da Máquina</w:t>
+      </w:r>
+      <w:r>
+        <w:t>: identificador único do equipamento, registrado de forma contínua e sem separadores.</w:t>
+      </w:r>
+    </w:p>
+    <w:p>
+      <w:r>
+        <w:t>A composição desses elementos resultará em uma nomenclatura única e padronizada, permitindo rápida associação do computador ao seu contexto físico e institucional. Esse formato garante compatibilidade técnica com o Active Directory, evita ambiguidades e contribui para processos de inventário, suporte e auditoria.</w:t>
+      </w:r>
+    </w:p>
+    <w:p>
+      <w:r>
+        <w:t xml:space="preserve">A política de aplicação estabelece que todos os computadores adicionados ao domínio </w:t>
+      </w:r>
+      <w:r>
+        <w:rPr>
+          <w:b/>
+          <w:bCs/>
+        </w:rPr>
+        <w:t>adm.fatecbarueri.local</w:t>
+      </w:r>
+      <w:r>
+        <w:t xml:space="preserve"> deverão seguir obrigatoriamente esta convenção. Alterações em nomes já existentes deverão ser registradas e aprovadas pela equipe de TI, e auditorias periódicas serão realizadas para assegurar a conformidade.</w:t>
+      </w:r>
+    </w:p>
+    <w:p/>
     <w:sectPr>
       <w:headerReference w:type="even" r:id="rId25"/>
       <w:headerReference w:type="default" r:id="rId26"/>
@@ -12909,7 +13221,7 @@
 </file>
 
 <file path=word/endnotes.xml><?xml version="1.0" encoding="utf-8"?>
-<w:endnotes xmlns:wpc="http://schemas.microsoft.com/office/word/2010/wordprocessingCanvas" xmlns:cx="http://schemas.microsoft.com/office/drawing/2014/chartex" xmlns:cx1="http://schemas.microsoft.com/office/drawing/2015/9/8/chartex" xmlns:cx2="http://schemas.microsoft.com/office/drawing/2015/10/21/chartex" xmlns:cx3="http://schemas.microsoft.com/office/drawing/2016/5/9/chartex" xmlns:cx4="http://schemas.microsoft.com/office/drawing/2016/5/10/chartex" xmlns:cx5="http://schemas.microsoft.com/office/drawing/2016/5/11/chartex" xmlns:cx6="http://schemas.microsoft.com/office/drawing/2016/5/12/chartex" xmlns:cx7="http://schemas.microsoft.com/office/drawing/2016/5/13/chartex" xmlns:cx8="http://schemas.microsoft.com/office/drawing/2016/5/14/chartex" xmlns:mc="http://schemas.openxmlformats.org/markup-compatibility/2006" xmlns:aink="http://schemas.microsoft.com/office/drawing/2016/ink" xmlns:am3d="http://schemas.microsoft.com/office/drawing/2017/model3d" xmlns:o="urn:schemas-microsoft-com:office:office" xmlns:oel="http://schemas.microsoft.com/office/2019/extlst" xmlns:r="http://schemas.openxmlformats.org/officeDocument/2006/relationships" xmlns:m="http://schemas.openxmlformats.org/officeDocument/2006/math" xmlns:v="urn:schemas-microsoft-com:vml" xmlns:wp14="http://schemas.microsoft.com/office/word/2010/wordprocessingDrawing" xmlns:wp="http://schemas.openxmlformats.org/drawingml/2006/wordprocessingDrawing" xmlns:w10="urn:schemas-microsoft-com:office:word" xmlns:w="http://schemas.openxmlformats.org/wordprocessingml/2006/main" xmlns:w14="http://schemas.microsoft.com/office/word/2010/wordml" xmlns:w15="http://schemas.microsoft.com/office/word/2012/wordml" xmlns:w16cex="http://schemas.microsoft.com/office/word/2018/wordml/cex" xmlns:w16cid="http://schemas.microsoft.com/office/word/2016/wordml/cid" xmlns:w16="http://schemas.microsoft.com/office/word/2018/wordml" xmlns:w16sdtdh="http://schemas.microsoft.com/office/word/2020/wordml/sdtdatahash" xmlns:w16se="http://schemas.microsoft.com/office/word/2015/wordml/symex" xmlns:wpg="http://schemas.microsoft.com/office/word/2010/wordprocessingGroup" xmlns:wpi="http://schemas.microsoft.com/office/word/2010/wordprocessingInk" xmlns:wne="http://schemas.microsoft.com/office/word/2006/wordml" xmlns:wps="http://schemas.microsoft.com/office/word/2010/wordprocessingShape" mc:Ignorable="w14 w15 w16se w16cid w16 w16cex w16sdtdh wp14">
+<w:endnotes xmlns:wpc="http://schemas.microsoft.com/office/word/2010/wordprocessingCanvas" xmlns:cx="http://schemas.microsoft.com/office/drawing/2014/chartex" xmlns:cx1="http://schemas.microsoft.com/office/drawing/2015/9/8/chartex" xmlns:cx2="http://schemas.microsoft.com/office/drawing/2015/10/21/chartex" xmlns:cx3="http://schemas.microsoft.com/office/drawing/2016/5/9/chartex" xmlns:cx4="http://schemas.microsoft.com/office/drawing/2016/5/10/chartex" xmlns:cx5="http://schemas.microsoft.com/office/drawing/2016/5/11/chartex" xmlns:cx6="http://schemas.microsoft.com/office/drawing/2016/5/12/chartex" xmlns:cx7="http://schemas.microsoft.com/office/drawing/2016/5/13/chartex" xmlns:cx8="http://schemas.microsoft.com/office/drawing/2016/5/14/chartex" xmlns:mc="http://schemas.openxmlformats.org/markup-compatibility/2006" xmlns:aink="http://schemas.microsoft.com/office/drawing/2016/ink" xmlns:am3d="http://schemas.microsoft.com/office/drawing/2017/model3d" xmlns:o="urn:schemas-microsoft-com:office:office" xmlns:oel="http://schemas.microsoft.com/office/2019/extlst" xmlns:r="http://schemas.openxmlformats.org/officeDocument/2006/relationships" xmlns:m="http://schemas.openxmlformats.org/officeDocument/2006/math" xmlns:v="urn:schemas-microsoft-com:vml" xmlns:wp14="http://schemas.microsoft.com/office/word/2010/wordprocessingDrawing" xmlns:wp="http://schemas.openxmlformats.org/drawingml/2006/wordprocessingDrawing" xmlns:w10="urn:schemas-microsoft-com:office:word" xmlns:w="http://schemas.openxmlformats.org/wordprocessingml/2006/main" xmlns:w14="http://schemas.microsoft.com/office/word/2010/wordml" xmlns:w15="http://schemas.microsoft.com/office/word/2012/wordml" xmlns:w16cex="http://schemas.microsoft.com/office/word/2018/wordml/cex" xmlns:w16cid="http://schemas.microsoft.com/office/word/2016/wordml/cid" xmlns:w16="http://schemas.microsoft.com/office/word/2018/wordml" xmlns:w16du="http://schemas.microsoft.com/office/word/2023/wordml/word16du" xmlns:w16sdtdh="http://schemas.microsoft.com/office/word/2020/wordml/sdtdatahash" xmlns:w16sdtfl="http://schemas.microsoft.com/office/word/2024/wordml/sdtformatlock" xmlns:w16se="http://schemas.microsoft.com/office/word/2015/wordml/symex" xmlns:wpg="http://schemas.microsoft.com/office/word/2010/wordprocessingGroup" xmlns:wpi="http://schemas.microsoft.com/office/word/2010/wordprocessingInk" xmlns:wne="http://schemas.microsoft.com/office/word/2006/wordml" xmlns:wps="http://schemas.microsoft.com/office/word/2010/wordprocessingShape" mc:Ignorable="w14 w15 w16se w16cid w16 w16cex w16sdtdh w16sdtfl w16du wp14">
   <w:endnote w:type="separator" w:id="-1">
     <w:p>
       <w:pPr>
@@ -12934,7 +13246,7 @@
 </file>
 
 <file path=word/footnotes.xml><?xml version="1.0" encoding="utf-8"?>
-<w:footnotes xmlns:wpc="http://schemas.microsoft.com/office/word/2010/wordprocessingCanvas" xmlns:cx="http://schemas.microsoft.com/office/drawing/2014/chartex" xmlns:cx1="http://schemas.microsoft.com/office/drawing/2015/9/8/chartex" xmlns:cx2="http://schemas.microsoft.com/office/drawing/2015/10/21/chartex" xmlns:cx3="http://schemas.microsoft.com/office/drawing/2016/5/9/chartex" xmlns:cx4="http://schemas.microsoft.com/office/drawing/2016/5/10/chartex" xmlns:cx5="http://schemas.microsoft.com/office/drawing/2016/5/11/chartex" xmlns:cx6="http://schemas.microsoft.com/office/drawing/2016/5/12/chartex" xmlns:cx7="http://schemas.microsoft.com/office/drawing/2016/5/13/chartex" xmlns:cx8="http://schemas.microsoft.com/office/drawing/2016/5/14/chartex" xmlns:mc="http://schemas.openxmlformats.org/markup-compatibility/2006" xmlns:aink="http://schemas.microsoft.com/office/drawing/2016/ink" xmlns:am3d="http://schemas.microsoft.com/office/drawing/2017/model3d" xmlns:o="urn:schemas-microsoft-com:office:office" xmlns:oel="http://schemas.microsoft.com/office/2019/extlst" xmlns:r="http://schemas.openxmlformats.org/officeDocument/2006/relationships" xmlns:m="http://schemas.openxmlformats.org/officeDocument/2006/math" xmlns:v="urn:schemas-microsoft-com:vml" xmlns:wp14="http://schemas.microsoft.com/office/word/2010/wordprocessingDrawing" xmlns:wp="http://schemas.openxmlformats.org/drawingml/2006/wordprocessingDrawing" xmlns:w10="urn:schemas-microsoft-com:office:word" xmlns:w="http://schemas.openxmlformats.org/wordprocessingml/2006/main" xmlns:w14="http://schemas.microsoft.com/office/word/2010/wordml" xmlns:w15="http://schemas.microsoft.com/office/word/2012/wordml" xmlns:w16cex="http://schemas.microsoft.com/office/word/2018/wordml/cex" xmlns:w16cid="http://schemas.microsoft.com/office/word/2016/wordml/cid" xmlns:w16="http://schemas.microsoft.com/office/word/2018/wordml" xmlns:w16sdtdh="http://schemas.microsoft.com/office/word/2020/wordml/sdtdatahash" xmlns:w16se="http://schemas.microsoft.com/office/word/2015/wordml/symex" xmlns:wpg="http://schemas.microsoft.com/office/word/2010/wordprocessingGroup" xmlns:wpi="http://schemas.microsoft.com/office/word/2010/wordprocessingInk" xmlns:wne="http://schemas.microsoft.com/office/word/2006/wordml" xmlns:wps="http://schemas.microsoft.com/office/word/2010/wordprocessingShape" mc:Ignorable="w14 w15 w16se w16cid w16 w16cex w16sdtdh wp14">
+<w:footnotes xmlns:wpc="http://schemas.microsoft.com/office/word/2010/wordprocessingCanvas" xmlns:cx="http://schemas.microsoft.com/office/drawing/2014/chartex" xmlns:cx1="http://schemas.microsoft.com/office/drawing/2015/9/8/chartex" xmlns:cx2="http://schemas.microsoft.com/office/drawing/2015/10/21/chartex" xmlns:cx3="http://schemas.microsoft.com/office/drawing/2016/5/9/chartex" xmlns:cx4="http://schemas.microsoft.com/office/drawing/2016/5/10/chartex" xmlns:cx5="http://schemas.microsoft.com/office/drawing/2016/5/11/chartex" xmlns:cx6="http://schemas.microsoft.com/office/drawing/2016/5/12/chartex" xmlns:cx7="http://schemas.microsoft.com/office/drawing/2016/5/13/chartex" xmlns:cx8="http://schemas.microsoft.com/office/drawing/2016/5/14/chartex" xmlns:mc="http://schemas.openxmlformats.org/markup-compatibility/2006" xmlns:aink="http://schemas.microsoft.com/office/drawing/2016/ink" xmlns:am3d="http://schemas.microsoft.com/office/drawing/2017/model3d" xmlns:o="urn:schemas-microsoft-com:office:office" xmlns:oel="http://schemas.microsoft.com/office/2019/extlst" xmlns:r="http://schemas.openxmlformats.org/officeDocument/2006/relationships" xmlns:m="http://schemas.openxmlformats.org/officeDocument/2006/math" xmlns:v="urn:schemas-microsoft-com:vml" xmlns:wp14="http://schemas.microsoft.com/office/word/2010/wordprocessingDrawing" xmlns:wp="http://schemas.openxmlformats.org/drawingml/2006/wordprocessingDrawing" xmlns:w10="urn:schemas-microsoft-com:office:word" xmlns:w="http://schemas.openxmlformats.org/wordprocessingml/2006/main" xmlns:w14="http://schemas.microsoft.com/office/word/2010/wordml" xmlns:w15="http://schemas.microsoft.com/office/word/2012/wordml" xmlns:w16cex="http://schemas.microsoft.com/office/word/2018/wordml/cex" xmlns:w16cid="http://schemas.microsoft.com/office/word/2016/wordml/cid" xmlns:w16="http://schemas.microsoft.com/office/word/2018/wordml" xmlns:w16du="http://schemas.microsoft.com/office/word/2023/wordml/word16du" xmlns:w16sdtdh="http://schemas.microsoft.com/office/word/2020/wordml/sdtdatahash" xmlns:w16sdtfl="http://schemas.microsoft.com/office/word/2024/wordml/sdtformatlock" xmlns:w16se="http://schemas.microsoft.com/office/word/2015/wordml/symex" xmlns:wpg="http://schemas.microsoft.com/office/word/2010/wordprocessingGroup" xmlns:wpi="http://schemas.microsoft.com/office/word/2010/wordprocessingInk" xmlns:wne="http://schemas.microsoft.com/office/word/2006/wordml" xmlns:wps="http://schemas.microsoft.com/office/word/2010/wordprocessingShape" mc:Ignorable="w14 w15 w16se w16cid w16 w16cex w16sdtdh w16sdtfl w16du wp14">
   <w:footnote w:type="separator" w:id="-1">
     <w:p>
       <w:pPr>
@@ -12959,7 +13271,7 @@
 </file>
 
 <file path=word/header1.xml><?xml version="1.0" encoding="utf-8"?>
-<w:hdr xmlns:wpc="http://schemas.microsoft.com/office/word/2010/wordprocessingCanvas" xmlns:cx="http://schemas.microsoft.com/office/drawing/2014/chartex" xmlns:cx1="http://schemas.microsoft.com/office/drawing/2015/9/8/chartex" xmlns:cx2="http://schemas.microsoft.com/office/drawing/2015/10/21/chartex" xmlns:cx3="http://schemas.microsoft.com/office/drawing/2016/5/9/chartex" xmlns:cx4="http://schemas.microsoft.com/office/drawing/2016/5/10/chartex" xmlns:cx5="http://schemas.microsoft.com/office/drawing/2016/5/11/chartex" xmlns:cx6="http://schemas.microsoft.com/office/drawing/2016/5/12/chartex" xmlns:cx7="http://schemas.microsoft.com/office/drawing/2016/5/13/chartex" xmlns:cx8="http://schemas.microsoft.com/office/drawing/2016/5/14/chartex" xmlns:mc="http://schemas.openxmlformats.org/markup-compatibility/2006" xmlns:aink="http://schemas.microsoft.com/office/drawing/2016/ink" xmlns:am3d="http://schemas.microsoft.com/office/drawing/2017/model3d" xmlns:o="urn:schemas-microsoft-com:office:office" xmlns:oel="http://schemas.microsoft.com/office/2019/extlst" xmlns:r="http://schemas.openxmlformats.org/officeDocument/2006/relationships" xmlns:m="http://schemas.openxmlformats.org/officeDocument/2006/math" xmlns:v="urn:schemas-microsoft-com:vml" xmlns:wp14="http://schemas.microsoft.com/office/word/2010/wordprocessingDrawing" xmlns:wp="http://schemas.openxmlformats.org/drawingml/2006/wordprocessingDrawing" xmlns:w10="urn:schemas-microsoft-com:office:word" xmlns:w="http://schemas.openxmlformats.org/wordprocessingml/2006/main" xmlns:w14="http://schemas.microsoft.com/office/word/2010/wordml" xmlns:w15="http://schemas.microsoft.com/office/word/2012/wordml" xmlns:w16cex="http://schemas.microsoft.com/office/word/2018/wordml/cex" xmlns:w16cid="http://schemas.microsoft.com/office/word/2016/wordml/cid" xmlns:w16="http://schemas.microsoft.com/office/word/2018/wordml" xmlns:w16sdtdh="http://schemas.microsoft.com/office/word/2020/wordml/sdtdatahash" xmlns:w16se="http://schemas.microsoft.com/office/word/2015/wordml/symex" xmlns:wpg="http://schemas.microsoft.com/office/word/2010/wordprocessingGroup" xmlns:wpi="http://schemas.microsoft.com/office/word/2010/wordprocessingInk" xmlns:wne="http://schemas.microsoft.com/office/word/2006/wordml" xmlns:wps="http://schemas.microsoft.com/office/word/2010/wordprocessingShape" mc:Ignorable="w14 w15 w16se w16cid w16 w16cex w16sdtdh wp14">
+<w:hdr xmlns:wpc="http://schemas.microsoft.com/office/word/2010/wordprocessingCanvas" xmlns:cx="http://schemas.microsoft.com/office/drawing/2014/chartex" xmlns:cx1="http://schemas.microsoft.com/office/drawing/2015/9/8/chartex" xmlns:cx2="http://schemas.microsoft.com/office/drawing/2015/10/21/chartex" xmlns:cx3="http://schemas.microsoft.com/office/drawing/2016/5/9/chartex" xmlns:cx4="http://schemas.microsoft.com/office/drawing/2016/5/10/chartex" xmlns:cx5="http://schemas.microsoft.com/office/drawing/2016/5/11/chartex" xmlns:cx6="http://schemas.microsoft.com/office/drawing/2016/5/12/chartex" xmlns:cx7="http://schemas.microsoft.com/office/drawing/2016/5/13/chartex" xmlns:cx8="http://schemas.microsoft.com/office/drawing/2016/5/14/chartex" xmlns:mc="http://schemas.openxmlformats.org/markup-compatibility/2006" xmlns:aink="http://schemas.microsoft.com/office/drawing/2016/ink" xmlns:am3d="http://schemas.microsoft.com/office/drawing/2017/model3d" xmlns:o="urn:schemas-microsoft-com:office:office" xmlns:oel="http://schemas.microsoft.com/office/2019/extlst" xmlns:r="http://schemas.openxmlformats.org/officeDocument/2006/relationships" xmlns:m="http://schemas.openxmlformats.org/officeDocument/2006/math" xmlns:v="urn:schemas-microsoft-com:vml" xmlns:wp14="http://schemas.microsoft.com/office/word/2010/wordprocessingDrawing" xmlns:wp="http://schemas.openxmlformats.org/drawingml/2006/wordprocessingDrawing" xmlns:w10="urn:schemas-microsoft-com:office:word" xmlns:w="http://schemas.openxmlformats.org/wordprocessingml/2006/main" xmlns:w14="http://schemas.microsoft.com/office/word/2010/wordml" xmlns:w15="http://schemas.microsoft.com/office/word/2012/wordml" xmlns:w16cex="http://schemas.microsoft.com/office/word/2018/wordml/cex" xmlns:w16cid="http://schemas.microsoft.com/office/word/2016/wordml/cid" xmlns:w16="http://schemas.microsoft.com/office/word/2018/wordml" xmlns:w16du="http://schemas.microsoft.com/office/word/2023/wordml/word16du" xmlns:w16sdtdh="http://schemas.microsoft.com/office/word/2020/wordml/sdtdatahash" xmlns:w16sdtfl="http://schemas.microsoft.com/office/word/2024/wordml/sdtformatlock" xmlns:w16se="http://schemas.microsoft.com/office/word/2015/wordml/symex" xmlns:wpg="http://schemas.microsoft.com/office/word/2010/wordprocessingGroup" xmlns:wpi="http://schemas.microsoft.com/office/word/2010/wordprocessingInk" xmlns:wne="http://schemas.microsoft.com/office/word/2006/wordml" xmlns:wps="http://schemas.microsoft.com/office/word/2010/wordprocessingShape" mc:Ignorable="w14 w15 w16se w16cid w16 w16cex w16sdtdh w16sdtfl w16du wp14">
   <w:p>
     <w:pPr>
       <w:spacing w:after="0" w:line="259" w:lineRule="auto"/>
@@ -13009,7 +13321,7 @@
 </file>
 
 <file path=word/header2.xml><?xml version="1.0" encoding="utf-8"?>
-<w:hdr xmlns:wpc="http://schemas.microsoft.com/office/word/2010/wordprocessingCanvas" xmlns:cx="http://schemas.microsoft.com/office/drawing/2014/chartex" xmlns:cx1="http://schemas.microsoft.com/office/drawing/2015/9/8/chartex" xmlns:cx2="http://schemas.microsoft.com/office/drawing/2015/10/21/chartex" xmlns:cx3="http://schemas.microsoft.com/office/drawing/2016/5/9/chartex" xmlns:cx4="http://schemas.microsoft.com/office/drawing/2016/5/10/chartex" xmlns:cx5="http://schemas.microsoft.com/office/drawing/2016/5/11/chartex" xmlns:cx6="http://schemas.microsoft.com/office/drawing/2016/5/12/chartex" xmlns:cx7="http://schemas.microsoft.com/office/drawing/2016/5/13/chartex" xmlns:cx8="http://schemas.microsoft.com/office/drawing/2016/5/14/chartex" xmlns:mc="http://schemas.openxmlformats.org/markup-compatibility/2006" xmlns:aink="http://schemas.microsoft.com/office/drawing/2016/ink" xmlns:am3d="http://schemas.microsoft.com/office/drawing/2017/model3d" xmlns:o="urn:schemas-microsoft-com:office:office" xmlns:oel="http://schemas.microsoft.com/office/2019/extlst" xmlns:r="http://schemas.openxmlformats.org/officeDocument/2006/relationships" xmlns:m="http://schemas.openxmlformats.org/officeDocument/2006/math" xmlns:v="urn:schemas-microsoft-com:vml" xmlns:wp14="http://schemas.microsoft.com/office/word/2010/wordprocessingDrawing" xmlns:wp="http://schemas.openxmlformats.org/drawingml/2006/wordprocessingDrawing" xmlns:w10="urn:schemas-microsoft-com:office:word" xmlns:w="http://schemas.openxmlformats.org/wordprocessingml/2006/main" xmlns:w14="http://schemas.microsoft.com/office/word/2010/wordml" xmlns:w15="http://schemas.microsoft.com/office/word/2012/wordml" xmlns:w16cex="http://schemas.microsoft.com/office/word/2018/wordml/cex" xmlns:w16cid="http://schemas.microsoft.com/office/word/2016/wordml/cid" xmlns:w16="http://schemas.microsoft.com/office/word/2018/wordml" xmlns:w16sdtdh="http://schemas.microsoft.com/office/word/2020/wordml/sdtdatahash" xmlns:w16se="http://schemas.microsoft.com/office/word/2015/wordml/symex" xmlns:wpg="http://schemas.microsoft.com/office/word/2010/wordprocessingGroup" xmlns:wpi="http://schemas.microsoft.com/office/word/2010/wordprocessingInk" xmlns:wne="http://schemas.microsoft.com/office/word/2006/wordml" xmlns:wps="http://schemas.microsoft.com/office/word/2010/wordprocessingShape" mc:Ignorable="w14 w15 w16se w16cid w16 w16cex w16sdtdh wp14">
+<w:hdr xmlns:wpc="http://schemas.microsoft.com/office/word/2010/wordprocessingCanvas" xmlns:cx="http://schemas.microsoft.com/office/drawing/2014/chartex" xmlns:cx1="http://schemas.microsoft.com/office/drawing/2015/9/8/chartex" xmlns:cx2="http://schemas.microsoft.com/office/drawing/2015/10/21/chartex" xmlns:cx3="http://schemas.microsoft.com/office/drawing/2016/5/9/chartex" xmlns:cx4="http://schemas.microsoft.com/office/drawing/2016/5/10/chartex" xmlns:cx5="http://schemas.microsoft.com/office/drawing/2016/5/11/chartex" xmlns:cx6="http://schemas.microsoft.com/office/drawing/2016/5/12/chartex" xmlns:cx7="http://schemas.microsoft.com/office/drawing/2016/5/13/chartex" xmlns:cx8="http://schemas.microsoft.com/office/drawing/2016/5/14/chartex" xmlns:mc="http://schemas.openxmlformats.org/markup-compatibility/2006" xmlns:aink="http://schemas.microsoft.com/office/drawing/2016/ink" xmlns:am3d="http://schemas.microsoft.com/office/drawing/2017/model3d" xmlns:o="urn:schemas-microsoft-com:office:office" xmlns:oel="http://schemas.microsoft.com/office/2019/extlst" xmlns:r="http://schemas.openxmlformats.org/officeDocument/2006/relationships" xmlns:m="http://schemas.openxmlformats.org/officeDocument/2006/math" xmlns:v="urn:schemas-microsoft-com:vml" xmlns:wp14="http://schemas.microsoft.com/office/word/2010/wordprocessingDrawing" xmlns:wp="http://schemas.openxmlformats.org/drawingml/2006/wordprocessingDrawing" xmlns:w10="urn:schemas-microsoft-com:office:word" xmlns:w="http://schemas.openxmlformats.org/wordprocessingml/2006/main" xmlns:w14="http://schemas.microsoft.com/office/word/2010/wordml" xmlns:w15="http://schemas.microsoft.com/office/word/2012/wordml" xmlns:w16cex="http://schemas.microsoft.com/office/word/2018/wordml/cex" xmlns:w16cid="http://schemas.microsoft.com/office/word/2016/wordml/cid" xmlns:w16="http://schemas.microsoft.com/office/word/2018/wordml" xmlns:w16du="http://schemas.microsoft.com/office/word/2023/wordml/word16du" xmlns:w16sdtdh="http://schemas.microsoft.com/office/word/2020/wordml/sdtdatahash" xmlns:w16sdtfl="http://schemas.microsoft.com/office/word/2024/wordml/sdtformatlock" xmlns:w16se="http://schemas.microsoft.com/office/word/2015/wordml/symex" xmlns:wpg="http://schemas.microsoft.com/office/word/2010/wordprocessingGroup" xmlns:wpi="http://schemas.microsoft.com/office/word/2010/wordprocessingInk" xmlns:wne="http://schemas.microsoft.com/office/word/2006/wordml" xmlns:wps="http://schemas.microsoft.com/office/word/2010/wordprocessingShape" mc:Ignorable="w14 w15 w16se w16cid w16 w16cex w16sdtdh w16sdtfl w16du wp14">
   <w:p>
     <w:pPr>
       <w:spacing w:after="0" w:line="259" w:lineRule="auto"/>
@@ -13049,7 +13361,7 @@
 </file>
 
 <file path=word/header3.xml><?xml version="1.0" encoding="utf-8"?>
-<w:hdr xmlns:wpc="http://schemas.microsoft.com/office/word/2010/wordprocessingCanvas" xmlns:cx="http://schemas.microsoft.com/office/drawing/2014/chartex" xmlns:cx1="http://schemas.microsoft.com/office/drawing/2015/9/8/chartex" xmlns:cx2="http://schemas.microsoft.com/office/drawing/2015/10/21/chartex" xmlns:cx3="http://schemas.microsoft.com/office/drawing/2016/5/9/chartex" xmlns:cx4="http://schemas.microsoft.com/office/drawing/2016/5/10/chartex" xmlns:cx5="http://schemas.microsoft.com/office/drawing/2016/5/11/chartex" xmlns:cx6="http://schemas.microsoft.com/office/drawing/2016/5/12/chartex" xmlns:cx7="http://schemas.microsoft.com/office/drawing/2016/5/13/chartex" xmlns:cx8="http://schemas.microsoft.com/office/drawing/2016/5/14/chartex" xmlns:mc="http://schemas.openxmlformats.org/markup-compatibility/2006" xmlns:aink="http://schemas.microsoft.com/office/drawing/2016/ink" xmlns:am3d="http://schemas.microsoft.com/office/drawing/2017/model3d" xmlns:o="urn:schemas-microsoft-com:office:office" xmlns:oel="http://schemas.microsoft.com/office/2019/extlst" xmlns:r="http://schemas.openxmlformats.org/officeDocument/2006/relationships" xmlns:m="http://schemas.openxmlformats.org/officeDocument/2006/math" xmlns:v="urn:schemas-microsoft-com:vml" xmlns:wp14="http://schemas.microsoft.com/office/word/2010/wordprocessingDrawing" xmlns:wp="http://schemas.openxmlformats.org/drawingml/2006/wordprocessingDrawing" xmlns:w10="urn:schemas-microsoft-com:office:word" xmlns:w="http://schemas.openxmlformats.org/wordprocessingml/2006/main" xmlns:w14="http://schemas.microsoft.com/office/word/2010/wordml" xmlns:w15="http://schemas.microsoft.com/office/word/2012/wordml" xmlns:w16cex="http://schemas.microsoft.com/office/word/2018/wordml/cex" xmlns:w16cid="http://schemas.microsoft.com/office/word/2016/wordml/cid" xmlns:w16="http://schemas.microsoft.com/office/word/2018/wordml" xmlns:w16sdtdh="http://schemas.microsoft.com/office/word/2020/wordml/sdtdatahash" xmlns:w16se="http://schemas.microsoft.com/office/word/2015/wordml/symex" xmlns:wpg="http://schemas.microsoft.com/office/word/2010/wordprocessingGroup" xmlns:wpi="http://schemas.microsoft.com/office/word/2010/wordprocessingInk" xmlns:wne="http://schemas.microsoft.com/office/word/2006/wordml" xmlns:wps="http://schemas.microsoft.com/office/word/2010/wordprocessingShape" mc:Ignorable="w14 w15 w16se w16cid w16 w16cex w16sdtdh wp14">
+<w:hdr xmlns:wpc="http://schemas.microsoft.com/office/word/2010/wordprocessingCanvas" xmlns:cx="http://schemas.microsoft.com/office/drawing/2014/chartex" xmlns:cx1="http://schemas.microsoft.com/office/drawing/2015/9/8/chartex" xmlns:cx2="http://schemas.microsoft.com/office/drawing/2015/10/21/chartex" xmlns:cx3="http://schemas.microsoft.com/office/drawing/2016/5/9/chartex" xmlns:cx4="http://schemas.microsoft.com/office/drawing/2016/5/10/chartex" xmlns:cx5="http://schemas.microsoft.com/office/drawing/2016/5/11/chartex" xmlns:cx6="http://schemas.microsoft.com/office/drawing/2016/5/12/chartex" xmlns:cx7="http://schemas.microsoft.com/office/drawing/2016/5/13/chartex" xmlns:cx8="http://schemas.microsoft.com/office/drawing/2016/5/14/chartex" xmlns:mc="http://schemas.openxmlformats.org/markup-compatibility/2006" xmlns:aink="http://schemas.microsoft.com/office/drawing/2016/ink" xmlns:am3d="http://schemas.microsoft.com/office/drawing/2017/model3d" xmlns:o="urn:schemas-microsoft-com:office:office" xmlns:oel="http://schemas.microsoft.com/office/2019/extlst" xmlns:r="http://schemas.openxmlformats.org/officeDocument/2006/relationships" xmlns:m="http://schemas.openxmlformats.org/officeDocument/2006/math" xmlns:v="urn:schemas-microsoft-com:vml" xmlns:wp14="http://schemas.microsoft.com/office/word/2010/wordprocessingDrawing" xmlns:wp="http://schemas.openxmlformats.org/drawingml/2006/wordprocessingDrawing" xmlns:w10="urn:schemas-microsoft-com:office:word" xmlns:w="http://schemas.openxmlformats.org/wordprocessingml/2006/main" xmlns:w14="http://schemas.microsoft.com/office/word/2010/wordml" xmlns:w15="http://schemas.microsoft.com/office/word/2012/wordml" xmlns:w16cex="http://schemas.microsoft.com/office/word/2018/wordml/cex" xmlns:w16cid="http://schemas.microsoft.com/office/word/2016/wordml/cid" xmlns:w16="http://schemas.microsoft.com/office/word/2018/wordml" xmlns:w16du="http://schemas.microsoft.com/office/word/2023/wordml/word16du" xmlns:w16sdtdh="http://schemas.microsoft.com/office/word/2020/wordml/sdtdatahash" xmlns:w16sdtfl="http://schemas.microsoft.com/office/word/2024/wordml/sdtformatlock" xmlns:w16se="http://schemas.microsoft.com/office/word/2015/wordml/symex" xmlns:wpg="http://schemas.microsoft.com/office/word/2010/wordprocessingGroup" xmlns:wpi="http://schemas.microsoft.com/office/word/2010/wordprocessingInk" xmlns:wne="http://schemas.microsoft.com/office/word/2006/wordml" xmlns:wps="http://schemas.microsoft.com/office/word/2010/wordprocessingShape" mc:Ignorable="w14 w15 w16se w16cid w16 w16cex w16sdtdh w16sdtfl w16du wp14">
   <w:p>
     <w:pPr>
       <w:spacing w:after="0" w:line="259" w:lineRule="auto"/>
@@ -13089,7 +13401,7 @@
 </file>
 
 <file path=word/numbering.xml><?xml version="1.0" encoding="utf-8"?>
-<w:numbering xmlns:wpc="http://schemas.microsoft.com/office/word/2010/wordprocessingCanvas" xmlns:cx="http://schemas.microsoft.com/office/drawing/2014/chartex" xmlns:cx1="http://schemas.microsoft.com/office/drawing/2015/9/8/chartex" xmlns:cx2="http://schemas.microsoft.com/office/drawing/2015/10/21/chartex" xmlns:cx3="http://schemas.microsoft.com/office/drawing/2016/5/9/chartex" xmlns:cx4="http://schemas.microsoft.com/office/drawing/2016/5/10/chartex" xmlns:cx5="http://schemas.microsoft.com/office/drawing/2016/5/11/chartex" xmlns:cx6="http://schemas.microsoft.com/office/drawing/2016/5/12/chartex" xmlns:cx7="http://schemas.microsoft.com/office/drawing/2016/5/13/chartex" xmlns:cx8="http://schemas.microsoft.com/office/drawing/2016/5/14/chartex" xmlns:mc="http://schemas.openxmlformats.org/markup-compatibility/2006" xmlns:aink="http://schemas.microsoft.com/office/drawing/2016/ink" xmlns:am3d="http://schemas.microsoft.com/office/drawing/2017/model3d" xmlns:o="urn:schemas-microsoft-com:office:office" xmlns:oel="http://schemas.microsoft.com/office/2019/extlst" xmlns:r="http://schemas.openxmlformats.org/officeDocument/2006/relationships" xmlns:m="http://schemas.openxmlformats.org/officeDocument/2006/math" xmlns:v="urn:schemas-microsoft-com:vml" xmlns:wp14="http://schemas.microsoft.com/office/word/2010/wordprocessingDrawing" xmlns:wp="http://schemas.openxmlformats.org/drawingml/2006/wordprocessingDrawing" xmlns:w10="urn:schemas-microsoft-com:office:word" xmlns:w="http://schemas.openxmlformats.org/wordprocessingml/2006/main" xmlns:w14="http://schemas.microsoft.com/office/word/2010/wordml" xmlns:w15="http://schemas.microsoft.com/office/word/2012/wordml" xmlns:w16cex="http://schemas.microsoft.com/office/word/2018/wordml/cex" xmlns:w16cid="http://schemas.microsoft.com/office/word/2016/wordml/cid" xmlns:w16="http://schemas.microsoft.com/office/word/2018/wordml" xmlns:w16sdtdh="http://schemas.microsoft.com/office/word/2020/wordml/sdtdatahash" xmlns:w16se="http://schemas.microsoft.com/office/word/2015/wordml/symex" xmlns:wpg="http://schemas.microsoft.com/office/word/2010/wordprocessingGroup" xmlns:wpi="http://schemas.microsoft.com/office/word/2010/wordprocessingInk" xmlns:wne="http://schemas.microsoft.com/office/word/2006/wordml" xmlns:wps="http://schemas.microsoft.com/office/word/2010/wordprocessingShape" mc:Ignorable="w14 w15 w16se w16cid w16 w16cex w16sdtdh wp14">
+<w:numbering xmlns:wpc="http://schemas.microsoft.com/office/word/2010/wordprocessingCanvas" xmlns:cx="http://schemas.microsoft.com/office/drawing/2014/chartex" xmlns:cx1="http://schemas.microsoft.com/office/drawing/2015/9/8/chartex" xmlns:cx2="http://schemas.microsoft.com/office/drawing/2015/10/21/chartex" xmlns:cx3="http://schemas.microsoft.com/office/drawing/2016/5/9/chartex" xmlns:cx4="http://schemas.microsoft.com/office/drawing/2016/5/10/chartex" xmlns:cx5="http://schemas.microsoft.com/office/drawing/2016/5/11/chartex" xmlns:cx6="http://schemas.microsoft.com/office/drawing/2016/5/12/chartex" xmlns:cx7="http://schemas.microsoft.com/office/drawing/2016/5/13/chartex" xmlns:cx8="http://schemas.microsoft.com/office/drawing/2016/5/14/chartex" xmlns:mc="http://schemas.openxmlformats.org/markup-compatibility/2006" xmlns:aink="http://schemas.microsoft.com/office/drawing/2016/ink" xmlns:am3d="http://schemas.microsoft.com/office/drawing/2017/model3d" xmlns:o="urn:schemas-microsoft-com:office:office" xmlns:oel="http://schemas.microsoft.com/office/2019/extlst" xmlns:r="http://schemas.openxmlformats.org/officeDocument/2006/relationships" xmlns:m="http://schemas.openxmlformats.org/officeDocument/2006/math" xmlns:v="urn:schemas-microsoft-com:vml" xmlns:wp14="http://schemas.microsoft.com/office/word/2010/wordprocessingDrawing" xmlns:wp="http://schemas.openxmlformats.org/drawingml/2006/wordprocessingDrawing" xmlns:w10="urn:schemas-microsoft-com:office:word" xmlns:w="http://schemas.openxmlformats.org/wordprocessingml/2006/main" xmlns:w14="http://schemas.microsoft.com/office/word/2010/wordml" xmlns:w15="http://schemas.microsoft.com/office/word/2012/wordml" xmlns:w16cex="http://schemas.microsoft.com/office/word/2018/wordml/cex" xmlns:w16cid="http://schemas.microsoft.com/office/word/2016/wordml/cid" xmlns:w16="http://schemas.microsoft.com/office/word/2018/wordml" xmlns:w16du="http://schemas.microsoft.com/office/word/2023/wordml/word16du" xmlns:w16sdtdh="http://schemas.microsoft.com/office/word/2020/wordml/sdtdatahash" xmlns:w16sdtfl="http://schemas.microsoft.com/office/word/2024/wordml/sdtformatlock" xmlns:w16se="http://schemas.microsoft.com/office/word/2015/wordml/symex" xmlns:wpg="http://schemas.microsoft.com/office/word/2010/wordprocessingGroup" xmlns:wpi="http://schemas.microsoft.com/office/word/2010/wordprocessingInk" xmlns:wne="http://schemas.microsoft.com/office/word/2006/wordml" xmlns:wps="http://schemas.microsoft.com/office/word/2010/wordprocessingShape" mc:Ignorable="w14 w15 w16se w16cid w16 w16cex w16sdtdh w16sdtfl w16du wp14">
   <w:abstractNum w:abstractNumId="0" w15:restartNumberingAfterBreak="0">
     <w:nsid w:val="098274EE"/>
     <w:multiLevelType w:val="multilevel"/>
@@ -14584,6 +14896,155 @@
     </w:lvl>
   </w:abstractNum>
   <w:abstractNum w:abstractNumId="10" w15:restartNumberingAfterBreak="0">
+    <w:nsid w:val="1D9048D0"/>
+    <w:multiLevelType w:val="multilevel"/>
+    <w:tmpl w:val="4508A8E8"/>
+    <w:lvl w:ilvl="0">
+      <w:start w:val="1"/>
+      <w:numFmt w:val="bullet"/>
+      <w:lvlText w:val=""/>
+      <w:lvlJc w:val="left"/>
+      <w:pPr>
+        <w:tabs>
+          <w:tab w:val="num" w:pos="720"/>
+        </w:tabs>
+        <w:ind w:left="720" w:hanging="360"/>
+      </w:pPr>
+      <w:rPr>
+        <w:rFonts w:ascii="Symbol" w:hAnsi="Symbol" w:hint="default"/>
+        <w:sz w:val="20"/>
+      </w:rPr>
+    </w:lvl>
+    <w:lvl w:ilvl="1" w:tentative="1">
+      <w:start w:val="1"/>
+      <w:numFmt w:val="bullet"/>
+      <w:lvlText w:val="o"/>
+      <w:lvlJc w:val="left"/>
+      <w:pPr>
+        <w:tabs>
+          <w:tab w:val="num" w:pos="1440"/>
+        </w:tabs>
+        <w:ind w:left="1440" w:hanging="360"/>
+      </w:pPr>
+      <w:rPr>
+        <w:rFonts w:ascii="Courier New" w:hAnsi="Courier New" w:hint="default"/>
+        <w:sz w:val="20"/>
+      </w:rPr>
+    </w:lvl>
+    <w:lvl w:ilvl="2" w:tentative="1">
+      <w:start w:val="1"/>
+      <w:numFmt w:val="bullet"/>
+      <w:lvlText w:val=""/>
+      <w:lvlJc w:val="left"/>
+      <w:pPr>
+        <w:tabs>
+          <w:tab w:val="num" w:pos="2160"/>
+        </w:tabs>
+        <w:ind w:left="2160" w:hanging="360"/>
+      </w:pPr>
+      <w:rPr>
+        <w:rFonts w:ascii="Wingdings" w:hAnsi="Wingdings" w:hint="default"/>
+        <w:sz w:val="20"/>
+      </w:rPr>
+    </w:lvl>
+    <w:lvl w:ilvl="3" w:tentative="1">
+      <w:start w:val="1"/>
+      <w:numFmt w:val="bullet"/>
+      <w:lvlText w:val=""/>
+      <w:lvlJc w:val="left"/>
+      <w:pPr>
+        <w:tabs>
+          <w:tab w:val="num" w:pos="2880"/>
+        </w:tabs>
+        <w:ind w:left="2880" w:hanging="360"/>
+      </w:pPr>
+      <w:rPr>
+        <w:rFonts w:ascii="Wingdings" w:hAnsi="Wingdings" w:hint="default"/>
+        <w:sz w:val="20"/>
+      </w:rPr>
+    </w:lvl>
+    <w:lvl w:ilvl="4" w:tentative="1">
+      <w:start w:val="1"/>
+      <w:numFmt w:val="bullet"/>
+      <w:lvlText w:val=""/>
+      <w:lvlJc w:val="left"/>
+      <w:pPr>
+        <w:tabs>
+          <w:tab w:val="num" w:pos="3600"/>
+        </w:tabs>
+        <w:ind w:left="3600" w:hanging="360"/>
+      </w:pPr>
+      <w:rPr>
+        <w:rFonts w:ascii="Wingdings" w:hAnsi="Wingdings" w:hint="default"/>
+        <w:sz w:val="20"/>
+      </w:rPr>
+    </w:lvl>
+    <w:lvl w:ilvl="5" w:tentative="1">
+      <w:start w:val="1"/>
+      <w:numFmt w:val="bullet"/>
+      <w:lvlText w:val=""/>
+      <w:lvlJc w:val="left"/>
+      <w:pPr>
+        <w:tabs>
+          <w:tab w:val="num" w:pos="4320"/>
+        </w:tabs>
+        <w:ind w:left="4320" w:hanging="360"/>
+      </w:pPr>
+      <w:rPr>
+        <w:rFonts w:ascii="Wingdings" w:hAnsi="Wingdings" w:hint="default"/>
+        <w:sz w:val="20"/>
+      </w:rPr>
+    </w:lvl>
+    <w:lvl w:ilvl="6" w:tentative="1">
+      <w:start w:val="1"/>
+      <w:numFmt w:val="bullet"/>
+      <w:lvlText w:val=""/>
+      <w:lvlJc w:val="left"/>
+      <w:pPr>
+        <w:tabs>
+          <w:tab w:val="num" w:pos="5040"/>
+        </w:tabs>
+        <w:ind w:left="5040" w:hanging="360"/>
+      </w:pPr>
+      <w:rPr>
+        <w:rFonts w:ascii="Wingdings" w:hAnsi="Wingdings" w:hint="default"/>
+        <w:sz w:val="20"/>
+      </w:rPr>
+    </w:lvl>
+    <w:lvl w:ilvl="7" w:tentative="1">
+      <w:start w:val="1"/>
+      <w:numFmt w:val="bullet"/>
+      <w:lvlText w:val=""/>
+      <w:lvlJc w:val="left"/>
+      <w:pPr>
+        <w:tabs>
+          <w:tab w:val="num" w:pos="5760"/>
+        </w:tabs>
+        <w:ind w:left="5760" w:hanging="360"/>
+      </w:pPr>
+      <w:rPr>
+        <w:rFonts w:ascii="Wingdings" w:hAnsi="Wingdings" w:hint="default"/>
+        <w:sz w:val="20"/>
+      </w:rPr>
+    </w:lvl>
+    <w:lvl w:ilvl="8" w:tentative="1">
+      <w:start w:val="1"/>
+      <w:numFmt w:val="bullet"/>
+      <w:lvlText w:val=""/>
+      <w:lvlJc w:val="left"/>
+      <w:pPr>
+        <w:tabs>
+          <w:tab w:val="num" w:pos="6480"/>
+        </w:tabs>
+        <w:ind w:left="6480" w:hanging="360"/>
+      </w:pPr>
+      <w:rPr>
+        <w:rFonts w:ascii="Wingdings" w:hAnsi="Wingdings" w:hint="default"/>
+        <w:sz w:val="20"/>
+      </w:rPr>
+    </w:lvl>
+  </w:abstractNum>
+  <w:abstractNum w:abstractNumId="11" w15:restartNumberingAfterBreak="0">
     <w:nsid w:val="1F4C4C4F"/>
     <w:multiLevelType w:val="multilevel"/>
     <w:tmpl w:val="66D0D7A2"/>
@@ -14732,7 +15193,7 @@
       </w:rPr>
     </w:lvl>
   </w:abstractNum>
-  <w:abstractNum w:abstractNumId="11" w15:restartNumberingAfterBreak="0">
+  <w:abstractNum w:abstractNumId="12" w15:restartNumberingAfterBreak="0">
     <w:nsid w:val="219C0A15"/>
     <w:multiLevelType w:val="multilevel"/>
     <w:tmpl w:val="06CACB72"/>
@@ -14881,7 +15342,7 @@
       </w:rPr>
     </w:lvl>
   </w:abstractNum>
-  <w:abstractNum w:abstractNumId="12" w15:restartNumberingAfterBreak="0">
+  <w:abstractNum w:abstractNumId="13" w15:restartNumberingAfterBreak="0">
     <w:nsid w:val="309926B3"/>
     <w:multiLevelType w:val="multilevel"/>
     <w:tmpl w:val="A3266A4E"/>
@@ -15030,7 +15491,156 @@
       </w:rPr>
     </w:lvl>
   </w:abstractNum>
-  <w:abstractNum w:abstractNumId="13" w15:restartNumberingAfterBreak="0">
+  <w:abstractNum w:abstractNumId="14" w15:restartNumberingAfterBreak="0">
+    <w:nsid w:val="31C458A5"/>
+    <w:multiLevelType w:val="multilevel"/>
+    <w:tmpl w:val="E9C85524"/>
+    <w:lvl w:ilvl="0">
+      <w:start w:val="1"/>
+      <w:numFmt w:val="bullet"/>
+      <w:lvlText w:val=""/>
+      <w:lvlJc w:val="left"/>
+      <w:pPr>
+        <w:tabs>
+          <w:tab w:val="num" w:pos="720"/>
+        </w:tabs>
+        <w:ind w:left="720" w:hanging="360"/>
+      </w:pPr>
+      <w:rPr>
+        <w:rFonts w:ascii="Symbol" w:hAnsi="Symbol" w:hint="default"/>
+        <w:sz w:val="20"/>
+      </w:rPr>
+    </w:lvl>
+    <w:lvl w:ilvl="1">
+      <w:start w:val="1"/>
+      <w:numFmt w:val="bullet"/>
+      <w:lvlText w:val="o"/>
+      <w:lvlJc w:val="left"/>
+      <w:pPr>
+        <w:tabs>
+          <w:tab w:val="num" w:pos="1440"/>
+        </w:tabs>
+        <w:ind w:left="1440" w:hanging="360"/>
+      </w:pPr>
+      <w:rPr>
+        <w:rFonts w:ascii="Courier New" w:hAnsi="Courier New" w:hint="default"/>
+        <w:sz w:val="20"/>
+      </w:rPr>
+    </w:lvl>
+    <w:lvl w:ilvl="2" w:tentative="1">
+      <w:start w:val="1"/>
+      <w:numFmt w:val="bullet"/>
+      <w:lvlText w:val=""/>
+      <w:lvlJc w:val="left"/>
+      <w:pPr>
+        <w:tabs>
+          <w:tab w:val="num" w:pos="2160"/>
+        </w:tabs>
+        <w:ind w:left="2160" w:hanging="360"/>
+      </w:pPr>
+      <w:rPr>
+        <w:rFonts w:ascii="Wingdings" w:hAnsi="Wingdings" w:hint="default"/>
+        <w:sz w:val="20"/>
+      </w:rPr>
+    </w:lvl>
+    <w:lvl w:ilvl="3" w:tentative="1">
+      <w:start w:val="1"/>
+      <w:numFmt w:val="bullet"/>
+      <w:lvlText w:val=""/>
+      <w:lvlJc w:val="left"/>
+      <w:pPr>
+        <w:tabs>
+          <w:tab w:val="num" w:pos="2880"/>
+        </w:tabs>
+        <w:ind w:left="2880" w:hanging="360"/>
+      </w:pPr>
+      <w:rPr>
+        <w:rFonts w:ascii="Wingdings" w:hAnsi="Wingdings" w:hint="default"/>
+        <w:sz w:val="20"/>
+      </w:rPr>
+    </w:lvl>
+    <w:lvl w:ilvl="4" w:tentative="1">
+      <w:start w:val="1"/>
+      <w:numFmt w:val="bullet"/>
+      <w:lvlText w:val=""/>
+      <w:lvlJc w:val="left"/>
+      <w:pPr>
+        <w:tabs>
+          <w:tab w:val="num" w:pos="3600"/>
+        </w:tabs>
+        <w:ind w:left="3600" w:hanging="360"/>
+      </w:pPr>
+      <w:rPr>
+        <w:rFonts w:ascii="Wingdings" w:hAnsi="Wingdings" w:hint="default"/>
+        <w:sz w:val="20"/>
+      </w:rPr>
+    </w:lvl>
+    <w:lvl w:ilvl="5" w:tentative="1">
+      <w:start w:val="1"/>
+      <w:numFmt w:val="bullet"/>
+      <w:lvlText w:val=""/>
+      <w:lvlJc w:val="left"/>
+      <w:pPr>
+        <w:tabs>
+          <w:tab w:val="num" w:pos="4320"/>
+        </w:tabs>
+        <w:ind w:left="4320" w:hanging="360"/>
+      </w:pPr>
+      <w:rPr>
+        <w:rFonts w:ascii="Wingdings" w:hAnsi="Wingdings" w:hint="default"/>
+        <w:sz w:val="20"/>
+      </w:rPr>
+    </w:lvl>
+    <w:lvl w:ilvl="6" w:tentative="1">
+      <w:start w:val="1"/>
+      <w:numFmt w:val="bullet"/>
+      <w:lvlText w:val=""/>
+      <w:lvlJc w:val="left"/>
+      <w:pPr>
+        <w:tabs>
+          <w:tab w:val="num" w:pos="5040"/>
+        </w:tabs>
+        <w:ind w:left="5040" w:hanging="360"/>
+      </w:pPr>
+      <w:rPr>
+        <w:rFonts w:ascii="Wingdings" w:hAnsi="Wingdings" w:hint="default"/>
+        <w:sz w:val="20"/>
+      </w:rPr>
+    </w:lvl>
+    <w:lvl w:ilvl="7" w:tentative="1">
+      <w:start w:val="1"/>
+      <w:numFmt w:val="bullet"/>
+      <w:lvlText w:val=""/>
+      <w:lvlJc w:val="left"/>
+      <w:pPr>
+        <w:tabs>
+          <w:tab w:val="num" w:pos="5760"/>
+        </w:tabs>
+        <w:ind w:left="5760" w:hanging="360"/>
+      </w:pPr>
+      <w:rPr>
+        <w:rFonts w:ascii="Wingdings" w:hAnsi="Wingdings" w:hint="default"/>
+        <w:sz w:val="20"/>
+      </w:rPr>
+    </w:lvl>
+    <w:lvl w:ilvl="8" w:tentative="1">
+      <w:start w:val="1"/>
+      <w:numFmt w:val="bullet"/>
+      <w:lvlText w:val=""/>
+      <w:lvlJc w:val="left"/>
+      <w:pPr>
+        <w:tabs>
+          <w:tab w:val="num" w:pos="6480"/>
+        </w:tabs>
+        <w:ind w:left="6480" w:hanging="360"/>
+      </w:pPr>
+      <w:rPr>
+        <w:rFonts w:ascii="Wingdings" w:hAnsi="Wingdings" w:hint="default"/>
+        <w:sz w:val="20"/>
+      </w:rPr>
+    </w:lvl>
+  </w:abstractNum>
+  <w:abstractNum w:abstractNumId="15" w15:restartNumberingAfterBreak="0">
     <w:nsid w:val="33CF381A"/>
     <w:multiLevelType w:val="hybridMultilevel"/>
     <w:tmpl w:val="F2CE88EA"/>
@@ -15119,7 +15729,7 @@
       </w:pPr>
     </w:lvl>
   </w:abstractNum>
-  <w:abstractNum w:abstractNumId="14" w15:restartNumberingAfterBreak="0">
+  <w:abstractNum w:abstractNumId="16" w15:restartNumberingAfterBreak="0">
     <w:nsid w:val="342069D5"/>
     <w:multiLevelType w:val="multilevel"/>
     <w:tmpl w:val="DF32FAF0"/>
@@ -15268,7 +15878,7 @@
       </w:rPr>
     </w:lvl>
   </w:abstractNum>
-  <w:abstractNum w:abstractNumId="15" w15:restartNumberingAfterBreak="0">
+  <w:abstractNum w:abstractNumId="17" w15:restartNumberingAfterBreak="0">
     <w:nsid w:val="367D0CB5"/>
     <w:multiLevelType w:val="multilevel"/>
     <w:tmpl w:val="7A2A210E"/>
@@ -15417,7 +16027,7 @@
       </w:rPr>
     </w:lvl>
   </w:abstractNum>
-  <w:abstractNum w:abstractNumId="16" w15:restartNumberingAfterBreak="0">
+  <w:abstractNum w:abstractNumId="18" w15:restartNumberingAfterBreak="0">
     <w:nsid w:val="36A630E9"/>
     <w:multiLevelType w:val="multilevel"/>
     <w:tmpl w:val="3342ED5A"/>
@@ -15566,7 +16176,7 @@
       </w:rPr>
     </w:lvl>
   </w:abstractNum>
-  <w:abstractNum w:abstractNumId="17" w15:restartNumberingAfterBreak="0">
+  <w:abstractNum w:abstractNumId="19" w15:restartNumberingAfterBreak="0">
     <w:nsid w:val="38DD254B"/>
     <w:multiLevelType w:val="multilevel"/>
     <w:tmpl w:val="EF866D5A"/>
@@ -15715,7 +16325,7 @@
       </w:rPr>
     </w:lvl>
   </w:abstractNum>
-  <w:abstractNum w:abstractNumId="18" w15:restartNumberingAfterBreak="0">
+  <w:abstractNum w:abstractNumId="20" w15:restartNumberingAfterBreak="0">
     <w:nsid w:val="394F50C9"/>
     <w:multiLevelType w:val="multilevel"/>
     <w:tmpl w:val="FB0E0374"/>
@@ -15864,7 +16474,7 @@
       </w:rPr>
     </w:lvl>
   </w:abstractNum>
-  <w:abstractNum w:abstractNumId="19" w15:restartNumberingAfterBreak="0">
+  <w:abstractNum w:abstractNumId="21" w15:restartNumberingAfterBreak="0">
     <w:nsid w:val="39814AE3"/>
     <w:multiLevelType w:val="multilevel"/>
     <w:tmpl w:val="4A6802CA"/>
@@ -16013,7 +16623,7 @@
       </w:rPr>
     </w:lvl>
   </w:abstractNum>
-  <w:abstractNum w:abstractNumId="20" w15:restartNumberingAfterBreak="0">
+  <w:abstractNum w:abstractNumId="22" w15:restartNumberingAfterBreak="0">
     <w:nsid w:val="3C334103"/>
     <w:multiLevelType w:val="multilevel"/>
     <w:tmpl w:val="871CA32E"/>
@@ -16162,7 +16772,7 @@
       </w:rPr>
     </w:lvl>
   </w:abstractNum>
-  <w:abstractNum w:abstractNumId="21" w15:restartNumberingAfterBreak="0">
+  <w:abstractNum w:abstractNumId="23" w15:restartNumberingAfterBreak="0">
     <w:nsid w:val="3FA26364"/>
     <w:multiLevelType w:val="multilevel"/>
     <w:tmpl w:val="7102D8A2"/>
@@ -16311,7 +16921,7 @@
       </w:rPr>
     </w:lvl>
   </w:abstractNum>
-  <w:abstractNum w:abstractNumId="22" w15:restartNumberingAfterBreak="0">
+  <w:abstractNum w:abstractNumId="24" w15:restartNumberingAfterBreak="0">
     <w:nsid w:val="40BC1D0F"/>
     <w:multiLevelType w:val="multilevel"/>
     <w:tmpl w:val="114E3898"/>
@@ -16460,7 +17070,7 @@
       </w:rPr>
     </w:lvl>
   </w:abstractNum>
-  <w:abstractNum w:abstractNumId="23" w15:restartNumberingAfterBreak="0">
+  <w:abstractNum w:abstractNumId="25" w15:restartNumberingAfterBreak="0">
     <w:nsid w:val="41B87FFD"/>
     <w:multiLevelType w:val="multilevel"/>
     <w:tmpl w:val="D9A2C7D4"/>
@@ -16609,7 +17219,7 @@
       </w:rPr>
     </w:lvl>
   </w:abstractNum>
-  <w:abstractNum w:abstractNumId="24" w15:restartNumberingAfterBreak="0">
+  <w:abstractNum w:abstractNumId="26" w15:restartNumberingAfterBreak="0">
     <w:nsid w:val="42754AB1"/>
     <w:multiLevelType w:val="hybridMultilevel"/>
     <w:tmpl w:val="BE1A7CFE"/>
@@ -16722,7 +17332,7 @@
       </w:rPr>
     </w:lvl>
   </w:abstractNum>
-  <w:abstractNum w:abstractNumId="25" w15:restartNumberingAfterBreak="0">
+  <w:abstractNum w:abstractNumId="27" w15:restartNumberingAfterBreak="0">
     <w:nsid w:val="42F3162A"/>
     <w:multiLevelType w:val="multilevel"/>
     <w:tmpl w:val="EC3ECDD2"/>
@@ -16871,7 +17481,7 @@
       </w:rPr>
     </w:lvl>
   </w:abstractNum>
-  <w:abstractNum w:abstractNumId="26" w15:restartNumberingAfterBreak="0">
+  <w:abstractNum w:abstractNumId="28" w15:restartNumberingAfterBreak="0">
     <w:nsid w:val="43A149EC"/>
     <w:multiLevelType w:val="multilevel"/>
     <w:tmpl w:val="359E42D6"/>
@@ -17020,7 +17630,7 @@
       </w:rPr>
     </w:lvl>
   </w:abstractNum>
-  <w:abstractNum w:abstractNumId="27" w15:restartNumberingAfterBreak="0">
+  <w:abstractNum w:abstractNumId="29" w15:restartNumberingAfterBreak="0">
     <w:nsid w:val="4809326F"/>
     <w:multiLevelType w:val="hybridMultilevel"/>
     <w:tmpl w:val="EDAA36C8"/>
@@ -17232,7 +17842,7 @@
       </w:rPr>
     </w:lvl>
   </w:abstractNum>
-  <w:abstractNum w:abstractNumId="28" w15:restartNumberingAfterBreak="0">
+  <w:abstractNum w:abstractNumId="30" w15:restartNumberingAfterBreak="0">
     <w:nsid w:val="4AFB3D85"/>
     <w:multiLevelType w:val="hybridMultilevel"/>
     <w:tmpl w:val="92E4DC3C"/>
@@ -17321,7 +17931,7 @@
       </w:pPr>
     </w:lvl>
   </w:abstractNum>
-  <w:abstractNum w:abstractNumId="29" w15:restartNumberingAfterBreak="0">
+  <w:abstractNum w:abstractNumId="31" w15:restartNumberingAfterBreak="0">
     <w:nsid w:val="525B28B2"/>
     <w:multiLevelType w:val="multilevel"/>
     <w:tmpl w:val="EFF65D3E"/>
@@ -17470,7 +18080,7 @@
       </w:rPr>
     </w:lvl>
   </w:abstractNum>
-  <w:abstractNum w:abstractNumId="30" w15:restartNumberingAfterBreak="0">
+  <w:abstractNum w:abstractNumId="32" w15:restartNumberingAfterBreak="0">
     <w:nsid w:val="52FF3F80"/>
     <w:multiLevelType w:val="multilevel"/>
     <w:tmpl w:val="9E24583A"/>
@@ -17619,7 +18229,7 @@
       </w:rPr>
     </w:lvl>
   </w:abstractNum>
-  <w:abstractNum w:abstractNumId="31" w15:restartNumberingAfterBreak="0">
+  <w:abstractNum w:abstractNumId="33" w15:restartNumberingAfterBreak="0">
     <w:nsid w:val="53250A63"/>
     <w:multiLevelType w:val="multilevel"/>
     <w:tmpl w:val="6936C414"/>
@@ -17768,7 +18378,156 @@
       </w:rPr>
     </w:lvl>
   </w:abstractNum>
-  <w:abstractNum w:abstractNumId="32" w15:restartNumberingAfterBreak="0">
+  <w:abstractNum w:abstractNumId="34" w15:restartNumberingAfterBreak="0">
+    <w:nsid w:val="53CF6885"/>
+    <w:multiLevelType w:val="multilevel"/>
+    <w:tmpl w:val="189ECE0A"/>
+    <w:lvl w:ilvl="0">
+      <w:start w:val="1"/>
+      <w:numFmt w:val="bullet"/>
+      <w:lvlText w:val=""/>
+      <w:lvlJc w:val="left"/>
+      <w:pPr>
+        <w:tabs>
+          <w:tab w:val="num" w:pos="720"/>
+        </w:tabs>
+        <w:ind w:left="720" w:hanging="360"/>
+      </w:pPr>
+      <w:rPr>
+        <w:rFonts w:ascii="Symbol" w:hAnsi="Symbol" w:hint="default"/>
+        <w:sz w:val="20"/>
+      </w:rPr>
+    </w:lvl>
+    <w:lvl w:ilvl="1" w:tentative="1">
+      <w:start w:val="1"/>
+      <w:numFmt w:val="bullet"/>
+      <w:lvlText w:val="o"/>
+      <w:lvlJc w:val="left"/>
+      <w:pPr>
+        <w:tabs>
+          <w:tab w:val="num" w:pos="1440"/>
+        </w:tabs>
+        <w:ind w:left="1440" w:hanging="360"/>
+      </w:pPr>
+      <w:rPr>
+        <w:rFonts w:ascii="Courier New" w:hAnsi="Courier New" w:hint="default"/>
+        <w:sz w:val="20"/>
+      </w:rPr>
+    </w:lvl>
+    <w:lvl w:ilvl="2" w:tentative="1">
+      <w:start w:val="1"/>
+      <w:numFmt w:val="bullet"/>
+      <w:lvlText w:val=""/>
+      <w:lvlJc w:val="left"/>
+      <w:pPr>
+        <w:tabs>
+          <w:tab w:val="num" w:pos="2160"/>
+        </w:tabs>
+        <w:ind w:left="2160" w:hanging="360"/>
+      </w:pPr>
+      <w:rPr>
+        <w:rFonts w:ascii="Wingdings" w:hAnsi="Wingdings" w:hint="default"/>
+        <w:sz w:val="20"/>
+      </w:rPr>
+    </w:lvl>
+    <w:lvl w:ilvl="3" w:tentative="1">
+      <w:start w:val="1"/>
+      <w:numFmt w:val="bullet"/>
+      <w:lvlText w:val=""/>
+      <w:lvlJc w:val="left"/>
+      <w:pPr>
+        <w:tabs>
+          <w:tab w:val="num" w:pos="2880"/>
+        </w:tabs>
+        <w:ind w:left="2880" w:hanging="360"/>
+      </w:pPr>
+      <w:rPr>
+        <w:rFonts w:ascii="Wingdings" w:hAnsi="Wingdings" w:hint="default"/>
+        <w:sz w:val="20"/>
+      </w:rPr>
+    </w:lvl>
+    <w:lvl w:ilvl="4" w:tentative="1">
+      <w:start w:val="1"/>
+      <w:numFmt w:val="bullet"/>
+      <w:lvlText w:val=""/>
+      <w:lvlJc w:val="left"/>
+      <w:pPr>
+        <w:tabs>
+          <w:tab w:val="num" w:pos="3600"/>
+        </w:tabs>
+        <w:ind w:left="3600" w:hanging="360"/>
+      </w:pPr>
+      <w:rPr>
+        <w:rFonts w:ascii="Wingdings" w:hAnsi="Wingdings" w:hint="default"/>
+        <w:sz w:val="20"/>
+      </w:rPr>
+    </w:lvl>
+    <w:lvl w:ilvl="5" w:tentative="1">
+      <w:start w:val="1"/>
+      <w:numFmt w:val="bullet"/>
+      <w:lvlText w:val=""/>
+      <w:lvlJc w:val="left"/>
+      <w:pPr>
+        <w:tabs>
+          <w:tab w:val="num" w:pos="4320"/>
+        </w:tabs>
+        <w:ind w:left="4320" w:hanging="360"/>
+      </w:pPr>
+      <w:rPr>
+        <w:rFonts w:ascii="Wingdings" w:hAnsi="Wingdings" w:hint="default"/>
+        <w:sz w:val="20"/>
+      </w:rPr>
+    </w:lvl>
+    <w:lvl w:ilvl="6" w:tentative="1">
+      <w:start w:val="1"/>
+      <w:numFmt w:val="bullet"/>
+      <w:lvlText w:val=""/>
+      <w:lvlJc w:val="left"/>
+      <w:pPr>
+        <w:tabs>
+          <w:tab w:val="num" w:pos="5040"/>
+        </w:tabs>
+        <w:ind w:left="5040" w:hanging="360"/>
+      </w:pPr>
+      <w:rPr>
+        <w:rFonts w:ascii="Wingdings" w:hAnsi="Wingdings" w:hint="default"/>
+        <w:sz w:val="20"/>
+      </w:rPr>
+    </w:lvl>
+    <w:lvl w:ilvl="7" w:tentative="1">
+      <w:start w:val="1"/>
+      <w:numFmt w:val="bullet"/>
+      <w:lvlText w:val=""/>
+      <w:lvlJc w:val="left"/>
+      <w:pPr>
+        <w:tabs>
+          <w:tab w:val="num" w:pos="5760"/>
+        </w:tabs>
+        <w:ind w:left="5760" w:hanging="360"/>
+      </w:pPr>
+      <w:rPr>
+        <w:rFonts w:ascii="Wingdings" w:hAnsi="Wingdings" w:hint="default"/>
+        <w:sz w:val="20"/>
+      </w:rPr>
+    </w:lvl>
+    <w:lvl w:ilvl="8" w:tentative="1">
+      <w:start w:val="1"/>
+      <w:numFmt w:val="bullet"/>
+      <w:lvlText w:val=""/>
+      <w:lvlJc w:val="left"/>
+      <w:pPr>
+        <w:tabs>
+          <w:tab w:val="num" w:pos="6480"/>
+        </w:tabs>
+        <w:ind w:left="6480" w:hanging="360"/>
+      </w:pPr>
+      <w:rPr>
+        <w:rFonts w:ascii="Wingdings" w:hAnsi="Wingdings" w:hint="default"/>
+        <w:sz w:val="20"/>
+      </w:rPr>
+    </w:lvl>
+  </w:abstractNum>
+  <w:abstractNum w:abstractNumId="35" w15:restartNumberingAfterBreak="0">
     <w:nsid w:val="575A637C"/>
     <w:multiLevelType w:val="hybridMultilevel"/>
     <w:tmpl w:val="63146F94"/>
@@ -17854,7 +18613,7 @@
       </w:pPr>
     </w:lvl>
   </w:abstractNum>
-  <w:abstractNum w:abstractNumId="33" w15:restartNumberingAfterBreak="0">
+  <w:abstractNum w:abstractNumId="36" w15:restartNumberingAfterBreak="0">
     <w:nsid w:val="5F5F1046"/>
     <w:multiLevelType w:val="multilevel"/>
     <w:tmpl w:val="F69674B0"/>
@@ -18003,7 +18762,7 @@
       </w:rPr>
     </w:lvl>
   </w:abstractNum>
-  <w:abstractNum w:abstractNumId="34" w15:restartNumberingAfterBreak="0">
+  <w:abstractNum w:abstractNumId="37" w15:restartNumberingAfterBreak="0">
     <w:nsid w:val="6A5349C5"/>
     <w:multiLevelType w:val="multilevel"/>
     <w:tmpl w:val="9CB44C78"/>
@@ -18152,7 +18911,7 @@
       </w:rPr>
     </w:lvl>
   </w:abstractNum>
-  <w:abstractNum w:abstractNumId="35" w15:restartNumberingAfterBreak="0">
+  <w:abstractNum w:abstractNumId="38" w15:restartNumberingAfterBreak="0">
     <w:nsid w:val="6B3222D5"/>
     <w:multiLevelType w:val="multilevel"/>
     <w:tmpl w:val="F0243014"/>
@@ -18301,10 +19060,10 @@
       </w:rPr>
     </w:lvl>
   </w:abstractNum>
-  <w:abstractNum w:abstractNumId="36" w15:restartNumberingAfterBreak="0">
+  <w:abstractNum w:abstractNumId="39" w15:restartNumberingAfterBreak="0">
     <w:nsid w:val="78B34E15"/>
     <w:multiLevelType w:val="hybridMultilevel"/>
-    <w:tmpl w:val="B5A29380"/>
+    <w:tmpl w:val="680860F2"/>
     <w:lvl w:ilvl="0" w:tplc="0416000F">
       <w:start w:val="1"/>
       <w:numFmt w:val="decimal"/>
@@ -18387,7 +19146,7 @@
       </w:pPr>
     </w:lvl>
   </w:abstractNum>
-  <w:abstractNum w:abstractNumId="37" w15:restartNumberingAfterBreak="0">
+  <w:abstractNum w:abstractNumId="40" w15:restartNumberingAfterBreak="0">
     <w:nsid w:val="7FE970DE"/>
     <w:multiLevelType w:val="multilevel"/>
     <w:tmpl w:val="7FB488BE"/>
@@ -18540,31 +19299,31 @@
     <w:abstractNumId w:val="2"/>
   </w:num>
   <w:num w:numId="2" w16cid:durableId="1899438238">
-    <w:abstractNumId w:val="27"/>
+    <w:abstractNumId w:val="29"/>
   </w:num>
   <w:num w:numId="3" w16cid:durableId="446317888">
+    <w:abstractNumId w:val="15"/>
+  </w:num>
+  <w:num w:numId="4" w16cid:durableId="316812812">
+    <w:abstractNumId w:val="30"/>
+  </w:num>
+  <w:num w:numId="5" w16cid:durableId="2107534834">
+    <w:abstractNumId w:val="38"/>
+  </w:num>
+  <w:num w:numId="6" w16cid:durableId="1770198717">
     <w:abstractNumId w:val="13"/>
   </w:num>
-  <w:num w:numId="4" w16cid:durableId="316812812">
-    <w:abstractNumId w:val="28"/>
-  </w:num>
-  <w:num w:numId="5" w16cid:durableId="2107534834">
+  <w:num w:numId="7" w16cid:durableId="944921588">
     <w:abstractNumId w:val="35"/>
   </w:num>
-  <w:num w:numId="6" w16cid:durableId="1770198717">
-    <w:abstractNumId w:val="12"/>
-  </w:num>
-  <w:num w:numId="7" w16cid:durableId="944921588">
-    <w:abstractNumId w:val="32"/>
-  </w:num>
   <w:num w:numId="8" w16cid:durableId="931546427">
-    <w:abstractNumId w:val="21"/>
+    <w:abstractNumId w:val="23"/>
   </w:num>
   <w:num w:numId="9" w16cid:durableId="1129938157">
-    <w:abstractNumId w:val="20"/>
+    <w:abstractNumId w:val="22"/>
   </w:num>
   <w:num w:numId="10" w16cid:durableId="1913076791">
-    <w:abstractNumId w:val="33"/>
+    <w:abstractNumId w:val="36"/>
   </w:num>
   <w:num w:numId="11" w16cid:durableId="1894153078">
     <w:abstractNumId w:val="0"/>
@@ -18573,22 +19332,22 @@
     <w:abstractNumId w:val="5"/>
   </w:num>
   <w:num w:numId="13" w16cid:durableId="977153682">
-    <w:abstractNumId w:val="26"/>
+    <w:abstractNumId w:val="28"/>
   </w:num>
   <w:num w:numId="14" w16cid:durableId="1574897763">
-    <w:abstractNumId w:val="31"/>
+    <w:abstractNumId w:val="33"/>
   </w:num>
   <w:num w:numId="15" w16cid:durableId="1029601610">
+    <w:abstractNumId w:val="40"/>
+  </w:num>
+  <w:num w:numId="16" w16cid:durableId="148786897">
+    <w:abstractNumId w:val="32"/>
+  </w:num>
+  <w:num w:numId="17" w16cid:durableId="393508652">
     <w:abstractNumId w:val="37"/>
   </w:num>
-  <w:num w:numId="16" w16cid:durableId="148786897">
-    <w:abstractNumId w:val="30"/>
-  </w:num>
-  <w:num w:numId="17" w16cid:durableId="393508652">
-    <w:abstractNumId w:val="34"/>
-  </w:num>
   <w:num w:numId="18" w16cid:durableId="288240786">
-    <w:abstractNumId w:val="10"/>
+    <w:abstractNumId w:val="11"/>
   </w:num>
   <w:num w:numId="19" w16cid:durableId="1782529171">
     <w:abstractNumId w:val="7"/>
@@ -18600,7 +19359,7 @@
     <w:abstractNumId w:val="8"/>
   </w:num>
   <w:num w:numId="22" w16cid:durableId="981497355">
-    <w:abstractNumId w:val="11"/>
+    <w:abstractNumId w:val="12"/>
   </w:num>
   <w:num w:numId="23" w16cid:durableId="206532692">
     <w:abstractNumId w:val="1"/>
@@ -18609,52 +19368,61 @@
     <w:abstractNumId w:val="4"/>
   </w:num>
   <w:num w:numId="25" w16cid:durableId="1972859419">
-    <w:abstractNumId w:val="24"/>
+    <w:abstractNumId w:val="26"/>
   </w:num>
   <w:num w:numId="26" w16cid:durableId="855926518">
-    <w:abstractNumId w:val="15"/>
+    <w:abstractNumId w:val="17"/>
   </w:num>
   <w:num w:numId="27" w16cid:durableId="1188330951">
-    <w:abstractNumId w:val="17"/>
+    <w:abstractNumId w:val="19"/>
   </w:num>
   <w:num w:numId="28" w16cid:durableId="1379428095">
     <w:abstractNumId w:val="9"/>
   </w:num>
   <w:num w:numId="29" w16cid:durableId="1265115766">
-    <w:abstractNumId w:val="29"/>
+    <w:abstractNumId w:val="31"/>
   </w:num>
   <w:num w:numId="30" w16cid:durableId="1092510417">
-    <w:abstractNumId w:val="22"/>
+    <w:abstractNumId w:val="24"/>
   </w:num>
   <w:num w:numId="31" w16cid:durableId="1117792318">
-    <w:abstractNumId w:val="14"/>
+    <w:abstractNumId w:val="16"/>
   </w:num>
   <w:num w:numId="32" w16cid:durableId="1520657276">
+    <w:abstractNumId w:val="20"/>
+  </w:num>
+  <w:num w:numId="33" w16cid:durableId="746850055">
     <w:abstractNumId w:val="18"/>
   </w:num>
-  <w:num w:numId="33" w16cid:durableId="746850055">
-    <w:abstractNumId w:val="16"/>
-  </w:num>
   <w:num w:numId="34" w16cid:durableId="1371149696">
-    <w:abstractNumId w:val="23"/>
+    <w:abstractNumId w:val="25"/>
   </w:num>
   <w:num w:numId="35" w16cid:durableId="318844701">
     <w:abstractNumId w:val="6"/>
   </w:num>
   <w:num w:numId="36" w16cid:durableId="535311878">
-    <w:abstractNumId w:val="19"/>
+    <w:abstractNumId w:val="21"/>
   </w:num>
   <w:num w:numId="37" w16cid:durableId="1413429655">
-    <w:abstractNumId w:val="25"/>
+    <w:abstractNumId w:val="27"/>
   </w:num>
   <w:num w:numId="38" w16cid:durableId="992757240">
-    <w:abstractNumId w:val="36"/>
+    <w:abstractNumId w:val="39"/>
+  </w:num>
+  <w:num w:numId="39" w16cid:durableId="909971478">
+    <w:abstractNumId w:val="10"/>
+  </w:num>
+  <w:num w:numId="40" w16cid:durableId="27068207">
+    <w:abstractNumId w:val="34"/>
+  </w:num>
+  <w:num w:numId="41" w16cid:durableId="1692340260">
+    <w:abstractNumId w:val="14"/>
   </w:num>
 </w:numbering>
 </file>
 
 <file path=word/styles.xml><?xml version="1.0" encoding="utf-8"?>
-<w:styles xmlns:mc="http://schemas.openxmlformats.org/markup-compatibility/2006" xmlns:r="http://schemas.openxmlformats.org/officeDocument/2006/relationships" xmlns:w="http://schemas.openxmlformats.org/wordprocessingml/2006/main" xmlns:w14="http://schemas.microsoft.com/office/word/2010/wordml" xmlns:w15="http://schemas.microsoft.com/office/word/2012/wordml" xmlns:w16cex="http://schemas.microsoft.com/office/word/2018/wordml/cex" xmlns:w16cid="http://schemas.microsoft.com/office/word/2016/wordml/cid" xmlns:w16="http://schemas.microsoft.com/office/word/2018/wordml" xmlns:w16sdtdh="http://schemas.microsoft.com/office/word/2020/wordml/sdtdatahash" xmlns:w16se="http://schemas.microsoft.com/office/word/2015/wordml/symex" mc:Ignorable="w14 w15 w16se w16cid w16 w16cex w16sdtdh">
+<w:styles xmlns:mc="http://schemas.openxmlformats.org/markup-compatibility/2006" xmlns:r="http://schemas.openxmlformats.org/officeDocument/2006/relationships" xmlns:w="http://schemas.openxmlformats.org/wordprocessingml/2006/main" xmlns:w14="http://schemas.microsoft.com/office/word/2010/wordml" xmlns:w15="http://schemas.microsoft.com/office/word/2012/wordml" xmlns:w16cex="http://schemas.microsoft.com/office/word/2018/wordml/cex" xmlns:w16cid="http://schemas.microsoft.com/office/word/2016/wordml/cid" xmlns:w16="http://schemas.microsoft.com/office/word/2018/wordml" xmlns:w16du="http://schemas.microsoft.com/office/word/2023/wordml/word16du" xmlns:w16sdtdh="http://schemas.microsoft.com/office/word/2020/wordml/sdtdatahash" xmlns:w16sdtfl="http://schemas.microsoft.com/office/word/2024/wordml/sdtformatlock" xmlns:w16se="http://schemas.microsoft.com/office/word/2015/wordml/symex" mc:Ignorable="w14 w15 w16se w16cid w16 w16cex w16sdtdh w16sdtfl w16du">
   <w:docDefaults>
     <w:rPrDefault>
       <w:rPr>
@@ -19064,10 +19832,10 @@
       <w:color w:val="000000"/>
     </w:rPr>
   </w:style>
-  <w:style w:type="paragraph" w:styleId="Ttulo1">
+  <w:style w:type="paragraph" w:styleId="Heading1">
     <w:name w:val="heading 1"/>
     <w:next w:val="Normal"/>
-    <w:link w:val="Ttulo1Char"/>
+    <w:link w:val="Heading1Char"/>
     <w:uiPriority w:val="9"/>
     <w:qFormat/>
     <w:rsid w:val="00434563"/>
@@ -19085,10 +19853,10 @@
       <w:color w:val="000000"/>
     </w:rPr>
   </w:style>
-  <w:style w:type="paragraph" w:styleId="Ttulo2">
+  <w:style w:type="paragraph" w:styleId="Heading2">
     <w:name w:val="heading 2"/>
     <w:next w:val="Normal"/>
-    <w:link w:val="Ttulo2Char"/>
+    <w:link w:val="Heading2Char"/>
     <w:uiPriority w:val="9"/>
     <w:unhideWhenUsed/>
     <w:qFormat/>
@@ -19106,11 +19874,11 @@
       <w:color w:val="000000"/>
     </w:rPr>
   </w:style>
-  <w:style w:type="paragraph" w:styleId="Ttulo3">
+  <w:style w:type="paragraph" w:styleId="Heading3">
     <w:name w:val="heading 3"/>
     <w:basedOn w:val="Normal"/>
     <w:next w:val="Normal"/>
-    <w:link w:val="Ttulo3Char"/>
+    <w:link w:val="Heading3Char"/>
     <w:uiPriority w:val="9"/>
     <w:semiHidden/>
     <w:unhideWhenUsed/>
@@ -19127,13 +19895,12 @@
       <w:color w:val="0A2F40" w:themeColor="accent1" w:themeShade="7F"/>
     </w:rPr>
   </w:style>
-  <w:style w:type="character" w:default="1" w:styleId="Fontepargpadro">
+  <w:style w:type="character" w:default="1" w:styleId="DefaultParagraphFont">
     <w:name w:val="Default Paragraph Font"/>
     <w:uiPriority w:val="1"/>
-    <w:semiHidden/>
     <w:unhideWhenUsed/>
   </w:style>
-  <w:style w:type="table" w:default="1" w:styleId="Tabelanormal">
+  <w:style w:type="table" w:default="1" w:styleId="TableNormal">
     <w:name w:val="Normal Table"/>
     <w:uiPriority w:val="99"/>
     <w:semiHidden/>
@@ -19148,15 +19915,15 @@
       </w:tblCellMar>
     </w:tblPr>
   </w:style>
-  <w:style w:type="numbering" w:default="1" w:styleId="Semlista">
+  <w:style w:type="numbering" w:default="1" w:styleId="NoList">
     <w:name w:val="No List"/>
     <w:uiPriority w:val="99"/>
     <w:semiHidden/>
     <w:unhideWhenUsed/>
   </w:style>
-  <w:style w:type="character" w:customStyle="1" w:styleId="Ttulo2Char">
-    <w:name w:val="Título 2 Char"/>
-    <w:link w:val="Ttulo2"/>
+  <w:style w:type="character" w:customStyle="1" w:styleId="Heading2Char">
+    <w:name w:val="Heading 2 Char"/>
+    <w:link w:val="Heading2"/>
     <w:rPr>
       <w:rFonts w:ascii="Arial" w:eastAsia="Arial" w:hAnsi="Arial" w:cs="Arial"/>
       <w:b/>
@@ -19164,9 +19931,9 @@
       <w:sz w:val="24"/>
     </w:rPr>
   </w:style>
-  <w:style w:type="character" w:customStyle="1" w:styleId="Ttulo1Char">
-    <w:name w:val="Título 1 Char"/>
-    <w:link w:val="Ttulo1"/>
+  <w:style w:type="character" w:customStyle="1" w:styleId="Heading1Char">
+    <w:name w:val="Heading 1 Char"/>
+    <w:link w:val="Heading1"/>
     <w:uiPriority w:val="9"/>
     <w:rsid w:val="00434563"/>
     <w:rPr>
@@ -19175,7 +19942,7 @@
       <w:color w:val="000000"/>
     </w:rPr>
   </w:style>
-  <w:style w:type="paragraph" w:styleId="Sumrio1">
+  <w:style w:type="paragraph" w:styleId="TOC1">
     <w:name w:val="toc 1"/>
     <w:hidden/>
     <w:uiPriority w:val="39"/>
@@ -19189,10 +19956,10 @@
       <w:color w:val="000000"/>
     </w:rPr>
   </w:style>
-  <w:style w:type="paragraph" w:styleId="Rodap">
+  <w:style w:type="paragraph" w:styleId="Footer">
     <w:name w:val="footer"/>
     <w:basedOn w:val="Normal"/>
-    <w:link w:val="RodapChar"/>
+    <w:link w:val="FooterChar"/>
     <w:uiPriority w:val="99"/>
     <w:unhideWhenUsed/>
     <w:rsid w:val="00541C2A"/>
@@ -19204,10 +19971,10 @@
       <w:spacing w:after="0" w:line="240" w:lineRule="auto"/>
     </w:pPr>
   </w:style>
-  <w:style w:type="character" w:customStyle="1" w:styleId="RodapChar">
-    <w:name w:val="Rodapé Char"/>
-    <w:basedOn w:val="Fontepargpadro"/>
-    <w:link w:val="Rodap"/>
+  <w:style w:type="character" w:customStyle="1" w:styleId="FooterChar">
+    <w:name w:val="Footer Char"/>
+    <w:basedOn w:val="DefaultParagraphFont"/>
+    <w:link w:val="Footer"/>
     <w:uiPriority w:val="99"/>
     <w:rsid w:val="00541C2A"/>
     <w:rPr>
@@ -19215,9 +19982,9 @@
       <w:color w:val="000000"/>
     </w:rPr>
   </w:style>
-  <w:style w:type="paragraph" w:styleId="CabealhodoSumrio">
+  <w:style w:type="paragraph" w:styleId="TOCHeading">
     <w:name w:val="TOC Heading"/>
-    <w:basedOn w:val="Ttulo1"/>
+    <w:basedOn w:val="Heading1"/>
     <w:next w:val="Normal"/>
     <w:uiPriority w:val="39"/>
     <w:unhideWhenUsed/>
@@ -19242,7 +20009,7 @@
   </w:style>
   <w:style w:type="character" w:styleId="Hyperlink">
     <w:name w:val="Hyperlink"/>
-    <w:basedOn w:val="Fontepargpadro"/>
+    <w:basedOn w:val="DefaultParagraphFont"/>
     <w:uiPriority w:val="99"/>
     <w:unhideWhenUsed/>
     <w:rsid w:val="00164FE5"/>
@@ -19251,9 +20018,9 @@
       <w:u w:val="single"/>
     </w:rPr>
   </w:style>
-  <w:style w:type="table" w:styleId="Tabelacomgrade">
+  <w:style w:type="table" w:styleId="TableGrid">
     <w:name w:val="Table Grid"/>
-    <w:basedOn w:val="Tabelanormal"/>
+    <w:basedOn w:val="TableNormal"/>
     <w:uiPriority w:val="39"/>
     <w:rsid w:val="002C27AB"/>
     <w:pPr>
@@ -19270,10 +20037,10 @@
       </w:tblBorders>
     </w:tblPr>
   </w:style>
-  <w:style w:type="character" w:customStyle="1" w:styleId="Ttulo3Char">
-    <w:name w:val="Título 3 Char"/>
-    <w:basedOn w:val="Fontepargpadro"/>
-    <w:link w:val="Ttulo3"/>
+  <w:style w:type="character" w:customStyle="1" w:styleId="Heading3Char">
+    <w:name w:val="Heading 3 Char"/>
+    <w:basedOn w:val="DefaultParagraphFont"/>
+    <w:link w:val="Heading3"/>
     <w:uiPriority w:val="9"/>
     <w:semiHidden/>
     <w:rsid w:val="002C27AB"/>
@@ -19282,7 +20049,7 @@
       <w:color w:val="0A2F40" w:themeColor="accent1" w:themeShade="7F"/>
     </w:rPr>
   </w:style>
-  <w:style w:type="paragraph" w:styleId="Legenda">
+  <w:style w:type="paragraph" w:styleId="Caption">
     <w:name w:val="caption"/>
     <w:basedOn w:val="Normal"/>
     <w:next w:val="Normal"/>
@@ -19301,7 +20068,7 @@
       <w:szCs w:val="18"/>
     </w:rPr>
   </w:style>
-  <w:style w:type="paragraph" w:styleId="PargrafodaLista">
+  <w:style w:type="paragraph" w:styleId="ListParagraph">
     <w:name w:val="List Paragraph"/>
     <w:basedOn w:val="Normal"/>
     <w:uiPriority w:val="34"/>
@@ -19312,7 +20079,7 @@
       <w:contextualSpacing/>
     </w:pPr>
   </w:style>
-  <w:style w:type="paragraph" w:styleId="SemEspaamento">
+  <w:style w:type="paragraph" w:styleId="NoSpacing">
     <w:name w:val="No Spacing"/>
     <w:uiPriority w:val="1"/>
     <w:qFormat/>
@@ -19327,9 +20094,9 @@
       <w:color w:val="000000"/>
     </w:rPr>
   </w:style>
-  <w:style w:type="character" w:styleId="MenoPendente">
+  <w:style w:type="character" w:styleId="UnresolvedMention">
     <w:name w:val="Unresolved Mention"/>
-    <w:basedOn w:val="Fontepargpadro"/>
+    <w:basedOn w:val="DefaultParagraphFont"/>
     <w:uiPriority w:val="99"/>
     <w:semiHidden/>
     <w:unhideWhenUsed/>
@@ -19339,7 +20106,7 @@
       <w:shd w:val="clear" w:color="auto" w:fill="E1DFDD"/>
     </w:rPr>
   </w:style>
-  <w:style w:type="paragraph" w:styleId="Sumrio2">
+  <w:style w:type="paragraph" w:styleId="TOC2">
     <w:name w:val="toc 2"/>
     <w:basedOn w:val="Normal"/>
     <w:next w:val="Normal"/>
@@ -19352,9 +20119,9 @@
       <w:ind w:left="240"/>
     </w:pPr>
   </w:style>
-  <w:style w:type="character" w:styleId="HiperlinkVisitado">
+  <w:style w:type="character" w:styleId="FollowedHyperlink">
     <w:name w:val="FollowedHyperlink"/>
-    <w:basedOn w:val="Fontepargpadro"/>
+    <w:basedOn w:val="DefaultParagraphFont"/>
     <w:uiPriority w:val="99"/>
     <w:semiHidden/>
     <w:unhideWhenUsed/>
@@ -19383,9 +20150,9 @@
       <w14:ligatures w14:val="none"/>
     </w:rPr>
   </w:style>
-  <w:style w:type="character" w:styleId="Forte">
+  <w:style w:type="character" w:styleId="Strong">
     <w:name w:val="Strong"/>
-    <w:basedOn w:val="Fontepargpadro"/>
+    <w:basedOn w:val="DefaultParagraphFont"/>
     <w:uiPriority w:val="22"/>
     <w:qFormat/>
     <w:rsid w:val="004F43A3"/>

</xml_diff>

<commit_message>
docs: atualização das nomenclaturas
</commit_message>
<xml_diff>
--- a/docs/docs/Faculdade de Tecnologia Padre Danilo José de Oliveira Ohl.docx
+++ b/docs/docs/Faculdade de Tecnologia Padre Danilo José de Oliveira Ohl.docx
@@ -2009,21 +2009,7 @@
                 <w:rStyle w:val="Hyperlink"/>
                 <w:noProof/>
               </w:rPr>
-              <w:t>Unidade Org</w:t>
-            </w:r>
-            <w:r>
-              <w:rPr>
-                <w:rStyle w:val="Hyperlink"/>
-                <w:noProof/>
-              </w:rPr>
-              <w:t>a</w:t>
-            </w:r>
-            <w:r>
-              <w:rPr>
-                <w:rStyle w:val="Hyperlink"/>
-                <w:noProof/>
-              </w:rPr>
-              <w:t>nizacional</w:t>
+              <w:t>Unidade Organizacional</w:t>
             </w:r>
             <w:r>
               <w:rPr>
@@ -12920,90 +12906,101 @@
     </w:p>
     <w:p>
       <w:r>
-        <w:t>A nomenclatura de usuários no Active Directory da Fatec Barueri seguirá o padrão institucional definido pelo Centro Paula Souza (CPS), utilizando o e-mail institucional como login.</w:t>
+        <w:t>Para integrar o Active Directory (AD) aos serviços do Centro Paula Souza (CPS), o logon principal (UPN) utilizará o e-mail institucional no lugar do domínio local.</w:t>
+      </w:r>
+    </w:p>
+    <w:p>
+      <w:r>
+        <w:t>Para que o AD reconheça os e-mails do CPS, é preciso configurá-los no servidor uma única vez:</w:t>
       </w:r>
     </w:p>
     <w:p>
       <w:pPr>
         <w:numPr>
           <w:ilvl w:val="0"/>
-          <w:numId w:val="41"/>
+          <w:numId w:val="42"/>
         </w:numPr>
       </w:pPr>
+      <w:r>
+        <w:t xml:space="preserve">Abra a ferramenta </w:t>
+      </w:r>
       <w:r>
         <w:rPr>
           <w:b/>
           <w:bCs/>
         </w:rPr>
-        <w:t>Formato principal</w:t>
-      </w:r>
-      <w:r>
-        <w:t>: o login será composto por nome.sobrenome.</w:t>
+        <w:t>Domínios e Relações de Confiança do Active Directory</w:t>
+      </w:r>
+      <w:r>
+        <w:t>.</w:t>
       </w:r>
     </w:p>
     <w:p>
       <w:pPr>
         <w:numPr>
           <w:ilvl w:val="0"/>
-          <w:numId w:val="41"/>
+          <w:numId w:val="42"/>
         </w:numPr>
       </w:pPr>
+      <w:r>
+        <w:t xml:space="preserve">Acesse as </w:t>
+      </w:r>
       <w:r>
         <w:rPr>
           <w:b/>
           <w:bCs/>
         </w:rPr>
-        <w:t>Repetição de nomes</w:t>
-      </w:r>
-      <w:r>
-        <w:t>: em caso de duplicidade, serão adicionados números sequenciais após o sobrenome (ex.: nome.sobrenome1, nome.sobrenome2).</w:t>
+        <w:t>Propriedades</w:t>
+      </w:r>
+      <w:r>
+        <w:t xml:space="preserve"> do nó raiz.</w:t>
       </w:r>
     </w:p>
     <w:p>
       <w:pPr>
         <w:numPr>
           <w:ilvl w:val="0"/>
-          <w:numId w:val="41"/>
+          <w:numId w:val="42"/>
         </w:numPr>
       </w:pPr>
+      <w:r>
+        <w:t xml:space="preserve">Na aba </w:t>
+      </w:r>
       <w:r>
         <w:rPr>
           <w:b/>
           <w:bCs/>
         </w:rPr>
-        <w:t>Domínios institucionais</w:t>
-      </w:r>
-      <w:r>
-        <w:t>:</w:t>
-      </w:r>
-    </w:p>
-    <w:p>
-      <w:pPr>
-        <w:numPr>
-          <w:ilvl w:val="1"/>
-          <w:numId w:val="41"/>
-        </w:numPr>
-      </w:pPr>
-      <w:r>
-        <w:t>Alunos → @aluno.cps.sp.gov.br</w:t>
-      </w:r>
-    </w:p>
-    <w:p>
-      <w:pPr>
-        <w:numPr>
-          <w:ilvl w:val="1"/>
-          <w:numId w:val="41"/>
-        </w:numPr>
-      </w:pPr>
-      <w:r>
-        <w:t>Professores e colaboradores → @cps.sp.gov.br</w:t>
+        <w:t>Sufixos UPN</w:t>
+      </w:r>
+      <w:r>
+        <w:t>, adicione os domínios aluno.cps.sp.gov.br e cps.sp.gov.br.</w:t>
       </w:r>
     </w:p>
     <w:p>
       <w:pPr>
         <w:numPr>
           <w:ilvl w:val="0"/>
-          <w:numId w:val="41"/>
+          <w:numId w:val="42"/>
+        </w:numPr>
+      </w:pPr>
+      <w:r>
+        <w:t>Ao aplicar, esses domínios já aparecerão como opção de logon na criação de novos usuários.</w:t>
+      </w:r>
+    </w:p>
+    <w:p>
+      <w:pPr>
+        <w:ind w:left="0" w:firstLine="0"/>
+      </w:pPr>
+      <w:r>
+        <w:t xml:space="preserve">As contas de usuário deverão seguir este padrão de criação: </w:t>
+      </w:r>
+    </w:p>
+    <w:p>
+      <w:pPr>
+        <w:numPr>
+          <w:ilvl w:val="0"/>
+          <w:numId w:val="43"/>
         </w:numPr>
       </w:pPr>
       <w:r>
@@ -13011,17 +13008,17 @@
           <w:b/>
           <w:bCs/>
         </w:rPr>
-        <w:t>Identificador único</w:t>
-      </w:r>
-      <w:r>
-        <w:t>: cada login será exclusivo, evitando duplicidade de contas.</w:t>
+        <w:t>UPN (Logon Principal):</w:t>
+      </w:r>
+      <w:r>
+        <w:t xml:space="preserve"> nome.sobrenome@aluno.cps.sp.gov.br para alunos, e nome.sobrenome@cps.sp.gov.br para professores e equipe administrativa. </w:t>
       </w:r>
     </w:p>
     <w:p>
       <w:pPr>
         <w:numPr>
           <w:ilvl w:val="0"/>
-          <w:numId w:val="41"/>
+          <w:numId w:val="43"/>
         </w:numPr>
       </w:pPr>
       <w:r>
@@ -13029,17 +13026,23 @@
           <w:b/>
           <w:bCs/>
         </w:rPr>
-        <w:t>Compatibilidade técnica</w:t>
-      </w:r>
-      <w:r>
-        <w:t>: sem acentos, espaços ou caracteres especiais, garantindo integração com o Active Directory e sistemas acadêmicos.</w:t>
+        <w:t>sAMAccountName:</w:t>
+      </w:r>
+      <w:r>
+        <w:t xml:space="preserve"> Apenas nome.sobrenome</w:t>
+      </w:r>
+      <w:r>
+        <w:t xml:space="preserve"> adicional númérico caso seja repetido.</w:t>
+      </w:r>
+      <w:r>
+        <w:t xml:space="preserve"> </w:t>
       </w:r>
     </w:p>
     <w:p>
       <w:pPr>
         <w:numPr>
           <w:ilvl w:val="0"/>
-          <w:numId w:val="41"/>
+          <w:numId w:val="43"/>
         </w:numPr>
       </w:pPr>
       <w:r>
@@ -13047,17 +13050,17 @@
           <w:b/>
           <w:bCs/>
         </w:rPr>
-        <w:t>Política de aplicação</w:t>
-      </w:r>
-      <w:r>
-        <w:t>: todos os usuários cadastrados no domínio adm.fatecbarueri.local deverão seguir obrigatoriamente esta convenção; alterações ou exceções deverão ser registradas e aprovadas pela equipe de TI.</w:t>
+        <w:t>Formatação Obrigatória:</w:t>
+      </w:r>
+      <w:r>
+        <w:t xml:space="preserve"> Uso exclusivo de letras minúsculas, sem acentuação, sem caracteres especiais e sem preposições (como de, da, do). </w:t>
       </w:r>
     </w:p>
     <w:p>
       <w:pPr>
         <w:numPr>
           <w:ilvl w:val="0"/>
-          <w:numId w:val="41"/>
+          <w:numId w:val="43"/>
         </w:numPr>
       </w:pPr>
       <w:r>
@@ -13065,38 +13068,39 @@
           <w:b/>
           <w:bCs/>
         </w:rPr>
-        <w:t>Gestão e auditoria</w:t>
-      </w:r>
-      <w:r>
-        <w:t>: auditorias periódicas serão realizadas para assegurar conformidade e manter a integridade da infraestrutura.</w:t>
-      </w:r>
-    </w:p>
-    <w:p/>
-    <w:p/>
-    <w:p/>
-    <w:p/>
-    <w:p/>
-    <w:p/>
-    <w:p/>
-    <w:p/>
-    <w:p/>
-    <w:p/>
-    <w:p/>
-    <w:p/>
-    <w:p/>
-    <w:p/>
-    <w:p/>
-    <w:p/>
-    <w:p/>
+        <w:t>Tratamento de Homônimos:</w:t>
+      </w:r>
+      <w:r>
+        <w:t xml:space="preserve"> Se o login já existir, o desempate é feito adicionando a inicial do nome do meio, usando o segundo sobrenome ou um número sequencial.</w:t>
+      </w:r>
+    </w:p>
+    <w:p/>
+    <w:p/>
+    <w:p/>
+    <w:p/>
+    <w:p/>
+    <w:p/>
+    <w:p/>
+    <w:p/>
+    <w:p/>
+    <w:p/>
+    <w:p/>
+    <w:p/>
+    <w:p>
+      <w:pPr>
+        <w:ind w:left="0" w:firstLine="0"/>
+      </w:pPr>
+    </w:p>
     <w:p>
       <w:pPr>
         <w:pStyle w:val="Heading1"/>
         <w:numPr>
           <w:ilvl w:val="0"/>
-          <w:numId w:val="38"/>
+          <w:numId w:val="44"/>
         </w:numPr>
       </w:pPr>
       <w:r>
+        <w:lastRenderedPageBreak/>
         <w:t xml:space="preserve"> </w:t>
       </w:r>
       <w:r>
@@ -13205,6 +13209,883 @@
         <w:t xml:space="preserve"> deverão seguir obrigatoriamente esta convenção. Alterações em nomes já existentes deverão ser registradas e aprovadas pela equipe de TI, e auditorias periódicas serão realizadas para assegurar a conformidade.</w:t>
       </w:r>
     </w:p>
+    <w:p/>
+    <w:p/>
+    <w:p/>
+    <w:p/>
+    <w:p/>
+    <w:p/>
+    <w:p/>
+    <w:p/>
+    <w:p/>
+    <w:p/>
+    <w:p/>
+    <w:p/>
+    <w:p/>
+    <w:p/>
+    <w:p>
+      <w:pPr>
+        <w:pStyle w:val="Heading1"/>
+        <w:numPr>
+          <w:ilvl w:val="0"/>
+          <w:numId w:val="44"/>
+        </w:numPr>
+      </w:pPr>
+      <w:r>
+        <w:lastRenderedPageBreak/>
+        <w:t>Padrão de Nomenclatura e Gestão de Grupos</w:t>
+      </w:r>
+    </w:p>
+    <w:p>
+      <w:r>
+        <w:t xml:space="preserve">Para assegurar o controle rigoroso de acessos e o alinhamento com a arquitetura de Unidades Organizacionais (OUs), a criação de grupos no Active Directory (AD) da Fatec Barueri seguirá uma estrutura padronizada baseada em prefixos funcionais. </w:t>
+      </w:r>
+    </w:p>
+    <w:p>
+      <w:r>
+        <w:rPr>
+          <w:b/>
+          <w:bCs/>
+        </w:rPr>
+        <w:t>1. Estrutura e Prefixos de Identificação</w:t>
+      </w:r>
+      <w:r>
+        <w:t xml:space="preserve"> Os grupos serão divididos e nomeados conforme o seu escopo de atuação: </w:t>
+      </w:r>
+    </w:p>
+    <w:p>
+      <w:pPr>
+        <w:numPr>
+          <w:ilvl w:val="0"/>
+          <w:numId w:val="45"/>
+        </w:numPr>
+      </w:pPr>
+      <w:r>
+        <w:rPr>
+          <w:b/>
+          <w:bCs/>
+        </w:rPr>
+        <w:t>Grupos Globais (Organização de Usuários):</w:t>
+      </w:r>
+      <w:r>
+        <w:t xml:space="preserve"> Utilizam obrigatoriamente o prefixo GRP_. </w:t>
+      </w:r>
+    </w:p>
+    <w:p>
+      <w:pPr>
+        <w:numPr>
+          <w:ilvl w:val="1"/>
+          <w:numId w:val="45"/>
+        </w:numPr>
+      </w:pPr>
+      <w:r>
+        <w:rPr>
+          <w:b/>
+          <w:bCs/>
+        </w:rPr>
+        <w:t>Ambiente Acadêmico:</w:t>
+      </w:r>
+      <w:r>
+        <w:t xml:space="preserve"> Seguem a estrutura GRP_[CURSO/PERFIL]. Exemplos: GRP_Alunos, GRP_Professores. </w:t>
+      </w:r>
+    </w:p>
+    <w:p>
+      <w:pPr>
+        <w:numPr>
+          <w:ilvl w:val="1"/>
+          <w:numId w:val="45"/>
+        </w:numPr>
+      </w:pPr>
+      <w:r>
+        <w:rPr>
+          <w:b/>
+          <w:bCs/>
+        </w:rPr>
+        <w:t>Ambiente Administrativo:</w:t>
+      </w:r>
+      <w:r>
+        <w:t xml:space="preserve"> Seguem a estrutura GRP_[SETOR]. Exemplos: GRP_Secretaria, GRP_TI, GRP_Diretoria. </w:t>
+      </w:r>
+    </w:p>
+    <w:p>
+      <w:pPr>
+        <w:numPr>
+          <w:ilvl w:val="0"/>
+          <w:numId w:val="45"/>
+        </w:numPr>
+      </w:pPr>
+      <w:r>
+        <w:rPr>
+          <w:b/>
+          <w:bCs/>
+        </w:rPr>
+        <w:t>Grupos Locais de Domínio (Acesso a Recursos):</w:t>
+      </w:r>
+      <w:r>
+        <w:t xml:space="preserve"> Utilizados exclusivamente para gerenciar permissões de ativos de rede (como impressoras, já que não haverá servidor de arquivos local). Adotam o prefixo DL_ e a estrutura DL_[RECURSO]_[PERMISSAO]. Exemplo: DL_IMPRESSORA_LAB01_PRINT. </w:t>
+      </w:r>
+    </w:p>
+    <w:p>
+      <w:r>
+        <w:rPr>
+          <w:b/>
+          <w:bCs/>
+        </w:rPr>
+        <w:t>2. Regras de Formatação Obrigatória</w:t>
+      </w:r>
+      <w:r>
+        <w:t xml:space="preserve"> Para evitar falhas de integração e leitura de scripts, a nomenclatura dos grupos obedecerá a regras rígidas de higienização de dados: </w:t>
+      </w:r>
+    </w:p>
+    <w:p>
+      <w:pPr>
+        <w:numPr>
+          <w:ilvl w:val="0"/>
+          <w:numId w:val="46"/>
+        </w:numPr>
+      </w:pPr>
+      <w:r>
+        <w:t xml:space="preserve">Uso exclusivo de letras e números sem acentuação. </w:t>
+      </w:r>
+    </w:p>
+    <w:p>
+      <w:pPr>
+        <w:numPr>
+          <w:ilvl w:val="0"/>
+          <w:numId w:val="46"/>
+        </w:numPr>
+      </w:pPr>
+      <w:r>
+        <w:t xml:space="preserve">É estritamente proibido o uso de espaços ou caracteres especiais. </w:t>
+      </w:r>
+    </w:p>
+    <w:p>
+      <w:pPr>
+        <w:numPr>
+          <w:ilvl w:val="0"/>
+          <w:numId w:val="46"/>
+        </w:numPr>
+      </w:pPr>
+      <w:r>
+        <w:t xml:space="preserve">O caractere </w:t>
+      </w:r>
+      <w:r>
+        <w:rPr>
+          <w:i/>
+          <w:iCs/>
+        </w:rPr>
+        <w:t>underscore</w:t>
+      </w:r>
+      <w:r>
+        <w:t xml:space="preserve"> (_) deve ser utilizado como o único separador padrão de palavras. </w:t>
+      </w:r>
+    </w:p>
+    <w:p/>
+    <w:p/>
+    <w:p/>
+    <w:p/>
+    <w:p/>
+    <w:p/>
+    <w:p/>
+    <w:p/>
+    <w:p/>
+    <w:p/>
+    <w:p/>
+    <w:p/>
+    <w:p>
+      <w:pPr>
+        <w:pStyle w:val="Heading1"/>
+        <w:numPr>
+          <w:ilvl w:val="0"/>
+          <w:numId w:val="44"/>
+        </w:numPr>
+      </w:pPr>
+      <w:r>
+        <w:lastRenderedPageBreak/>
+        <w:t xml:space="preserve"> </w:t>
+      </w:r>
+      <w:r>
+        <w:t>Padronizar Convenção de Contas de Serviço</w:t>
+      </w:r>
+    </w:p>
+    <w:p/>
+    <w:p>
+      <w:pPr>
+        <w:pStyle w:val="Heading2"/>
+        <w:numPr>
+          <w:ilvl w:val="1"/>
+          <w:numId w:val="44"/>
+        </w:numPr>
+      </w:pPr>
+      <w:r>
+        <w:t>Definição de Contas de Serviço (Texto Corrido)</w:t>
+      </w:r>
+      <w:r>
+        <w:t xml:space="preserve"> </w:t>
+      </w:r>
+    </w:p>
+    <w:p>
+      <w:r>
+        <w:t xml:space="preserve">As contas de serviço são credenciais exclusivas para sistemas, scripts de automação e aplicações, substituindo o uso de contas de utilizadores humanos. A sua principal finalidade é garantir a execução ininterrupta de processos em segundo plano (como backups e criação de utilizadores em massa), isolando os privilégios e facilitando a auditoria de segurança no Active Directory. </w:t>
+      </w:r>
+    </w:p>
+    <w:p>
+      <w:pPr>
+        <w:pStyle w:val="ListParagraph"/>
+        <w:keepNext/>
+        <w:keepLines/>
+        <w:numPr>
+          <w:ilvl w:val="0"/>
+          <w:numId w:val="50"/>
+        </w:numPr>
+        <w:spacing w:after="154" w:line="265" w:lineRule="auto"/>
+        <w:ind w:right="865"/>
+        <w:contextualSpacing w:val="0"/>
+        <w:outlineLvl w:val="1"/>
+        <w:rPr>
+          <w:rStyle w:val="Heading2Char"/>
+          <w:vanish/>
+        </w:rPr>
+      </w:pPr>
+    </w:p>
+    <w:p>
+      <w:pPr>
+        <w:pStyle w:val="ListParagraph"/>
+        <w:keepNext/>
+        <w:keepLines/>
+        <w:numPr>
+          <w:ilvl w:val="0"/>
+          <w:numId w:val="50"/>
+        </w:numPr>
+        <w:spacing w:after="154" w:line="265" w:lineRule="auto"/>
+        <w:ind w:right="865"/>
+        <w:contextualSpacing w:val="0"/>
+        <w:outlineLvl w:val="1"/>
+        <w:rPr>
+          <w:rStyle w:val="Heading2Char"/>
+          <w:vanish/>
+        </w:rPr>
+      </w:pPr>
+    </w:p>
+    <w:p>
+      <w:pPr>
+        <w:pStyle w:val="ListParagraph"/>
+        <w:keepNext/>
+        <w:keepLines/>
+        <w:numPr>
+          <w:ilvl w:val="0"/>
+          <w:numId w:val="50"/>
+        </w:numPr>
+        <w:spacing w:after="154" w:line="265" w:lineRule="auto"/>
+        <w:ind w:right="865"/>
+        <w:contextualSpacing w:val="0"/>
+        <w:outlineLvl w:val="1"/>
+        <w:rPr>
+          <w:rStyle w:val="Heading2Char"/>
+          <w:vanish/>
+        </w:rPr>
+      </w:pPr>
+    </w:p>
+    <w:p>
+      <w:pPr>
+        <w:pStyle w:val="ListParagraph"/>
+        <w:keepNext/>
+        <w:keepLines/>
+        <w:numPr>
+          <w:ilvl w:val="1"/>
+          <w:numId w:val="50"/>
+        </w:numPr>
+        <w:spacing w:after="154" w:line="265" w:lineRule="auto"/>
+        <w:ind w:right="865"/>
+        <w:contextualSpacing w:val="0"/>
+        <w:outlineLvl w:val="1"/>
+        <w:rPr>
+          <w:rStyle w:val="Heading2Char"/>
+          <w:vanish/>
+        </w:rPr>
+      </w:pPr>
+    </w:p>
+    <w:p>
+      <w:pPr>
+        <w:pStyle w:val="Heading2"/>
+        <w:numPr>
+          <w:ilvl w:val="1"/>
+          <w:numId w:val="50"/>
+        </w:numPr>
+        <w:rPr>
+          <w:rStyle w:val="Heading2Char"/>
+          <w:b/>
+        </w:rPr>
+      </w:pPr>
+      <w:r>
+        <w:rPr>
+          <w:rStyle w:val="Heading2Char"/>
+          <w:b/>
+        </w:rPr>
+        <w:t>Comparativo de Políticas</w:t>
+      </w:r>
+    </w:p>
+    <w:p>
+      <w:pPr>
+        <w:ind w:left="360" w:firstLine="0"/>
+      </w:pPr>
+      <w:r>
+        <w:t xml:space="preserve"> Para garantir a segurança e a estabilidade da infraestrutura, as contas de serviço operam sob diretivas (GPOs) distintas das contas de utilizadores comuns, conforme demonstrado na tabela abaixo: </w:t>
+      </w:r>
+    </w:p>
+    <w:tbl>
+      <w:tblPr>
+        <w:tblW w:w="0" w:type="auto"/>
+        <w:tblCellSpacing w:w="15" w:type="dxa"/>
+        <w:tblCellMar>
+          <w:top w:w="15" w:type="dxa"/>
+          <w:left w:w="15" w:type="dxa"/>
+          <w:bottom w:w="15" w:type="dxa"/>
+          <w:right w:w="15" w:type="dxa"/>
+        </w:tblCellMar>
+        <w:tblLook w:val="04A0" w:firstRow="1" w:lastRow="0" w:firstColumn="1" w:lastColumn="0" w:noHBand="0" w:noVBand="1"/>
+      </w:tblPr>
+      <w:tblGrid>
+        <w:gridCol w:w="2351"/>
+        <w:gridCol w:w="2557"/>
+        <w:gridCol w:w="3646"/>
+      </w:tblGrid>
+      <w:tr>
+        <w:trPr>
+          <w:tblHeader/>
+          <w:tblCellSpacing w:w="15" w:type="dxa"/>
+        </w:trPr>
+        <w:tc>
+          <w:tcPr>
+            <w:tcW w:w="0" w:type="auto"/>
+            <w:tcBorders>
+              <w:top w:val="single" w:sz="6" w:space="0" w:color="C4C7C5"/>
+              <w:left w:val="single" w:sz="6" w:space="0" w:color="C4C7C5"/>
+              <w:bottom w:val="single" w:sz="6" w:space="0" w:color="C4C7C5"/>
+              <w:right w:val="single" w:sz="6" w:space="0" w:color="C4C7C5"/>
+            </w:tcBorders>
+            <w:tcMar>
+              <w:top w:w="120" w:type="dxa"/>
+              <w:left w:w="180" w:type="dxa"/>
+              <w:bottom w:w="120" w:type="dxa"/>
+              <w:right w:w="180" w:type="dxa"/>
+            </w:tcMar>
+            <w:vAlign w:val="center"/>
+            <w:hideMark/>
+          </w:tcPr>
+          <w:p>
+            <w:r>
+              <w:rPr>
+                <w:b/>
+                <w:bCs/>
+              </w:rPr>
+              <w:t>Característica Técnica</w:t>
+            </w:r>
+          </w:p>
+        </w:tc>
+        <w:tc>
+          <w:tcPr>
+            <w:tcW w:w="0" w:type="auto"/>
+            <w:tcBorders>
+              <w:top w:val="single" w:sz="6" w:space="0" w:color="C4C7C5"/>
+              <w:left w:val="single" w:sz="6" w:space="0" w:color="C4C7C5"/>
+              <w:bottom w:val="single" w:sz="6" w:space="0" w:color="C4C7C5"/>
+              <w:right w:val="single" w:sz="6" w:space="0" w:color="C4C7C5"/>
+            </w:tcBorders>
+            <w:tcMar>
+              <w:top w:w="120" w:type="dxa"/>
+              <w:left w:w="180" w:type="dxa"/>
+              <w:bottom w:w="120" w:type="dxa"/>
+              <w:right w:w="180" w:type="dxa"/>
+            </w:tcMar>
+            <w:vAlign w:val="center"/>
+            <w:hideMark/>
+          </w:tcPr>
+          <w:p>
+            <w:r>
+              <w:rPr>
+                <w:b/>
+                <w:bCs/>
+              </w:rPr>
+              <w:t>Conta de Utilizador (Humano)</w:t>
+            </w:r>
+          </w:p>
+        </w:tc>
+        <w:tc>
+          <w:tcPr>
+            <w:tcW w:w="0" w:type="auto"/>
+            <w:tcBorders>
+              <w:top w:val="single" w:sz="6" w:space="0" w:color="C4C7C5"/>
+              <w:left w:val="single" w:sz="6" w:space="0" w:color="C4C7C5"/>
+              <w:bottom w:val="single" w:sz="6" w:space="0" w:color="C4C7C5"/>
+              <w:right w:val="single" w:sz="6" w:space="0" w:color="C4C7C5"/>
+            </w:tcBorders>
+            <w:tcMar>
+              <w:top w:w="120" w:type="dxa"/>
+              <w:left w:w="180" w:type="dxa"/>
+              <w:bottom w:w="120" w:type="dxa"/>
+              <w:right w:w="180" w:type="dxa"/>
+            </w:tcMar>
+            <w:vAlign w:val="center"/>
+            <w:hideMark/>
+          </w:tcPr>
+          <w:p>
+            <w:r>
+              <w:rPr>
+                <w:b/>
+                <w:bCs/>
+              </w:rPr>
+              <w:t>Conta de Serviço (Aplicação)</w:t>
+            </w:r>
+          </w:p>
+        </w:tc>
+      </w:tr>
+      <w:tr>
+        <w:trPr>
+          <w:tblCellSpacing w:w="15" w:type="dxa"/>
+        </w:trPr>
+        <w:tc>
+          <w:tcPr>
+            <w:tcW w:w="0" w:type="auto"/>
+            <w:tcBorders>
+              <w:top w:val="single" w:sz="6" w:space="0" w:color="C4C7C5"/>
+              <w:left w:val="single" w:sz="6" w:space="0" w:color="C4C7C5"/>
+              <w:bottom w:val="single" w:sz="6" w:space="0" w:color="C4C7C5"/>
+              <w:right w:val="single" w:sz="6" w:space="0" w:color="C4C7C5"/>
+            </w:tcBorders>
+            <w:tcMar>
+              <w:top w:w="120" w:type="dxa"/>
+              <w:left w:w="180" w:type="dxa"/>
+              <w:bottom w:w="120" w:type="dxa"/>
+              <w:right w:w="180" w:type="dxa"/>
+            </w:tcMar>
+            <w:vAlign w:val="center"/>
+            <w:hideMark/>
+          </w:tcPr>
+          <w:p>
+            <w:r>
+              <w:rPr>
+                <w:b/>
+                <w:bCs/>
+              </w:rPr>
+              <w:t>Padrão de Nomenclatura</w:t>
+            </w:r>
+          </w:p>
+        </w:tc>
+        <w:tc>
+          <w:tcPr>
+            <w:tcW w:w="0" w:type="auto"/>
+            <w:tcBorders>
+              <w:top w:val="single" w:sz="6" w:space="0" w:color="C4C7C5"/>
+              <w:left w:val="single" w:sz="6" w:space="0" w:color="C4C7C5"/>
+              <w:bottom w:val="single" w:sz="6" w:space="0" w:color="C4C7C5"/>
+              <w:right w:val="single" w:sz="6" w:space="0" w:color="C4C7C5"/>
+            </w:tcBorders>
+            <w:tcMar>
+              <w:top w:w="120" w:type="dxa"/>
+              <w:left w:w="180" w:type="dxa"/>
+              <w:bottom w:w="120" w:type="dxa"/>
+              <w:right w:w="180" w:type="dxa"/>
+            </w:tcMar>
+            <w:vAlign w:val="center"/>
+            <w:hideMark/>
+          </w:tcPr>
+          <w:p>
+            <w:r>
+              <w:t>nome.sobrenome</w:t>
+            </w:r>
+          </w:p>
+        </w:tc>
+        <w:tc>
+          <w:tcPr>
+            <w:tcW w:w="0" w:type="auto"/>
+            <w:tcBorders>
+              <w:top w:val="single" w:sz="6" w:space="0" w:color="C4C7C5"/>
+              <w:left w:val="single" w:sz="6" w:space="0" w:color="C4C7C5"/>
+              <w:bottom w:val="single" w:sz="6" w:space="0" w:color="C4C7C5"/>
+              <w:right w:val="single" w:sz="6" w:space="0" w:color="C4C7C5"/>
+            </w:tcBorders>
+            <w:tcMar>
+              <w:top w:w="120" w:type="dxa"/>
+              <w:left w:w="180" w:type="dxa"/>
+              <w:bottom w:w="120" w:type="dxa"/>
+              <w:right w:w="180" w:type="dxa"/>
+            </w:tcMar>
+            <w:vAlign w:val="center"/>
+            <w:hideMark/>
+          </w:tcPr>
+          <w:p>
+            <w:r>
+              <w:t>SVC_[NomeDaAplicação]</w:t>
+            </w:r>
+          </w:p>
+        </w:tc>
+      </w:tr>
+      <w:tr>
+        <w:trPr>
+          <w:tblCellSpacing w:w="15" w:type="dxa"/>
+        </w:trPr>
+        <w:tc>
+          <w:tcPr>
+            <w:tcW w:w="0" w:type="auto"/>
+            <w:tcBorders>
+              <w:top w:val="single" w:sz="6" w:space="0" w:color="C4C7C5"/>
+              <w:left w:val="single" w:sz="6" w:space="0" w:color="C4C7C5"/>
+              <w:bottom w:val="single" w:sz="6" w:space="0" w:color="C4C7C5"/>
+              <w:right w:val="single" w:sz="6" w:space="0" w:color="C4C7C5"/>
+            </w:tcBorders>
+            <w:tcMar>
+              <w:top w:w="120" w:type="dxa"/>
+              <w:left w:w="180" w:type="dxa"/>
+              <w:bottom w:w="120" w:type="dxa"/>
+              <w:right w:w="180" w:type="dxa"/>
+            </w:tcMar>
+            <w:vAlign w:val="center"/>
+            <w:hideMark/>
+          </w:tcPr>
+          <w:p>
+            <w:r>
+              <w:rPr>
+                <w:b/>
+                <w:bCs/>
+              </w:rPr>
+              <w:t>Início de Sessão Interativo</w:t>
+            </w:r>
+          </w:p>
+        </w:tc>
+        <w:tc>
+          <w:tcPr>
+            <w:tcW w:w="0" w:type="auto"/>
+            <w:tcBorders>
+              <w:top w:val="single" w:sz="6" w:space="0" w:color="C4C7C5"/>
+              <w:left w:val="single" w:sz="6" w:space="0" w:color="C4C7C5"/>
+              <w:bottom w:val="single" w:sz="6" w:space="0" w:color="C4C7C5"/>
+              <w:right w:val="single" w:sz="6" w:space="0" w:color="C4C7C5"/>
+            </w:tcBorders>
+            <w:tcMar>
+              <w:top w:w="120" w:type="dxa"/>
+              <w:left w:w="180" w:type="dxa"/>
+              <w:bottom w:w="120" w:type="dxa"/>
+              <w:right w:w="180" w:type="dxa"/>
+            </w:tcMar>
+            <w:vAlign w:val="center"/>
+            <w:hideMark/>
+          </w:tcPr>
+          <w:p>
+            <w:r>
+              <w:t xml:space="preserve">Permitido (Acesso </w:t>
+            </w:r>
+            <w:r>
+              <w:t>a Tela</w:t>
+            </w:r>
+            <w:r>
+              <w:t>/RDP)</w:t>
+            </w:r>
+          </w:p>
+        </w:tc>
+        <w:tc>
+          <w:tcPr>
+            <w:tcW w:w="0" w:type="auto"/>
+            <w:tcBorders>
+              <w:top w:val="single" w:sz="6" w:space="0" w:color="C4C7C5"/>
+              <w:left w:val="single" w:sz="6" w:space="0" w:color="C4C7C5"/>
+              <w:bottom w:val="single" w:sz="6" w:space="0" w:color="C4C7C5"/>
+              <w:right w:val="single" w:sz="6" w:space="0" w:color="C4C7C5"/>
+            </w:tcBorders>
+            <w:tcMar>
+              <w:top w:w="120" w:type="dxa"/>
+              <w:left w:w="180" w:type="dxa"/>
+              <w:bottom w:w="120" w:type="dxa"/>
+              <w:right w:w="180" w:type="dxa"/>
+            </w:tcMar>
+            <w:vAlign w:val="center"/>
+            <w:hideMark/>
+          </w:tcPr>
+          <w:p>
+            <w:r>
+              <w:rPr>
+                <w:b/>
+                <w:bCs/>
+              </w:rPr>
+              <w:t>Bloqueado</w:t>
+            </w:r>
+            <w:r>
+              <w:t xml:space="preserve"> (Apenas Logon as a Service) </w:t>
+            </w:r>
+          </w:p>
+        </w:tc>
+      </w:tr>
+      <w:tr>
+        <w:trPr>
+          <w:tblCellSpacing w:w="15" w:type="dxa"/>
+        </w:trPr>
+        <w:tc>
+          <w:tcPr>
+            <w:tcW w:w="0" w:type="auto"/>
+            <w:tcBorders>
+              <w:top w:val="single" w:sz="6" w:space="0" w:color="C4C7C5"/>
+              <w:left w:val="single" w:sz="6" w:space="0" w:color="C4C7C5"/>
+              <w:bottom w:val="single" w:sz="6" w:space="0" w:color="C4C7C5"/>
+              <w:right w:val="single" w:sz="6" w:space="0" w:color="C4C7C5"/>
+            </w:tcBorders>
+            <w:tcMar>
+              <w:top w:w="120" w:type="dxa"/>
+              <w:left w:w="180" w:type="dxa"/>
+              <w:bottom w:w="120" w:type="dxa"/>
+              <w:right w:w="180" w:type="dxa"/>
+            </w:tcMar>
+            <w:vAlign w:val="center"/>
+            <w:hideMark/>
+          </w:tcPr>
+          <w:p>
+            <w:r>
+              <w:rPr>
+                <w:b/>
+                <w:bCs/>
+              </w:rPr>
+              <w:t>Expiração da Palavra-passe</w:t>
+            </w:r>
+          </w:p>
+        </w:tc>
+        <w:tc>
+          <w:tcPr>
+            <w:tcW w:w="0" w:type="auto"/>
+            <w:tcBorders>
+              <w:top w:val="single" w:sz="6" w:space="0" w:color="C4C7C5"/>
+              <w:left w:val="single" w:sz="6" w:space="0" w:color="C4C7C5"/>
+              <w:bottom w:val="single" w:sz="6" w:space="0" w:color="C4C7C5"/>
+              <w:right w:val="single" w:sz="6" w:space="0" w:color="C4C7C5"/>
+            </w:tcBorders>
+            <w:tcMar>
+              <w:top w:w="120" w:type="dxa"/>
+              <w:left w:w="180" w:type="dxa"/>
+              <w:bottom w:w="120" w:type="dxa"/>
+              <w:right w:w="180" w:type="dxa"/>
+            </w:tcMar>
+            <w:vAlign w:val="center"/>
+            <w:hideMark/>
+          </w:tcPr>
+          <w:p>
+            <w:r>
+              <w:t>Expira a cada 90 dias</w:t>
+            </w:r>
+          </w:p>
+        </w:tc>
+        <w:tc>
+          <w:tcPr>
+            <w:tcW w:w="0" w:type="auto"/>
+            <w:tcBorders>
+              <w:top w:val="single" w:sz="6" w:space="0" w:color="C4C7C5"/>
+              <w:left w:val="single" w:sz="6" w:space="0" w:color="C4C7C5"/>
+              <w:bottom w:val="single" w:sz="6" w:space="0" w:color="C4C7C5"/>
+              <w:right w:val="single" w:sz="6" w:space="0" w:color="C4C7C5"/>
+            </w:tcBorders>
+            <w:tcMar>
+              <w:top w:w="120" w:type="dxa"/>
+              <w:left w:w="180" w:type="dxa"/>
+              <w:bottom w:w="120" w:type="dxa"/>
+              <w:right w:w="180" w:type="dxa"/>
+            </w:tcMar>
+            <w:vAlign w:val="center"/>
+            <w:hideMark/>
+          </w:tcPr>
+          <w:p>
+            <w:r>
+              <w:rPr>
+                <w:b/>
+                <w:bCs/>
+              </w:rPr>
+              <w:t>Nunca expira</w:t>
+            </w:r>
+            <w:r>
+              <w:t xml:space="preserve"> (evita paragem de sistemas) </w:t>
+            </w:r>
+          </w:p>
+        </w:tc>
+      </w:tr>
+      <w:tr>
+        <w:trPr>
+          <w:tblCellSpacing w:w="15" w:type="dxa"/>
+        </w:trPr>
+        <w:tc>
+          <w:tcPr>
+            <w:tcW w:w="0" w:type="auto"/>
+            <w:tcBorders>
+              <w:top w:val="single" w:sz="6" w:space="0" w:color="C4C7C5"/>
+              <w:left w:val="single" w:sz="6" w:space="0" w:color="C4C7C5"/>
+              <w:bottom w:val="single" w:sz="6" w:space="0" w:color="C4C7C5"/>
+              <w:right w:val="single" w:sz="6" w:space="0" w:color="C4C7C5"/>
+            </w:tcBorders>
+            <w:tcMar>
+              <w:top w:w="120" w:type="dxa"/>
+              <w:left w:w="180" w:type="dxa"/>
+              <w:bottom w:w="120" w:type="dxa"/>
+              <w:right w:w="180" w:type="dxa"/>
+            </w:tcMar>
+            <w:vAlign w:val="center"/>
+            <w:hideMark/>
+          </w:tcPr>
+          <w:p>
+            <w:r>
+              <w:rPr>
+                <w:b/>
+                <w:bCs/>
+              </w:rPr>
+              <w:t>Complexidade Exigida</w:t>
+            </w:r>
+          </w:p>
+        </w:tc>
+        <w:tc>
+          <w:tcPr>
+            <w:tcW w:w="0" w:type="auto"/>
+            <w:tcBorders>
+              <w:top w:val="single" w:sz="6" w:space="0" w:color="C4C7C5"/>
+              <w:left w:val="single" w:sz="6" w:space="0" w:color="C4C7C5"/>
+              <w:bottom w:val="single" w:sz="6" w:space="0" w:color="C4C7C5"/>
+              <w:right w:val="single" w:sz="6" w:space="0" w:color="C4C7C5"/>
+            </w:tcBorders>
+            <w:tcMar>
+              <w:top w:w="120" w:type="dxa"/>
+              <w:left w:w="180" w:type="dxa"/>
+              <w:bottom w:w="120" w:type="dxa"/>
+              <w:right w:w="180" w:type="dxa"/>
+            </w:tcMar>
+            <w:vAlign w:val="center"/>
+            <w:hideMark/>
+          </w:tcPr>
+          <w:p>
+            <w:r>
+              <w:t>Mínimo 8 caracteres</w:t>
+            </w:r>
+          </w:p>
+        </w:tc>
+        <w:tc>
+          <w:tcPr>
+            <w:tcW w:w="0" w:type="auto"/>
+            <w:tcBorders>
+              <w:top w:val="single" w:sz="6" w:space="0" w:color="C4C7C5"/>
+              <w:left w:val="single" w:sz="6" w:space="0" w:color="C4C7C5"/>
+              <w:bottom w:val="single" w:sz="6" w:space="0" w:color="C4C7C5"/>
+              <w:right w:val="single" w:sz="6" w:space="0" w:color="C4C7C5"/>
+            </w:tcBorders>
+            <w:tcMar>
+              <w:top w:w="120" w:type="dxa"/>
+              <w:left w:w="180" w:type="dxa"/>
+              <w:bottom w:w="120" w:type="dxa"/>
+              <w:right w:w="180" w:type="dxa"/>
+            </w:tcMar>
+            <w:vAlign w:val="center"/>
+            <w:hideMark/>
+          </w:tcPr>
+          <w:p>
+            <w:r>
+              <w:t xml:space="preserve">Mínimo </w:t>
+            </w:r>
+            <w:r>
+              <w:rPr>
+                <w:b/>
+                <w:bCs/>
+              </w:rPr>
+              <w:t>16 caracteres</w:t>
+            </w:r>
+            <w:r>
+              <w:t xml:space="preserve"> gerados aleatoriamente </w:t>
+            </w:r>
+          </w:p>
+        </w:tc>
+      </w:tr>
+      <w:tr>
+        <w:trPr>
+          <w:tblCellSpacing w:w="15" w:type="dxa"/>
+        </w:trPr>
+        <w:tc>
+          <w:tcPr>
+            <w:tcW w:w="0" w:type="auto"/>
+            <w:tcBorders>
+              <w:top w:val="single" w:sz="6" w:space="0" w:color="C4C7C5"/>
+              <w:left w:val="single" w:sz="6" w:space="0" w:color="C4C7C5"/>
+              <w:bottom w:val="single" w:sz="6" w:space="0" w:color="C4C7C5"/>
+              <w:right w:val="single" w:sz="6" w:space="0" w:color="C4C7C5"/>
+            </w:tcBorders>
+            <w:tcMar>
+              <w:top w:w="120" w:type="dxa"/>
+              <w:left w:w="180" w:type="dxa"/>
+              <w:bottom w:w="120" w:type="dxa"/>
+              <w:right w:w="180" w:type="dxa"/>
+            </w:tcMar>
+            <w:vAlign w:val="center"/>
+            <w:hideMark/>
+          </w:tcPr>
+          <w:p>
+            <w:r>
+              <w:rPr>
+                <w:b/>
+                <w:bCs/>
+              </w:rPr>
+              <w:t>Nível de Privilégio</w:t>
+            </w:r>
+          </w:p>
+        </w:tc>
+        <w:tc>
+          <w:tcPr>
+            <w:tcW w:w="0" w:type="auto"/>
+            <w:tcBorders>
+              <w:top w:val="single" w:sz="6" w:space="0" w:color="C4C7C5"/>
+              <w:left w:val="single" w:sz="6" w:space="0" w:color="C4C7C5"/>
+              <w:bottom w:val="single" w:sz="6" w:space="0" w:color="C4C7C5"/>
+              <w:right w:val="single" w:sz="6" w:space="0" w:color="C4C7C5"/>
+            </w:tcBorders>
+            <w:tcMar>
+              <w:top w:w="120" w:type="dxa"/>
+              <w:left w:w="180" w:type="dxa"/>
+              <w:bottom w:w="120" w:type="dxa"/>
+              <w:right w:w="180" w:type="dxa"/>
+            </w:tcMar>
+            <w:vAlign w:val="center"/>
+            <w:hideMark/>
+          </w:tcPr>
+          <w:p>
+            <w:r>
+              <w:t xml:space="preserve">Baseado na função do </w:t>
+            </w:r>
+            <w:r>
+              <w:t>usuário</w:t>
+            </w:r>
+          </w:p>
+        </w:tc>
+        <w:tc>
+          <w:tcPr>
+            <w:tcW w:w="0" w:type="auto"/>
+            <w:tcBorders>
+              <w:top w:val="single" w:sz="6" w:space="0" w:color="C4C7C5"/>
+              <w:left w:val="single" w:sz="6" w:space="0" w:color="C4C7C5"/>
+              <w:bottom w:val="single" w:sz="6" w:space="0" w:color="C4C7C5"/>
+              <w:right w:val="single" w:sz="6" w:space="0" w:color="C4C7C5"/>
+            </w:tcBorders>
+            <w:tcMar>
+              <w:top w:w="120" w:type="dxa"/>
+              <w:left w:w="180" w:type="dxa"/>
+              <w:bottom w:w="120" w:type="dxa"/>
+              <w:right w:w="180" w:type="dxa"/>
+            </w:tcMar>
+            <w:vAlign w:val="center"/>
+            <w:hideMark/>
+          </w:tcPr>
+          <w:p>
+            <w:r>
+              <w:rPr>
+                <w:b/>
+                <w:bCs/>
+              </w:rPr>
+              <w:t>Menor Privilégio</w:t>
+            </w:r>
+            <w:r>
+              <w:t xml:space="preserve"> (Restrito apenas ao necessário) </w:t>
+            </w:r>
+          </w:p>
+        </w:tc>
+      </w:tr>
+    </w:tbl>
     <w:p/>
     <w:sectPr>
       <w:headerReference w:type="even" r:id="rId25"/>
@@ -13403,6 +14284,213 @@
 <file path=word/numbering.xml><?xml version="1.0" encoding="utf-8"?>
 <w:numbering xmlns:wpc="http://schemas.microsoft.com/office/word/2010/wordprocessingCanvas" xmlns:cx="http://schemas.microsoft.com/office/drawing/2014/chartex" xmlns:cx1="http://schemas.microsoft.com/office/drawing/2015/9/8/chartex" xmlns:cx2="http://schemas.microsoft.com/office/drawing/2015/10/21/chartex" xmlns:cx3="http://schemas.microsoft.com/office/drawing/2016/5/9/chartex" xmlns:cx4="http://schemas.microsoft.com/office/drawing/2016/5/10/chartex" xmlns:cx5="http://schemas.microsoft.com/office/drawing/2016/5/11/chartex" xmlns:cx6="http://schemas.microsoft.com/office/drawing/2016/5/12/chartex" xmlns:cx7="http://schemas.microsoft.com/office/drawing/2016/5/13/chartex" xmlns:cx8="http://schemas.microsoft.com/office/drawing/2016/5/14/chartex" xmlns:mc="http://schemas.openxmlformats.org/markup-compatibility/2006" xmlns:aink="http://schemas.microsoft.com/office/drawing/2016/ink" xmlns:am3d="http://schemas.microsoft.com/office/drawing/2017/model3d" xmlns:o="urn:schemas-microsoft-com:office:office" xmlns:oel="http://schemas.microsoft.com/office/2019/extlst" xmlns:r="http://schemas.openxmlformats.org/officeDocument/2006/relationships" xmlns:m="http://schemas.openxmlformats.org/officeDocument/2006/math" xmlns:v="urn:schemas-microsoft-com:vml" xmlns:wp14="http://schemas.microsoft.com/office/word/2010/wordprocessingDrawing" xmlns:wp="http://schemas.openxmlformats.org/drawingml/2006/wordprocessingDrawing" xmlns:w10="urn:schemas-microsoft-com:office:word" xmlns:w="http://schemas.openxmlformats.org/wordprocessingml/2006/main" xmlns:w14="http://schemas.microsoft.com/office/word/2010/wordml" xmlns:w15="http://schemas.microsoft.com/office/word/2012/wordml" xmlns:w16cex="http://schemas.microsoft.com/office/word/2018/wordml/cex" xmlns:w16cid="http://schemas.microsoft.com/office/word/2016/wordml/cid" xmlns:w16="http://schemas.microsoft.com/office/word/2018/wordml" xmlns:w16du="http://schemas.microsoft.com/office/word/2023/wordml/word16du" xmlns:w16sdtdh="http://schemas.microsoft.com/office/word/2020/wordml/sdtdatahash" xmlns:w16sdtfl="http://schemas.microsoft.com/office/word/2024/wordml/sdtformatlock" xmlns:w16se="http://schemas.microsoft.com/office/word/2015/wordml/symex" xmlns:wpg="http://schemas.microsoft.com/office/word/2010/wordprocessingGroup" xmlns:wpi="http://schemas.microsoft.com/office/word/2010/wordprocessingInk" xmlns:wne="http://schemas.microsoft.com/office/word/2006/wordml" xmlns:wps="http://schemas.microsoft.com/office/word/2010/wordprocessingShape" mc:Ignorable="w14 w15 w16se w16cid w16 w16cex w16sdtdh w16sdtfl w16du wp14">
   <w:abstractNum w:abstractNumId="0" w15:restartNumberingAfterBreak="0">
+    <w:nsid w:val="036F73EF"/>
+    <w:multiLevelType w:val="hybridMultilevel"/>
+    <w:tmpl w:val="B7EED170"/>
+    <w:lvl w:ilvl="0" w:tplc="0416000F">
+      <w:start w:val="1"/>
+      <w:numFmt w:val="decimal"/>
+      <w:lvlText w:val="%1."/>
+      <w:lvlJc w:val="left"/>
+      <w:pPr>
+        <w:ind w:left="720" w:hanging="360"/>
+      </w:pPr>
+    </w:lvl>
+    <w:lvl w:ilvl="1" w:tplc="04160019" w:tentative="1">
+      <w:start w:val="1"/>
+      <w:numFmt w:val="lowerLetter"/>
+      <w:lvlText w:val="%2."/>
+      <w:lvlJc w:val="left"/>
+      <w:pPr>
+        <w:ind w:left="1440" w:hanging="360"/>
+      </w:pPr>
+    </w:lvl>
+    <w:lvl w:ilvl="2" w:tplc="0416001B" w:tentative="1">
+      <w:start w:val="1"/>
+      <w:numFmt w:val="lowerRoman"/>
+      <w:lvlText w:val="%3."/>
+      <w:lvlJc w:val="right"/>
+      <w:pPr>
+        <w:ind w:left="2160" w:hanging="180"/>
+      </w:pPr>
+    </w:lvl>
+    <w:lvl w:ilvl="3" w:tplc="0416000F" w:tentative="1">
+      <w:start w:val="1"/>
+      <w:numFmt w:val="decimal"/>
+      <w:lvlText w:val="%4."/>
+      <w:lvlJc w:val="left"/>
+      <w:pPr>
+        <w:ind w:left="2880" w:hanging="360"/>
+      </w:pPr>
+    </w:lvl>
+    <w:lvl w:ilvl="4" w:tplc="04160019" w:tentative="1">
+      <w:start w:val="1"/>
+      <w:numFmt w:val="lowerLetter"/>
+      <w:lvlText w:val="%5."/>
+      <w:lvlJc w:val="left"/>
+      <w:pPr>
+        <w:ind w:left="3600" w:hanging="360"/>
+      </w:pPr>
+    </w:lvl>
+    <w:lvl w:ilvl="5" w:tplc="0416001B" w:tentative="1">
+      <w:start w:val="1"/>
+      <w:numFmt w:val="lowerRoman"/>
+      <w:lvlText w:val="%6."/>
+      <w:lvlJc w:val="right"/>
+      <w:pPr>
+        <w:ind w:left="4320" w:hanging="180"/>
+      </w:pPr>
+    </w:lvl>
+    <w:lvl w:ilvl="6" w:tplc="0416000F" w:tentative="1">
+      <w:start w:val="1"/>
+      <w:numFmt w:val="decimal"/>
+      <w:lvlText w:val="%7."/>
+      <w:lvlJc w:val="left"/>
+      <w:pPr>
+        <w:ind w:left="5040" w:hanging="360"/>
+      </w:pPr>
+    </w:lvl>
+    <w:lvl w:ilvl="7" w:tplc="04160019" w:tentative="1">
+      <w:start w:val="1"/>
+      <w:numFmt w:val="lowerLetter"/>
+      <w:lvlText w:val="%8."/>
+      <w:lvlJc w:val="left"/>
+      <w:pPr>
+        <w:ind w:left="5760" w:hanging="360"/>
+      </w:pPr>
+    </w:lvl>
+    <w:lvl w:ilvl="8" w:tplc="0416001B" w:tentative="1">
+      <w:start w:val="1"/>
+      <w:numFmt w:val="lowerRoman"/>
+      <w:lvlText w:val="%9."/>
+      <w:lvlJc w:val="right"/>
+      <w:pPr>
+        <w:ind w:left="6480" w:hanging="180"/>
+      </w:pPr>
+    </w:lvl>
+  </w:abstractNum>
+  <w:abstractNum w:abstractNumId="1" w15:restartNumberingAfterBreak="0">
+    <w:nsid w:val="05CE7144"/>
+    <w:multiLevelType w:val="multilevel"/>
+    <w:tmpl w:val="7590AE62"/>
+    <w:lvl w:ilvl="0">
+      <w:start w:val="26"/>
+      <w:numFmt w:val="decimal"/>
+      <w:lvlText w:val="%1."/>
+      <w:lvlJc w:val="left"/>
+      <w:pPr>
+        <w:ind w:left="720" w:hanging="360"/>
+      </w:pPr>
+      <w:rPr>
+        <w:rFonts w:hint="default"/>
+      </w:rPr>
+    </w:lvl>
+    <w:lvl w:ilvl="1">
+      <w:start w:val="1"/>
+      <w:numFmt w:val="decimal"/>
+      <w:isLgl/>
+      <w:lvlText w:val="%1.%2."/>
+      <w:lvlJc w:val="left"/>
+      <w:pPr>
+        <w:ind w:left="1080" w:hanging="720"/>
+      </w:pPr>
+      <w:rPr>
+        <w:rFonts w:hint="default"/>
+      </w:rPr>
+    </w:lvl>
+    <w:lvl w:ilvl="2">
+      <w:start w:val="1"/>
+      <w:numFmt w:val="decimal"/>
+      <w:isLgl/>
+      <w:lvlText w:val="%1.%2.%3."/>
+      <w:lvlJc w:val="left"/>
+      <w:pPr>
+        <w:ind w:left="1080" w:hanging="720"/>
+      </w:pPr>
+      <w:rPr>
+        <w:rFonts w:hint="default"/>
+      </w:rPr>
+    </w:lvl>
+    <w:lvl w:ilvl="3">
+      <w:start w:val="1"/>
+      <w:numFmt w:val="decimal"/>
+      <w:isLgl/>
+      <w:lvlText w:val="%1.%2.%3.%4."/>
+      <w:lvlJc w:val="left"/>
+      <w:pPr>
+        <w:ind w:left="1440" w:hanging="1080"/>
+      </w:pPr>
+      <w:rPr>
+        <w:rFonts w:hint="default"/>
+      </w:rPr>
+    </w:lvl>
+    <w:lvl w:ilvl="4">
+      <w:start w:val="1"/>
+      <w:numFmt w:val="decimal"/>
+      <w:isLgl/>
+      <w:lvlText w:val="%1.%2.%3.%4.%5."/>
+      <w:lvlJc w:val="left"/>
+      <w:pPr>
+        <w:ind w:left="1440" w:hanging="1080"/>
+      </w:pPr>
+      <w:rPr>
+        <w:rFonts w:hint="default"/>
+      </w:rPr>
+    </w:lvl>
+    <w:lvl w:ilvl="5">
+      <w:start w:val="1"/>
+      <w:numFmt w:val="decimal"/>
+      <w:isLgl/>
+      <w:lvlText w:val="%1.%2.%3.%4.%5.%6."/>
+      <w:lvlJc w:val="left"/>
+      <w:pPr>
+        <w:ind w:left="1800" w:hanging="1440"/>
+      </w:pPr>
+      <w:rPr>
+        <w:rFonts w:hint="default"/>
+      </w:rPr>
+    </w:lvl>
+    <w:lvl w:ilvl="6">
+      <w:start w:val="1"/>
+      <w:numFmt w:val="decimal"/>
+      <w:isLgl/>
+      <w:lvlText w:val="%1.%2.%3.%4.%5.%6.%7."/>
+      <w:lvlJc w:val="left"/>
+      <w:pPr>
+        <w:ind w:left="1800" w:hanging="1440"/>
+      </w:pPr>
+      <w:rPr>
+        <w:rFonts w:hint="default"/>
+      </w:rPr>
+    </w:lvl>
+    <w:lvl w:ilvl="7">
+      <w:start w:val="1"/>
+      <w:numFmt w:val="decimal"/>
+      <w:isLgl/>
+      <w:lvlText w:val="%1.%2.%3.%4.%5.%6.%7.%8."/>
+      <w:lvlJc w:val="left"/>
+      <w:pPr>
+        <w:ind w:left="2160" w:hanging="1800"/>
+      </w:pPr>
+      <w:rPr>
+        <w:rFonts w:hint="default"/>
+      </w:rPr>
+    </w:lvl>
+    <w:lvl w:ilvl="8">
+      <w:start w:val="1"/>
+      <w:numFmt w:val="decimal"/>
+      <w:isLgl/>
+      <w:lvlText w:val="%1.%2.%3.%4.%5.%6.%7.%8.%9."/>
+      <w:lvlJc w:val="left"/>
+      <w:pPr>
+        <w:ind w:left="2520" w:hanging="2160"/>
+      </w:pPr>
+      <w:rPr>
+        <w:rFonts w:hint="default"/>
+      </w:rPr>
+    </w:lvl>
+  </w:abstractNum>
+  <w:abstractNum w:abstractNumId="2" w15:restartNumberingAfterBreak="0">
     <w:nsid w:val="098274EE"/>
     <w:multiLevelType w:val="multilevel"/>
     <w:tmpl w:val="33800504"/>
@@ -13551,7 +14639,7 @@
       </w:rPr>
     </w:lvl>
   </w:abstractNum>
-  <w:abstractNum w:abstractNumId="1" w15:restartNumberingAfterBreak="0">
+  <w:abstractNum w:abstractNumId="3" w15:restartNumberingAfterBreak="0">
     <w:nsid w:val="0AE47221"/>
     <w:multiLevelType w:val="multilevel"/>
     <w:tmpl w:val="787C888E"/>
@@ -13700,7 +14788,7 @@
       </w:rPr>
     </w:lvl>
   </w:abstractNum>
-  <w:abstractNum w:abstractNumId="2" w15:restartNumberingAfterBreak="0">
+  <w:abstractNum w:abstractNumId="4" w15:restartNumberingAfterBreak="0">
     <w:nsid w:val="0BB00956"/>
     <w:multiLevelType w:val="hybridMultilevel"/>
     <w:tmpl w:val="955A27CE"/>
@@ -13912,7 +15000,128 @@
       </w:rPr>
     </w:lvl>
   </w:abstractNum>
-  <w:abstractNum w:abstractNumId="3" w15:restartNumberingAfterBreak="0">
+  <w:abstractNum w:abstractNumId="5" w15:restartNumberingAfterBreak="0">
+    <w:nsid w:val="0EEF28E8"/>
+    <w:multiLevelType w:val="multilevel"/>
+    <w:tmpl w:val="7590AE62"/>
+    <w:lvl w:ilvl="0">
+      <w:start w:val="26"/>
+      <w:numFmt w:val="decimal"/>
+      <w:lvlText w:val="%1."/>
+      <w:lvlJc w:val="left"/>
+      <w:pPr>
+        <w:ind w:left="720" w:hanging="360"/>
+      </w:pPr>
+      <w:rPr>
+        <w:rFonts w:hint="default"/>
+      </w:rPr>
+    </w:lvl>
+    <w:lvl w:ilvl="1">
+      <w:start w:val="1"/>
+      <w:numFmt w:val="decimal"/>
+      <w:isLgl/>
+      <w:lvlText w:val="%1.%2."/>
+      <w:lvlJc w:val="left"/>
+      <w:pPr>
+        <w:ind w:left="1080" w:hanging="720"/>
+      </w:pPr>
+      <w:rPr>
+        <w:rFonts w:hint="default"/>
+      </w:rPr>
+    </w:lvl>
+    <w:lvl w:ilvl="2">
+      <w:start w:val="1"/>
+      <w:numFmt w:val="decimal"/>
+      <w:isLgl/>
+      <w:lvlText w:val="%1.%2.%3."/>
+      <w:lvlJc w:val="left"/>
+      <w:pPr>
+        <w:ind w:left="1080" w:hanging="720"/>
+      </w:pPr>
+      <w:rPr>
+        <w:rFonts w:hint="default"/>
+      </w:rPr>
+    </w:lvl>
+    <w:lvl w:ilvl="3">
+      <w:start w:val="1"/>
+      <w:numFmt w:val="decimal"/>
+      <w:isLgl/>
+      <w:lvlText w:val="%1.%2.%3.%4."/>
+      <w:lvlJc w:val="left"/>
+      <w:pPr>
+        <w:ind w:left="1440" w:hanging="1080"/>
+      </w:pPr>
+      <w:rPr>
+        <w:rFonts w:hint="default"/>
+      </w:rPr>
+    </w:lvl>
+    <w:lvl w:ilvl="4">
+      <w:start w:val="1"/>
+      <w:numFmt w:val="decimal"/>
+      <w:isLgl/>
+      <w:lvlText w:val="%1.%2.%3.%4.%5."/>
+      <w:lvlJc w:val="left"/>
+      <w:pPr>
+        <w:ind w:left="1440" w:hanging="1080"/>
+      </w:pPr>
+      <w:rPr>
+        <w:rFonts w:hint="default"/>
+      </w:rPr>
+    </w:lvl>
+    <w:lvl w:ilvl="5">
+      <w:start w:val="1"/>
+      <w:numFmt w:val="decimal"/>
+      <w:isLgl/>
+      <w:lvlText w:val="%1.%2.%3.%4.%5.%6."/>
+      <w:lvlJc w:val="left"/>
+      <w:pPr>
+        <w:ind w:left="1800" w:hanging="1440"/>
+      </w:pPr>
+      <w:rPr>
+        <w:rFonts w:hint="default"/>
+      </w:rPr>
+    </w:lvl>
+    <w:lvl w:ilvl="6">
+      <w:start w:val="1"/>
+      <w:numFmt w:val="decimal"/>
+      <w:isLgl/>
+      <w:lvlText w:val="%1.%2.%3.%4.%5.%6.%7."/>
+      <w:lvlJc w:val="left"/>
+      <w:pPr>
+        <w:ind w:left="1800" w:hanging="1440"/>
+      </w:pPr>
+      <w:rPr>
+        <w:rFonts w:hint="default"/>
+      </w:rPr>
+    </w:lvl>
+    <w:lvl w:ilvl="7">
+      <w:start w:val="1"/>
+      <w:numFmt w:val="decimal"/>
+      <w:isLgl/>
+      <w:lvlText w:val="%1.%2.%3.%4.%5.%6.%7.%8."/>
+      <w:lvlJc w:val="left"/>
+      <w:pPr>
+        <w:ind w:left="2160" w:hanging="1800"/>
+      </w:pPr>
+      <w:rPr>
+        <w:rFonts w:hint="default"/>
+      </w:rPr>
+    </w:lvl>
+    <w:lvl w:ilvl="8">
+      <w:start w:val="1"/>
+      <w:numFmt w:val="decimal"/>
+      <w:isLgl/>
+      <w:lvlText w:val="%1.%2.%3.%4.%5.%6.%7.%8.%9."/>
+      <w:lvlJc w:val="left"/>
+      <w:pPr>
+        <w:ind w:left="2520" w:hanging="2160"/>
+      </w:pPr>
+      <w:rPr>
+        <w:rFonts w:hint="default"/>
+      </w:rPr>
+    </w:lvl>
+  </w:abstractNum>
+  <w:abstractNum w:abstractNumId="6" w15:restartNumberingAfterBreak="0">
     <w:nsid w:val="122007AF"/>
     <w:multiLevelType w:val="multilevel"/>
     <w:tmpl w:val="F224ED2A"/>
@@ -14061,7 +15270,7 @@
       </w:rPr>
     </w:lvl>
   </w:abstractNum>
-  <w:abstractNum w:abstractNumId="4" w15:restartNumberingAfterBreak="0">
+  <w:abstractNum w:abstractNumId="7" w15:restartNumberingAfterBreak="0">
     <w:nsid w:val="13415808"/>
     <w:multiLevelType w:val="multilevel"/>
     <w:tmpl w:val="D0DC3EC2"/>
@@ -14210,7 +15419,7 @@
       </w:rPr>
     </w:lvl>
   </w:abstractNum>
-  <w:abstractNum w:abstractNumId="5" w15:restartNumberingAfterBreak="0">
+  <w:abstractNum w:abstractNumId="8" w15:restartNumberingAfterBreak="0">
     <w:nsid w:val="13E43B28"/>
     <w:multiLevelType w:val="hybridMultilevel"/>
     <w:tmpl w:val="986AC866"/>
@@ -14299,7 +15508,7 @@
       </w:pPr>
     </w:lvl>
   </w:abstractNum>
-  <w:abstractNum w:abstractNumId="6" w15:restartNumberingAfterBreak="0">
+  <w:abstractNum w:abstractNumId="9" w15:restartNumberingAfterBreak="0">
     <w:nsid w:val="14147395"/>
     <w:multiLevelType w:val="multilevel"/>
     <w:tmpl w:val="D3E8082E"/>
@@ -14448,7 +15657,7 @@
       </w:rPr>
     </w:lvl>
   </w:abstractNum>
-  <w:abstractNum w:abstractNumId="7" w15:restartNumberingAfterBreak="0">
+  <w:abstractNum w:abstractNumId="10" w15:restartNumberingAfterBreak="0">
     <w:nsid w:val="15EC3D50"/>
     <w:multiLevelType w:val="multilevel"/>
     <w:tmpl w:val="B7C46EBE"/>
@@ -14597,7 +15806,156 @@
       </w:rPr>
     </w:lvl>
   </w:abstractNum>
-  <w:abstractNum w:abstractNumId="8" w15:restartNumberingAfterBreak="0">
+  <w:abstractNum w:abstractNumId="11" w15:restartNumberingAfterBreak="0">
+    <w:nsid w:val="19865198"/>
+    <w:multiLevelType w:val="multilevel"/>
+    <w:tmpl w:val="119A7C8E"/>
+    <w:lvl w:ilvl="0">
+      <w:start w:val="1"/>
+      <w:numFmt w:val="bullet"/>
+      <w:lvlText w:val=""/>
+      <w:lvlJc w:val="left"/>
+      <w:pPr>
+        <w:tabs>
+          <w:tab w:val="num" w:pos="720"/>
+        </w:tabs>
+        <w:ind w:left="720" w:hanging="360"/>
+      </w:pPr>
+      <w:rPr>
+        <w:rFonts w:ascii="Symbol" w:hAnsi="Symbol" w:hint="default"/>
+        <w:sz w:val="20"/>
+      </w:rPr>
+    </w:lvl>
+    <w:lvl w:ilvl="1">
+      <w:start w:val="1"/>
+      <w:numFmt w:val="bullet"/>
+      <w:lvlText w:val="o"/>
+      <w:lvlJc w:val="left"/>
+      <w:pPr>
+        <w:tabs>
+          <w:tab w:val="num" w:pos="1440"/>
+        </w:tabs>
+        <w:ind w:left="1440" w:hanging="360"/>
+      </w:pPr>
+      <w:rPr>
+        <w:rFonts w:ascii="Courier New" w:hAnsi="Courier New" w:hint="default"/>
+        <w:sz w:val="20"/>
+      </w:rPr>
+    </w:lvl>
+    <w:lvl w:ilvl="2" w:tentative="1">
+      <w:start w:val="1"/>
+      <w:numFmt w:val="bullet"/>
+      <w:lvlText w:val=""/>
+      <w:lvlJc w:val="left"/>
+      <w:pPr>
+        <w:tabs>
+          <w:tab w:val="num" w:pos="2160"/>
+        </w:tabs>
+        <w:ind w:left="2160" w:hanging="360"/>
+      </w:pPr>
+      <w:rPr>
+        <w:rFonts w:ascii="Wingdings" w:hAnsi="Wingdings" w:hint="default"/>
+        <w:sz w:val="20"/>
+      </w:rPr>
+    </w:lvl>
+    <w:lvl w:ilvl="3" w:tentative="1">
+      <w:start w:val="1"/>
+      <w:numFmt w:val="bullet"/>
+      <w:lvlText w:val=""/>
+      <w:lvlJc w:val="left"/>
+      <w:pPr>
+        <w:tabs>
+          <w:tab w:val="num" w:pos="2880"/>
+        </w:tabs>
+        <w:ind w:left="2880" w:hanging="360"/>
+      </w:pPr>
+      <w:rPr>
+        <w:rFonts w:ascii="Wingdings" w:hAnsi="Wingdings" w:hint="default"/>
+        <w:sz w:val="20"/>
+      </w:rPr>
+    </w:lvl>
+    <w:lvl w:ilvl="4" w:tentative="1">
+      <w:start w:val="1"/>
+      <w:numFmt w:val="bullet"/>
+      <w:lvlText w:val=""/>
+      <w:lvlJc w:val="left"/>
+      <w:pPr>
+        <w:tabs>
+          <w:tab w:val="num" w:pos="3600"/>
+        </w:tabs>
+        <w:ind w:left="3600" w:hanging="360"/>
+      </w:pPr>
+      <w:rPr>
+        <w:rFonts w:ascii="Wingdings" w:hAnsi="Wingdings" w:hint="default"/>
+        <w:sz w:val="20"/>
+      </w:rPr>
+    </w:lvl>
+    <w:lvl w:ilvl="5" w:tentative="1">
+      <w:start w:val="1"/>
+      <w:numFmt w:val="bullet"/>
+      <w:lvlText w:val=""/>
+      <w:lvlJc w:val="left"/>
+      <w:pPr>
+        <w:tabs>
+          <w:tab w:val="num" w:pos="4320"/>
+        </w:tabs>
+        <w:ind w:left="4320" w:hanging="360"/>
+      </w:pPr>
+      <w:rPr>
+        <w:rFonts w:ascii="Wingdings" w:hAnsi="Wingdings" w:hint="default"/>
+        <w:sz w:val="20"/>
+      </w:rPr>
+    </w:lvl>
+    <w:lvl w:ilvl="6" w:tentative="1">
+      <w:start w:val="1"/>
+      <w:numFmt w:val="bullet"/>
+      <w:lvlText w:val=""/>
+      <w:lvlJc w:val="left"/>
+      <w:pPr>
+        <w:tabs>
+          <w:tab w:val="num" w:pos="5040"/>
+        </w:tabs>
+        <w:ind w:left="5040" w:hanging="360"/>
+      </w:pPr>
+      <w:rPr>
+        <w:rFonts w:ascii="Wingdings" w:hAnsi="Wingdings" w:hint="default"/>
+        <w:sz w:val="20"/>
+      </w:rPr>
+    </w:lvl>
+    <w:lvl w:ilvl="7" w:tentative="1">
+      <w:start w:val="1"/>
+      <w:numFmt w:val="bullet"/>
+      <w:lvlText w:val=""/>
+      <w:lvlJc w:val="left"/>
+      <w:pPr>
+        <w:tabs>
+          <w:tab w:val="num" w:pos="5760"/>
+        </w:tabs>
+        <w:ind w:left="5760" w:hanging="360"/>
+      </w:pPr>
+      <w:rPr>
+        <w:rFonts w:ascii="Wingdings" w:hAnsi="Wingdings" w:hint="default"/>
+        <w:sz w:val="20"/>
+      </w:rPr>
+    </w:lvl>
+    <w:lvl w:ilvl="8" w:tentative="1">
+      <w:start w:val="1"/>
+      <w:numFmt w:val="bullet"/>
+      <w:lvlText w:val=""/>
+      <w:lvlJc w:val="left"/>
+      <w:pPr>
+        <w:tabs>
+          <w:tab w:val="num" w:pos="6480"/>
+        </w:tabs>
+        <w:ind w:left="6480" w:hanging="360"/>
+      </w:pPr>
+      <w:rPr>
+        <w:rFonts w:ascii="Wingdings" w:hAnsi="Wingdings" w:hint="default"/>
+        <w:sz w:val="20"/>
+      </w:rPr>
+    </w:lvl>
+  </w:abstractNum>
+  <w:abstractNum w:abstractNumId="12" w15:restartNumberingAfterBreak="0">
     <w:nsid w:val="1B437EC9"/>
     <w:multiLevelType w:val="multilevel"/>
     <w:tmpl w:val="4F92ECD8"/>
@@ -14746,7 +16104,7 @@
       </w:rPr>
     </w:lvl>
   </w:abstractNum>
-  <w:abstractNum w:abstractNumId="9" w15:restartNumberingAfterBreak="0">
+  <w:abstractNum w:abstractNumId="13" w15:restartNumberingAfterBreak="0">
     <w:nsid w:val="1C6034AD"/>
     <w:multiLevelType w:val="multilevel"/>
     <w:tmpl w:val="1038764C"/>
@@ -14895,7 +16253,7 @@
       </w:rPr>
     </w:lvl>
   </w:abstractNum>
-  <w:abstractNum w:abstractNumId="10" w15:restartNumberingAfterBreak="0">
+  <w:abstractNum w:abstractNumId="14" w15:restartNumberingAfterBreak="0">
     <w:nsid w:val="1D9048D0"/>
     <w:multiLevelType w:val="multilevel"/>
     <w:tmpl w:val="4508A8E8"/>
@@ -15044,7 +16402,7 @@
       </w:rPr>
     </w:lvl>
   </w:abstractNum>
-  <w:abstractNum w:abstractNumId="11" w15:restartNumberingAfterBreak="0">
+  <w:abstractNum w:abstractNumId="15" w15:restartNumberingAfterBreak="0">
     <w:nsid w:val="1F4C4C4F"/>
     <w:multiLevelType w:val="multilevel"/>
     <w:tmpl w:val="66D0D7A2"/>
@@ -15193,7 +16551,156 @@
       </w:rPr>
     </w:lvl>
   </w:abstractNum>
-  <w:abstractNum w:abstractNumId="12" w15:restartNumberingAfterBreak="0">
+  <w:abstractNum w:abstractNumId="16" w15:restartNumberingAfterBreak="0">
+    <w:nsid w:val="1F9007E9"/>
+    <w:multiLevelType w:val="multilevel"/>
+    <w:tmpl w:val="67D00B12"/>
+    <w:lvl w:ilvl="0">
+      <w:start w:val="1"/>
+      <w:numFmt w:val="bullet"/>
+      <w:lvlText w:val=""/>
+      <w:lvlJc w:val="left"/>
+      <w:pPr>
+        <w:tabs>
+          <w:tab w:val="num" w:pos="720"/>
+        </w:tabs>
+        <w:ind w:left="720" w:hanging="360"/>
+      </w:pPr>
+      <w:rPr>
+        <w:rFonts w:ascii="Symbol" w:hAnsi="Symbol" w:hint="default"/>
+        <w:sz w:val="20"/>
+      </w:rPr>
+    </w:lvl>
+    <w:lvl w:ilvl="1" w:tentative="1">
+      <w:start w:val="1"/>
+      <w:numFmt w:val="bullet"/>
+      <w:lvlText w:val="o"/>
+      <w:lvlJc w:val="left"/>
+      <w:pPr>
+        <w:tabs>
+          <w:tab w:val="num" w:pos="1440"/>
+        </w:tabs>
+        <w:ind w:left="1440" w:hanging="360"/>
+      </w:pPr>
+      <w:rPr>
+        <w:rFonts w:ascii="Courier New" w:hAnsi="Courier New" w:hint="default"/>
+        <w:sz w:val="20"/>
+      </w:rPr>
+    </w:lvl>
+    <w:lvl w:ilvl="2" w:tentative="1">
+      <w:start w:val="1"/>
+      <w:numFmt w:val="bullet"/>
+      <w:lvlText w:val=""/>
+      <w:lvlJc w:val="left"/>
+      <w:pPr>
+        <w:tabs>
+          <w:tab w:val="num" w:pos="2160"/>
+        </w:tabs>
+        <w:ind w:left="2160" w:hanging="360"/>
+      </w:pPr>
+      <w:rPr>
+        <w:rFonts w:ascii="Wingdings" w:hAnsi="Wingdings" w:hint="default"/>
+        <w:sz w:val="20"/>
+      </w:rPr>
+    </w:lvl>
+    <w:lvl w:ilvl="3" w:tentative="1">
+      <w:start w:val="1"/>
+      <w:numFmt w:val="bullet"/>
+      <w:lvlText w:val=""/>
+      <w:lvlJc w:val="left"/>
+      <w:pPr>
+        <w:tabs>
+          <w:tab w:val="num" w:pos="2880"/>
+        </w:tabs>
+        <w:ind w:left="2880" w:hanging="360"/>
+      </w:pPr>
+      <w:rPr>
+        <w:rFonts w:ascii="Wingdings" w:hAnsi="Wingdings" w:hint="default"/>
+        <w:sz w:val="20"/>
+      </w:rPr>
+    </w:lvl>
+    <w:lvl w:ilvl="4" w:tentative="1">
+      <w:start w:val="1"/>
+      <w:numFmt w:val="bullet"/>
+      <w:lvlText w:val=""/>
+      <w:lvlJc w:val="left"/>
+      <w:pPr>
+        <w:tabs>
+          <w:tab w:val="num" w:pos="3600"/>
+        </w:tabs>
+        <w:ind w:left="3600" w:hanging="360"/>
+      </w:pPr>
+      <w:rPr>
+        <w:rFonts w:ascii="Wingdings" w:hAnsi="Wingdings" w:hint="default"/>
+        <w:sz w:val="20"/>
+      </w:rPr>
+    </w:lvl>
+    <w:lvl w:ilvl="5" w:tentative="1">
+      <w:start w:val="1"/>
+      <w:numFmt w:val="bullet"/>
+      <w:lvlText w:val=""/>
+      <w:lvlJc w:val="left"/>
+      <w:pPr>
+        <w:tabs>
+          <w:tab w:val="num" w:pos="4320"/>
+        </w:tabs>
+        <w:ind w:left="4320" w:hanging="360"/>
+      </w:pPr>
+      <w:rPr>
+        <w:rFonts w:ascii="Wingdings" w:hAnsi="Wingdings" w:hint="default"/>
+        <w:sz w:val="20"/>
+      </w:rPr>
+    </w:lvl>
+    <w:lvl w:ilvl="6" w:tentative="1">
+      <w:start w:val="1"/>
+      <w:numFmt w:val="bullet"/>
+      <w:lvlText w:val=""/>
+      <w:lvlJc w:val="left"/>
+      <w:pPr>
+        <w:tabs>
+          <w:tab w:val="num" w:pos="5040"/>
+        </w:tabs>
+        <w:ind w:left="5040" w:hanging="360"/>
+      </w:pPr>
+      <w:rPr>
+        <w:rFonts w:ascii="Wingdings" w:hAnsi="Wingdings" w:hint="default"/>
+        <w:sz w:val="20"/>
+      </w:rPr>
+    </w:lvl>
+    <w:lvl w:ilvl="7" w:tentative="1">
+      <w:start w:val="1"/>
+      <w:numFmt w:val="bullet"/>
+      <w:lvlText w:val=""/>
+      <w:lvlJc w:val="left"/>
+      <w:pPr>
+        <w:tabs>
+          <w:tab w:val="num" w:pos="5760"/>
+        </w:tabs>
+        <w:ind w:left="5760" w:hanging="360"/>
+      </w:pPr>
+      <w:rPr>
+        <w:rFonts w:ascii="Wingdings" w:hAnsi="Wingdings" w:hint="default"/>
+        <w:sz w:val="20"/>
+      </w:rPr>
+    </w:lvl>
+    <w:lvl w:ilvl="8" w:tentative="1">
+      <w:start w:val="1"/>
+      <w:numFmt w:val="bullet"/>
+      <w:lvlText w:val=""/>
+      <w:lvlJc w:val="left"/>
+      <w:pPr>
+        <w:tabs>
+          <w:tab w:val="num" w:pos="6480"/>
+        </w:tabs>
+        <w:ind w:left="6480" w:hanging="360"/>
+      </w:pPr>
+      <w:rPr>
+        <w:rFonts w:ascii="Wingdings" w:hAnsi="Wingdings" w:hint="default"/>
+        <w:sz w:val="20"/>
+      </w:rPr>
+    </w:lvl>
+  </w:abstractNum>
+  <w:abstractNum w:abstractNumId="17" w15:restartNumberingAfterBreak="0">
     <w:nsid w:val="219C0A15"/>
     <w:multiLevelType w:val="multilevel"/>
     <w:tmpl w:val="06CACB72"/>
@@ -15342,7 +16849,96 @@
       </w:rPr>
     </w:lvl>
   </w:abstractNum>
-  <w:abstractNum w:abstractNumId="13" w15:restartNumberingAfterBreak="0">
+  <w:abstractNum w:abstractNumId="18" w15:restartNumberingAfterBreak="0">
+    <w:nsid w:val="2C3B7C5C"/>
+    <w:multiLevelType w:val="hybridMultilevel"/>
+    <w:tmpl w:val="85B63218"/>
+    <w:lvl w:ilvl="0" w:tplc="43322FA6">
+      <w:start w:val="1"/>
+      <w:numFmt w:val="decimal"/>
+      <w:lvlText w:val="%1."/>
+      <w:lvlJc w:val="left"/>
+      <w:pPr>
+        <w:ind w:left="720" w:hanging="360"/>
+      </w:pPr>
+      <w:rPr>
+        <w:rFonts w:hint="default"/>
+      </w:rPr>
+    </w:lvl>
+    <w:lvl w:ilvl="1" w:tplc="04160019" w:tentative="1">
+      <w:start w:val="1"/>
+      <w:numFmt w:val="lowerLetter"/>
+      <w:lvlText w:val="%2."/>
+      <w:lvlJc w:val="left"/>
+      <w:pPr>
+        <w:ind w:left="1440" w:hanging="360"/>
+      </w:pPr>
+    </w:lvl>
+    <w:lvl w:ilvl="2" w:tplc="0416001B" w:tentative="1">
+      <w:start w:val="1"/>
+      <w:numFmt w:val="lowerRoman"/>
+      <w:lvlText w:val="%3."/>
+      <w:lvlJc w:val="right"/>
+      <w:pPr>
+        <w:ind w:left="2160" w:hanging="180"/>
+      </w:pPr>
+    </w:lvl>
+    <w:lvl w:ilvl="3" w:tplc="0416000F" w:tentative="1">
+      <w:start w:val="1"/>
+      <w:numFmt w:val="decimal"/>
+      <w:lvlText w:val="%4."/>
+      <w:lvlJc w:val="left"/>
+      <w:pPr>
+        <w:ind w:left="2880" w:hanging="360"/>
+      </w:pPr>
+    </w:lvl>
+    <w:lvl w:ilvl="4" w:tplc="04160019" w:tentative="1">
+      <w:start w:val="1"/>
+      <w:numFmt w:val="lowerLetter"/>
+      <w:lvlText w:val="%5."/>
+      <w:lvlJc w:val="left"/>
+      <w:pPr>
+        <w:ind w:left="3600" w:hanging="360"/>
+      </w:pPr>
+    </w:lvl>
+    <w:lvl w:ilvl="5" w:tplc="0416001B" w:tentative="1">
+      <w:start w:val="1"/>
+      <w:numFmt w:val="lowerRoman"/>
+      <w:lvlText w:val="%6."/>
+      <w:lvlJc w:val="right"/>
+      <w:pPr>
+        <w:ind w:left="4320" w:hanging="180"/>
+      </w:pPr>
+    </w:lvl>
+    <w:lvl w:ilvl="6" w:tplc="0416000F" w:tentative="1">
+      <w:start w:val="1"/>
+      <w:numFmt w:val="decimal"/>
+      <w:lvlText w:val="%7."/>
+      <w:lvlJc w:val="left"/>
+      <w:pPr>
+        <w:ind w:left="5040" w:hanging="360"/>
+      </w:pPr>
+    </w:lvl>
+    <w:lvl w:ilvl="7" w:tplc="04160019" w:tentative="1">
+      <w:start w:val="1"/>
+      <w:numFmt w:val="lowerLetter"/>
+      <w:lvlText w:val="%8."/>
+      <w:lvlJc w:val="left"/>
+      <w:pPr>
+        <w:ind w:left="5760" w:hanging="360"/>
+      </w:pPr>
+    </w:lvl>
+    <w:lvl w:ilvl="8" w:tplc="0416001B" w:tentative="1">
+      <w:start w:val="1"/>
+      <w:numFmt w:val="lowerRoman"/>
+      <w:lvlText w:val="%9."/>
+      <w:lvlJc w:val="right"/>
+      <w:pPr>
+        <w:ind w:left="6480" w:hanging="180"/>
+      </w:pPr>
+    </w:lvl>
+  </w:abstractNum>
+  <w:abstractNum w:abstractNumId="19" w15:restartNumberingAfterBreak="0">
     <w:nsid w:val="309926B3"/>
     <w:multiLevelType w:val="multilevel"/>
     <w:tmpl w:val="A3266A4E"/>
@@ -15491,7 +17087,7 @@
       </w:rPr>
     </w:lvl>
   </w:abstractNum>
-  <w:abstractNum w:abstractNumId="14" w15:restartNumberingAfterBreak="0">
+  <w:abstractNum w:abstractNumId="20" w15:restartNumberingAfterBreak="0">
     <w:nsid w:val="31C458A5"/>
     <w:multiLevelType w:val="multilevel"/>
     <w:tmpl w:val="E9C85524"/>
@@ -15640,7 +17236,7 @@
       </w:rPr>
     </w:lvl>
   </w:abstractNum>
-  <w:abstractNum w:abstractNumId="15" w15:restartNumberingAfterBreak="0">
+  <w:abstractNum w:abstractNumId="21" w15:restartNumberingAfterBreak="0">
     <w:nsid w:val="33CF381A"/>
     <w:multiLevelType w:val="hybridMultilevel"/>
     <w:tmpl w:val="F2CE88EA"/>
@@ -15729,7 +17325,7 @@
       </w:pPr>
     </w:lvl>
   </w:abstractNum>
-  <w:abstractNum w:abstractNumId="16" w15:restartNumberingAfterBreak="0">
+  <w:abstractNum w:abstractNumId="22" w15:restartNumberingAfterBreak="0">
     <w:nsid w:val="342069D5"/>
     <w:multiLevelType w:val="multilevel"/>
     <w:tmpl w:val="DF32FAF0"/>
@@ -15878,7 +17474,7 @@
       </w:rPr>
     </w:lvl>
   </w:abstractNum>
-  <w:abstractNum w:abstractNumId="17" w15:restartNumberingAfterBreak="0">
+  <w:abstractNum w:abstractNumId="23" w15:restartNumberingAfterBreak="0">
     <w:nsid w:val="367D0CB5"/>
     <w:multiLevelType w:val="multilevel"/>
     <w:tmpl w:val="7A2A210E"/>
@@ -16027,7 +17623,7 @@
       </w:rPr>
     </w:lvl>
   </w:abstractNum>
-  <w:abstractNum w:abstractNumId="18" w15:restartNumberingAfterBreak="0">
+  <w:abstractNum w:abstractNumId="24" w15:restartNumberingAfterBreak="0">
     <w:nsid w:val="36A630E9"/>
     <w:multiLevelType w:val="multilevel"/>
     <w:tmpl w:val="3342ED5A"/>
@@ -16176,7 +17772,7 @@
       </w:rPr>
     </w:lvl>
   </w:abstractNum>
-  <w:abstractNum w:abstractNumId="19" w15:restartNumberingAfterBreak="0">
+  <w:abstractNum w:abstractNumId="25" w15:restartNumberingAfterBreak="0">
     <w:nsid w:val="38DD254B"/>
     <w:multiLevelType w:val="multilevel"/>
     <w:tmpl w:val="EF866D5A"/>
@@ -16325,7 +17921,7 @@
       </w:rPr>
     </w:lvl>
   </w:abstractNum>
-  <w:abstractNum w:abstractNumId="20" w15:restartNumberingAfterBreak="0">
+  <w:abstractNum w:abstractNumId="26" w15:restartNumberingAfterBreak="0">
     <w:nsid w:val="394F50C9"/>
     <w:multiLevelType w:val="multilevel"/>
     <w:tmpl w:val="FB0E0374"/>
@@ -16474,7 +18070,7 @@
       </w:rPr>
     </w:lvl>
   </w:abstractNum>
-  <w:abstractNum w:abstractNumId="21" w15:restartNumberingAfterBreak="0">
+  <w:abstractNum w:abstractNumId="27" w15:restartNumberingAfterBreak="0">
     <w:nsid w:val="39814AE3"/>
     <w:multiLevelType w:val="multilevel"/>
     <w:tmpl w:val="4A6802CA"/>
@@ -16623,7 +18219,7 @@
       </w:rPr>
     </w:lvl>
   </w:abstractNum>
-  <w:abstractNum w:abstractNumId="22" w15:restartNumberingAfterBreak="0">
+  <w:abstractNum w:abstractNumId="28" w15:restartNumberingAfterBreak="0">
     <w:nsid w:val="3C334103"/>
     <w:multiLevelType w:val="multilevel"/>
     <w:tmpl w:val="871CA32E"/>
@@ -16772,7 +18368,128 @@
       </w:rPr>
     </w:lvl>
   </w:abstractNum>
-  <w:abstractNum w:abstractNumId="23" w15:restartNumberingAfterBreak="0">
+  <w:abstractNum w:abstractNumId="29" w15:restartNumberingAfterBreak="0">
+    <w:nsid w:val="3E3C53CA"/>
+    <w:multiLevelType w:val="multilevel"/>
+    <w:tmpl w:val="7590AE62"/>
+    <w:lvl w:ilvl="0">
+      <w:start w:val="26"/>
+      <w:numFmt w:val="decimal"/>
+      <w:lvlText w:val="%1."/>
+      <w:lvlJc w:val="left"/>
+      <w:pPr>
+        <w:ind w:left="720" w:hanging="360"/>
+      </w:pPr>
+      <w:rPr>
+        <w:rFonts w:hint="default"/>
+      </w:rPr>
+    </w:lvl>
+    <w:lvl w:ilvl="1">
+      <w:start w:val="1"/>
+      <w:numFmt w:val="decimal"/>
+      <w:isLgl/>
+      <w:lvlText w:val="%1.%2."/>
+      <w:lvlJc w:val="left"/>
+      <w:pPr>
+        <w:ind w:left="1080" w:hanging="720"/>
+      </w:pPr>
+      <w:rPr>
+        <w:rFonts w:hint="default"/>
+      </w:rPr>
+    </w:lvl>
+    <w:lvl w:ilvl="2">
+      <w:start w:val="1"/>
+      <w:numFmt w:val="decimal"/>
+      <w:isLgl/>
+      <w:lvlText w:val="%1.%2.%3."/>
+      <w:lvlJc w:val="left"/>
+      <w:pPr>
+        <w:ind w:left="1080" w:hanging="720"/>
+      </w:pPr>
+      <w:rPr>
+        <w:rFonts w:hint="default"/>
+      </w:rPr>
+    </w:lvl>
+    <w:lvl w:ilvl="3">
+      <w:start w:val="1"/>
+      <w:numFmt w:val="decimal"/>
+      <w:isLgl/>
+      <w:lvlText w:val="%1.%2.%3.%4."/>
+      <w:lvlJc w:val="left"/>
+      <w:pPr>
+        <w:ind w:left="1440" w:hanging="1080"/>
+      </w:pPr>
+      <w:rPr>
+        <w:rFonts w:hint="default"/>
+      </w:rPr>
+    </w:lvl>
+    <w:lvl w:ilvl="4">
+      <w:start w:val="1"/>
+      <w:numFmt w:val="decimal"/>
+      <w:isLgl/>
+      <w:lvlText w:val="%1.%2.%3.%4.%5."/>
+      <w:lvlJc w:val="left"/>
+      <w:pPr>
+        <w:ind w:left="1440" w:hanging="1080"/>
+      </w:pPr>
+      <w:rPr>
+        <w:rFonts w:hint="default"/>
+      </w:rPr>
+    </w:lvl>
+    <w:lvl w:ilvl="5">
+      <w:start w:val="1"/>
+      <w:numFmt w:val="decimal"/>
+      <w:isLgl/>
+      <w:lvlText w:val="%1.%2.%3.%4.%5.%6."/>
+      <w:lvlJc w:val="left"/>
+      <w:pPr>
+        <w:ind w:left="1800" w:hanging="1440"/>
+      </w:pPr>
+      <w:rPr>
+        <w:rFonts w:hint="default"/>
+      </w:rPr>
+    </w:lvl>
+    <w:lvl w:ilvl="6">
+      <w:start w:val="1"/>
+      <w:numFmt w:val="decimal"/>
+      <w:isLgl/>
+      <w:lvlText w:val="%1.%2.%3.%4.%5.%6.%7."/>
+      <w:lvlJc w:val="left"/>
+      <w:pPr>
+        <w:ind w:left="1800" w:hanging="1440"/>
+      </w:pPr>
+      <w:rPr>
+        <w:rFonts w:hint="default"/>
+      </w:rPr>
+    </w:lvl>
+    <w:lvl w:ilvl="7">
+      <w:start w:val="1"/>
+      <w:numFmt w:val="decimal"/>
+      <w:isLgl/>
+      <w:lvlText w:val="%1.%2.%3.%4.%5.%6.%7.%8."/>
+      <w:lvlJc w:val="left"/>
+      <w:pPr>
+        <w:ind w:left="2160" w:hanging="1800"/>
+      </w:pPr>
+      <w:rPr>
+        <w:rFonts w:hint="default"/>
+      </w:rPr>
+    </w:lvl>
+    <w:lvl w:ilvl="8">
+      <w:start w:val="1"/>
+      <w:numFmt w:val="decimal"/>
+      <w:isLgl/>
+      <w:lvlText w:val="%1.%2.%3.%4.%5.%6.%7.%8.%9."/>
+      <w:lvlJc w:val="left"/>
+      <w:pPr>
+        <w:ind w:left="2520" w:hanging="2160"/>
+      </w:pPr>
+      <w:rPr>
+        <w:rFonts w:hint="default"/>
+      </w:rPr>
+    </w:lvl>
+  </w:abstractNum>
+  <w:abstractNum w:abstractNumId="30" w15:restartNumberingAfterBreak="0">
     <w:nsid w:val="3FA26364"/>
     <w:multiLevelType w:val="multilevel"/>
     <w:tmpl w:val="7102D8A2"/>
@@ -16921,7 +18638,7 @@
       </w:rPr>
     </w:lvl>
   </w:abstractNum>
-  <w:abstractNum w:abstractNumId="24" w15:restartNumberingAfterBreak="0">
+  <w:abstractNum w:abstractNumId="31" w15:restartNumberingAfterBreak="0">
     <w:nsid w:val="40BC1D0F"/>
     <w:multiLevelType w:val="multilevel"/>
     <w:tmpl w:val="114E3898"/>
@@ -17070,7 +18787,7 @@
       </w:rPr>
     </w:lvl>
   </w:abstractNum>
-  <w:abstractNum w:abstractNumId="25" w15:restartNumberingAfterBreak="0">
+  <w:abstractNum w:abstractNumId="32" w15:restartNumberingAfterBreak="0">
     <w:nsid w:val="41B87FFD"/>
     <w:multiLevelType w:val="multilevel"/>
     <w:tmpl w:val="D9A2C7D4"/>
@@ -17219,7 +18936,7 @@
       </w:rPr>
     </w:lvl>
   </w:abstractNum>
-  <w:abstractNum w:abstractNumId="26" w15:restartNumberingAfterBreak="0">
+  <w:abstractNum w:abstractNumId="33" w15:restartNumberingAfterBreak="0">
     <w:nsid w:val="42754AB1"/>
     <w:multiLevelType w:val="hybridMultilevel"/>
     <w:tmpl w:val="BE1A7CFE"/>
@@ -17332,7 +19049,7 @@
       </w:rPr>
     </w:lvl>
   </w:abstractNum>
-  <w:abstractNum w:abstractNumId="27" w15:restartNumberingAfterBreak="0">
+  <w:abstractNum w:abstractNumId="34" w15:restartNumberingAfterBreak="0">
     <w:nsid w:val="42F3162A"/>
     <w:multiLevelType w:val="multilevel"/>
     <w:tmpl w:val="EC3ECDD2"/>
@@ -17481,7 +19198,7 @@
       </w:rPr>
     </w:lvl>
   </w:abstractNum>
-  <w:abstractNum w:abstractNumId="28" w15:restartNumberingAfterBreak="0">
+  <w:abstractNum w:abstractNumId="35" w15:restartNumberingAfterBreak="0">
     <w:nsid w:val="43A149EC"/>
     <w:multiLevelType w:val="multilevel"/>
     <w:tmpl w:val="359E42D6"/>
@@ -17630,7 +19347,7 @@
       </w:rPr>
     </w:lvl>
   </w:abstractNum>
-  <w:abstractNum w:abstractNumId="29" w15:restartNumberingAfterBreak="0">
+  <w:abstractNum w:abstractNumId="36" w15:restartNumberingAfterBreak="0">
     <w:nsid w:val="4809326F"/>
     <w:multiLevelType w:val="hybridMultilevel"/>
     <w:tmpl w:val="EDAA36C8"/>
@@ -17842,7 +19559,7 @@
       </w:rPr>
     </w:lvl>
   </w:abstractNum>
-  <w:abstractNum w:abstractNumId="30" w15:restartNumberingAfterBreak="0">
+  <w:abstractNum w:abstractNumId="37" w15:restartNumberingAfterBreak="0">
     <w:nsid w:val="4AFB3D85"/>
     <w:multiLevelType w:val="hybridMultilevel"/>
     <w:tmpl w:val="92E4DC3C"/>
@@ -17931,7 +19648,7 @@
       </w:pPr>
     </w:lvl>
   </w:abstractNum>
-  <w:abstractNum w:abstractNumId="31" w15:restartNumberingAfterBreak="0">
+  <w:abstractNum w:abstractNumId="38" w15:restartNumberingAfterBreak="0">
     <w:nsid w:val="525B28B2"/>
     <w:multiLevelType w:val="multilevel"/>
     <w:tmpl w:val="EFF65D3E"/>
@@ -18080,7 +19797,7 @@
       </w:rPr>
     </w:lvl>
   </w:abstractNum>
-  <w:abstractNum w:abstractNumId="32" w15:restartNumberingAfterBreak="0">
+  <w:abstractNum w:abstractNumId="39" w15:restartNumberingAfterBreak="0">
     <w:nsid w:val="52FF3F80"/>
     <w:multiLevelType w:val="multilevel"/>
     <w:tmpl w:val="9E24583A"/>
@@ -18229,7 +19946,7 @@
       </w:rPr>
     </w:lvl>
   </w:abstractNum>
-  <w:abstractNum w:abstractNumId="33" w15:restartNumberingAfterBreak="0">
+  <w:abstractNum w:abstractNumId="40" w15:restartNumberingAfterBreak="0">
     <w:nsid w:val="53250A63"/>
     <w:multiLevelType w:val="multilevel"/>
     <w:tmpl w:val="6936C414"/>
@@ -18378,7 +20095,7 @@
       </w:rPr>
     </w:lvl>
   </w:abstractNum>
-  <w:abstractNum w:abstractNumId="34" w15:restartNumberingAfterBreak="0">
+  <w:abstractNum w:abstractNumId="41" w15:restartNumberingAfterBreak="0">
     <w:nsid w:val="53CF6885"/>
     <w:multiLevelType w:val="multilevel"/>
     <w:tmpl w:val="189ECE0A"/>
@@ -18527,7 +20244,7 @@
       </w:rPr>
     </w:lvl>
   </w:abstractNum>
-  <w:abstractNum w:abstractNumId="35" w15:restartNumberingAfterBreak="0">
+  <w:abstractNum w:abstractNumId="42" w15:restartNumberingAfterBreak="0">
     <w:nsid w:val="575A637C"/>
     <w:multiLevelType w:val="hybridMultilevel"/>
     <w:tmpl w:val="63146F94"/>
@@ -18613,7 +20330,7 @@
       </w:pPr>
     </w:lvl>
   </w:abstractNum>
-  <w:abstractNum w:abstractNumId="36" w15:restartNumberingAfterBreak="0">
+  <w:abstractNum w:abstractNumId="43" w15:restartNumberingAfterBreak="0">
     <w:nsid w:val="5F5F1046"/>
     <w:multiLevelType w:val="multilevel"/>
     <w:tmpl w:val="F69674B0"/>
@@ -18762,7 +20479,302 @@
       </w:rPr>
     </w:lvl>
   </w:abstractNum>
-  <w:abstractNum w:abstractNumId="37" w15:restartNumberingAfterBreak="0">
+  <w:abstractNum w:abstractNumId="44" w15:restartNumberingAfterBreak="0">
+    <w:nsid w:val="62022071"/>
+    <w:multiLevelType w:val="multilevel"/>
+    <w:tmpl w:val="ACF81030"/>
+    <w:lvl w:ilvl="0">
+      <w:start w:val="1"/>
+      <w:numFmt w:val="bullet"/>
+      <w:lvlText w:val=""/>
+      <w:lvlJc w:val="left"/>
+      <w:pPr>
+        <w:tabs>
+          <w:tab w:val="num" w:pos="720"/>
+        </w:tabs>
+        <w:ind w:left="720" w:hanging="360"/>
+      </w:pPr>
+      <w:rPr>
+        <w:rFonts w:ascii="Symbol" w:hAnsi="Symbol" w:hint="default"/>
+        <w:sz w:val="20"/>
+      </w:rPr>
+    </w:lvl>
+    <w:lvl w:ilvl="1" w:tentative="1">
+      <w:start w:val="1"/>
+      <w:numFmt w:val="bullet"/>
+      <w:lvlText w:val="o"/>
+      <w:lvlJc w:val="left"/>
+      <w:pPr>
+        <w:tabs>
+          <w:tab w:val="num" w:pos="1440"/>
+        </w:tabs>
+        <w:ind w:left="1440" w:hanging="360"/>
+      </w:pPr>
+      <w:rPr>
+        <w:rFonts w:ascii="Courier New" w:hAnsi="Courier New" w:hint="default"/>
+        <w:sz w:val="20"/>
+      </w:rPr>
+    </w:lvl>
+    <w:lvl w:ilvl="2" w:tentative="1">
+      <w:start w:val="1"/>
+      <w:numFmt w:val="bullet"/>
+      <w:lvlText w:val=""/>
+      <w:lvlJc w:val="left"/>
+      <w:pPr>
+        <w:tabs>
+          <w:tab w:val="num" w:pos="2160"/>
+        </w:tabs>
+        <w:ind w:left="2160" w:hanging="360"/>
+      </w:pPr>
+      <w:rPr>
+        <w:rFonts w:ascii="Wingdings" w:hAnsi="Wingdings" w:hint="default"/>
+        <w:sz w:val="20"/>
+      </w:rPr>
+    </w:lvl>
+    <w:lvl w:ilvl="3" w:tentative="1">
+      <w:start w:val="1"/>
+      <w:numFmt w:val="bullet"/>
+      <w:lvlText w:val=""/>
+      <w:lvlJc w:val="left"/>
+      <w:pPr>
+        <w:tabs>
+          <w:tab w:val="num" w:pos="2880"/>
+        </w:tabs>
+        <w:ind w:left="2880" w:hanging="360"/>
+      </w:pPr>
+      <w:rPr>
+        <w:rFonts w:ascii="Wingdings" w:hAnsi="Wingdings" w:hint="default"/>
+        <w:sz w:val="20"/>
+      </w:rPr>
+    </w:lvl>
+    <w:lvl w:ilvl="4" w:tentative="1">
+      <w:start w:val="1"/>
+      <w:numFmt w:val="bullet"/>
+      <w:lvlText w:val=""/>
+      <w:lvlJc w:val="left"/>
+      <w:pPr>
+        <w:tabs>
+          <w:tab w:val="num" w:pos="3600"/>
+        </w:tabs>
+        <w:ind w:left="3600" w:hanging="360"/>
+      </w:pPr>
+      <w:rPr>
+        <w:rFonts w:ascii="Wingdings" w:hAnsi="Wingdings" w:hint="default"/>
+        <w:sz w:val="20"/>
+      </w:rPr>
+    </w:lvl>
+    <w:lvl w:ilvl="5" w:tentative="1">
+      <w:start w:val="1"/>
+      <w:numFmt w:val="bullet"/>
+      <w:lvlText w:val=""/>
+      <w:lvlJc w:val="left"/>
+      <w:pPr>
+        <w:tabs>
+          <w:tab w:val="num" w:pos="4320"/>
+        </w:tabs>
+        <w:ind w:left="4320" w:hanging="360"/>
+      </w:pPr>
+      <w:rPr>
+        <w:rFonts w:ascii="Wingdings" w:hAnsi="Wingdings" w:hint="default"/>
+        <w:sz w:val="20"/>
+      </w:rPr>
+    </w:lvl>
+    <w:lvl w:ilvl="6" w:tentative="1">
+      <w:start w:val="1"/>
+      <w:numFmt w:val="bullet"/>
+      <w:lvlText w:val=""/>
+      <w:lvlJc w:val="left"/>
+      <w:pPr>
+        <w:tabs>
+          <w:tab w:val="num" w:pos="5040"/>
+        </w:tabs>
+        <w:ind w:left="5040" w:hanging="360"/>
+      </w:pPr>
+      <w:rPr>
+        <w:rFonts w:ascii="Wingdings" w:hAnsi="Wingdings" w:hint="default"/>
+        <w:sz w:val="20"/>
+      </w:rPr>
+    </w:lvl>
+    <w:lvl w:ilvl="7" w:tentative="1">
+      <w:start w:val="1"/>
+      <w:numFmt w:val="bullet"/>
+      <w:lvlText w:val=""/>
+      <w:lvlJc w:val="left"/>
+      <w:pPr>
+        <w:tabs>
+          <w:tab w:val="num" w:pos="5760"/>
+        </w:tabs>
+        <w:ind w:left="5760" w:hanging="360"/>
+      </w:pPr>
+      <w:rPr>
+        <w:rFonts w:ascii="Wingdings" w:hAnsi="Wingdings" w:hint="default"/>
+        <w:sz w:val="20"/>
+      </w:rPr>
+    </w:lvl>
+    <w:lvl w:ilvl="8" w:tentative="1">
+      <w:start w:val="1"/>
+      <w:numFmt w:val="bullet"/>
+      <w:lvlText w:val=""/>
+      <w:lvlJc w:val="left"/>
+      <w:pPr>
+        <w:tabs>
+          <w:tab w:val="num" w:pos="6480"/>
+        </w:tabs>
+        <w:ind w:left="6480" w:hanging="360"/>
+      </w:pPr>
+      <w:rPr>
+        <w:rFonts w:ascii="Wingdings" w:hAnsi="Wingdings" w:hint="default"/>
+        <w:sz w:val="20"/>
+      </w:rPr>
+    </w:lvl>
+  </w:abstractNum>
+  <w:abstractNum w:abstractNumId="45" w15:restartNumberingAfterBreak="0">
+    <w:nsid w:val="64415C3B"/>
+    <w:multiLevelType w:val="multilevel"/>
+    <w:tmpl w:val="F508B38C"/>
+    <w:lvl w:ilvl="0">
+      <w:start w:val="1"/>
+      <w:numFmt w:val="bullet"/>
+      <w:lvlText w:val=""/>
+      <w:lvlJc w:val="left"/>
+      <w:pPr>
+        <w:tabs>
+          <w:tab w:val="num" w:pos="720"/>
+        </w:tabs>
+        <w:ind w:left="720" w:hanging="360"/>
+      </w:pPr>
+      <w:rPr>
+        <w:rFonts w:ascii="Symbol" w:hAnsi="Symbol" w:hint="default"/>
+        <w:sz w:val="20"/>
+      </w:rPr>
+    </w:lvl>
+    <w:lvl w:ilvl="1">
+      <w:start w:val="1"/>
+      <w:numFmt w:val="decimal"/>
+      <w:lvlText w:val="%2."/>
+      <w:lvlJc w:val="left"/>
+      <w:pPr>
+        <w:ind w:left="1770" w:hanging="690"/>
+      </w:pPr>
+      <w:rPr>
+        <w:rFonts w:hint="default"/>
+        <w:b/>
+      </w:rPr>
+    </w:lvl>
+    <w:lvl w:ilvl="2" w:tentative="1">
+      <w:start w:val="1"/>
+      <w:numFmt w:val="bullet"/>
+      <w:lvlText w:val=""/>
+      <w:lvlJc w:val="left"/>
+      <w:pPr>
+        <w:tabs>
+          <w:tab w:val="num" w:pos="2160"/>
+        </w:tabs>
+        <w:ind w:left="2160" w:hanging="360"/>
+      </w:pPr>
+      <w:rPr>
+        <w:rFonts w:ascii="Wingdings" w:hAnsi="Wingdings" w:hint="default"/>
+        <w:sz w:val="20"/>
+      </w:rPr>
+    </w:lvl>
+    <w:lvl w:ilvl="3" w:tentative="1">
+      <w:start w:val="1"/>
+      <w:numFmt w:val="bullet"/>
+      <w:lvlText w:val=""/>
+      <w:lvlJc w:val="left"/>
+      <w:pPr>
+        <w:tabs>
+          <w:tab w:val="num" w:pos="2880"/>
+        </w:tabs>
+        <w:ind w:left="2880" w:hanging="360"/>
+      </w:pPr>
+      <w:rPr>
+        <w:rFonts w:ascii="Wingdings" w:hAnsi="Wingdings" w:hint="default"/>
+        <w:sz w:val="20"/>
+      </w:rPr>
+    </w:lvl>
+    <w:lvl w:ilvl="4" w:tentative="1">
+      <w:start w:val="1"/>
+      <w:numFmt w:val="bullet"/>
+      <w:lvlText w:val=""/>
+      <w:lvlJc w:val="left"/>
+      <w:pPr>
+        <w:tabs>
+          <w:tab w:val="num" w:pos="3600"/>
+        </w:tabs>
+        <w:ind w:left="3600" w:hanging="360"/>
+      </w:pPr>
+      <w:rPr>
+        <w:rFonts w:ascii="Wingdings" w:hAnsi="Wingdings" w:hint="default"/>
+        <w:sz w:val="20"/>
+      </w:rPr>
+    </w:lvl>
+    <w:lvl w:ilvl="5" w:tentative="1">
+      <w:start w:val="1"/>
+      <w:numFmt w:val="bullet"/>
+      <w:lvlText w:val=""/>
+      <w:lvlJc w:val="left"/>
+      <w:pPr>
+        <w:tabs>
+          <w:tab w:val="num" w:pos="4320"/>
+        </w:tabs>
+        <w:ind w:left="4320" w:hanging="360"/>
+      </w:pPr>
+      <w:rPr>
+        <w:rFonts w:ascii="Wingdings" w:hAnsi="Wingdings" w:hint="default"/>
+        <w:sz w:val="20"/>
+      </w:rPr>
+    </w:lvl>
+    <w:lvl w:ilvl="6" w:tentative="1">
+      <w:start w:val="1"/>
+      <w:numFmt w:val="bullet"/>
+      <w:lvlText w:val=""/>
+      <w:lvlJc w:val="left"/>
+      <w:pPr>
+        <w:tabs>
+          <w:tab w:val="num" w:pos="5040"/>
+        </w:tabs>
+        <w:ind w:left="5040" w:hanging="360"/>
+      </w:pPr>
+      <w:rPr>
+        <w:rFonts w:ascii="Wingdings" w:hAnsi="Wingdings" w:hint="default"/>
+        <w:sz w:val="20"/>
+      </w:rPr>
+    </w:lvl>
+    <w:lvl w:ilvl="7" w:tentative="1">
+      <w:start w:val="1"/>
+      <w:numFmt w:val="bullet"/>
+      <w:lvlText w:val=""/>
+      <w:lvlJc w:val="left"/>
+      <w:pPr>
+        <w:tabs>
+          <w:tab w:val="num" w:pos="5760"/>
+        </w:tabs>
+        <w:ind w:left="5760" w:hanging="360"/>
+      </w:pPr>
+      <w:rPr>
+        <w:rFonts w:ascii="Wingdings" w:hAnsi="Wingdings" w:hint="default"/>
+        <w:sz w:val="20"/>
+      </w:rPr>
+    </w:lvl>
+    <w:lvl w:ilvl="8" w:tentative="1">
+      <w:start w:val="1"/>
+      <w:numFmt w:val="bullet"/>
+      <w:lvlText w:val=""/>
+      <w:lvlJc w:val="left"/>
+      <w:pPr>
+        <w:tabs>
+          <w:tab w:val="num" w:pos="6480"/>
+        </w:tabs>
+        <w:ind w:left="6480" w:hanging="360"/>
+      </w:pPr>
+      <w:rPr>
+        <w:rFonts w:ascii="Wingdings" w:hAnsi="Wingdings" w:hint="default"/>
+        <w:sz w:val="20"/>
+      </w:rPr>
+    </w:lvl>
+  </w:abstractNum>
+  <w:abstractNum w:abstractNumId="46" w15:restartNumberingAfterBreak="0">
     <w:nsid w:val="6A5349C5"/>
     <w:multiLevelType w:val="multilevel"/>
     <w:tmpl w:val="9CB44C78"/>
@@ -18911,7 +20923,7 @@
       </w:rPr>
     </w:lvl>
   </w:abstractNum>
-  <w:abstractNum w:abstractNumId="38" w15:restartNumberingAfterBreak="0">
+  <w:abstractNum w:abstractNumId="47" w15:restartNumberingAfterBreak="0">
     <w:nsid w:val="6B3222D5"/>
     <w:multiLevelType w:val="multilevel"/>
     <w:tmpl w:val="F0243014"/>
@@ -19060,11 +21072,11 @@
       </w:rPr>
     </w:lvl>
   </w:abstractNum>
-  <w:abstractNum w:abstractNumId="39" w15:restartNumberingAfterBreak="0">
+  <w:abstractNum w:abstractNumId="48" w15:restartNumberingAfterBreak="0">
     <w:nsid w:val="78B34E15"/>
-    <w:multiLevelType w:val="hybridMultilevel"/>
-    <w:tmpl w:val="680860F2"/>
-    <w:lvl w:ilvl="0" w:tplc="0416000F">
+    <w:multiLevelType w:val="multilevel"/>
+    <w:tmpl w:val="5B24CAF8"/>
+    <w:lvl w:ilvl="0">
       <w:start w:val="1"/>
       <w:numFmt w:val="decimal"/>
       <w:lvlText w:val="%1."/>
@@ -19072,81 +21084,116 @@
       <w:pPr>
         <w:ind w:left="720" w:hanging="360"/>
       </w:pPr>
-    </w:lvl>
-    <w:lvl w:ilvl="1" w:tplc="04160019" w:tentative="1">
-      <w:start w:val="1"/>
-      <w:numFmt w:val="lowerLetter"/>
-      <w:lvlText w:val="%2."/>
-      <w:lvlJc w:val="left"/>
-      <w:pPr>
-        <w:ind w:left="1440" w:hanging="360"/>
-      </w:pPr>
-    </w:lvl>
-    <w:lvl w:ilvl="2" w:tplc="0416001B" w:tentative="1">
-      <w:start w:val="1"/>
-      <w:numFmt w:val="lowerRoman"/>
-      <w:lvlText w:val="%3."/>
-      <w:lvlJc w:val="right"/>
-      <w:pPr>
-        <w:ind w:left="2160" w:hanging="180"/>
-      </w:pPr>
-    </w:lvl>
-    <w:lvl w:ilvl="3" w:tplc="0416000F" w:tentative="1">
-      <w:start w:val="1"/>
+      <w:rPr>
+        <w:rFonts w:hint="default"/>
+      </w:rPr>
+    </w:lvl>
+    <w:lvl w:ilvl="1">
+      <w:start w:val="2"/>
       <w:numFmt w:val="decimal"/>
-      <w:lvlText w:val="%4."/>
-      <w:lvlJc w:val="left"/>
-      <w:pPr>
-        <w:ind w:left="2880" w:hanging="360"/>
-      </w:pPr>
-    </w:lvl>
-    <w:lvl w:ilvl="4" w:tplc="04160019" w:tentative="1">
-      <w:start w:val="1"/>
-      <w:numFmt w:val="lowerLetter"/>
-      <w:lvlText w:val="%5."/>
-      <w:lvlJc w:val="left"/>
-      <w:pPr>
-        <w:ind w:left="3600" w:hanging="360"/>
-      </w:pPr>
-    </w:lvl>
-    <w:lvl w:ilvl="5" w:tplc="0416001B" w:tentative="1">
-      <w:start w:val="1"/>
-      <w:numFmt w:val="lowerRoman"/>
-      <w:lvlText w:val="%6."/>
-      <w:lvlJc w:val="right"/>
-      <w:pPr>
-        <w:ind w:left="4320" w:hanging="180"/>
-      </w:pPr>
-    </w:lvl>
-    <w:lvl w:ilvl="6" w:tplc="0416000F" w:tentative="1">
+      <w:isLgl/>
+      <w:lvlText w:val="%1.%2."/>
+      <w:lvlJc w:val="left"/>
+      <w:pPr>
+        <w:ind w:left="1080" w:hanging="720"/>
+      </w:pPr>
+      <w:rPr>
+        <w:rFonts w:hint="default"/>
+      </w:rPr>
+    </w:lvl>
+    <w:lvl w:ilvl="2">
       <w:start w:val="1"/>
       <w:numFmt w:val="decimal"/>
-      <w:lvlText w:val="%7."/>
-      <w:lvlJc w:val="left"/>
-      <w:pPr>
-        <w:ind w:left="5040" w:hanging="360"/>
-      </w:pPr>
-    </w:lvl>
-    <w:lvl w:ilvl="7" w:tplc="04160019" w:tentative="1">
-      <w:start w:val="1"/>
-      <w:numFmt w:val="lowerLetter"/>
-      <w:lvlText w:val="%8."/>
-      <w:lvlJc w:val="left"/>
-      <w:pPr>
-        <w:ind w:left="5760" w:hanging="360"/>
-      </w:pPr>
-    </w:lvl>
-    <w:lvl w:ilvl="8" w:tplc="0416001B" w:tentative="1">
-      <w:start w:val="1"/>
-      <w:numFmt w:val="lowerRoman"/>
-      <w:lvlText w:val="%9."/>
-      <w:lvlJc w:val="right"/>
-      <w:pPr>
-        <w:ind w:left="6480" w:hanging="180"/>
-      </w:pPr>
+      <w:isLgl/>
+      <w:lvlText w:val="%1.%2.%3."/>
+      <w:lvlJc w:val="left"/>
+      <w:pPr>
+        <w:ind w:left="1080" w:hanging="720"/>
+      </w:pPr>
+      <w:rPr>
+        <w:rFonts w:hint="default"/>
+      </w:rPr>
+    </w:lvl>
+    <w:lvl w:ilvl="3">
+      <w:start w:val="1"/>
+      <w:numFmt w:val="decimal"/>
+      <w:isLgl/>
+      <w:lvlText w:val="%1.%2.%3.%4."/>
+      <w:lvlJc w:val="left"/>
+      <w:pPr>
+        <w:ind w:left="1440" w:hanging="1080"/>
+      </w:pPr>
+      <w:rPr>
+        <w:rFonts w:hint="default"/>
+      </w:rPr>
+    </w:lvl>
+    <w:lvl w:ilvl="4">
+      <w:start w:val="1"/>
+      <w:numFmt w:val="decimal"/>
+      <w:isLgl/>
+      <w:lvlText w:val="%1.%2.%3.%4.%5."/>
+      <w:lvlJc w:val="left"/>
+      <w:pPr>
+        <w:ind w:left="1440" w:hanging="1080"/>
+      </w:pPr>
+      <w:rPr>
+        <w:rFonts w:hint="default"/>
+      </w:rPr>
+    </w:lvl>
+    <w:lvl w:ilvl="5">
+      <w:start w:val="1"/>
+      <w:numFmt w:val="decimal"/>
+      <w:isLgl/>
+      <w:lvlText w:val="%1.%2.%3.%4.%5.%6."/>
+      <w:lvlJc w:val="left"/>
+      <w:pPr>
+        <w:ind w:left="1800" w:hanging="1440"/>
+      </w:pPr>
+      <w:rPr>
+        <w:rFonts w:hint="default"/>
+      </w:rPr>
+    </w:lvl>
+    <w:lvl w:ilvl="6">
+      <w:start w:val="1"/>
+      <w:numFmt w:val="decimal"/>
+      <w:isLgl/>
+      <w:lvlText w:val="%1.%2.%3.%4.%5.%6.%7."/>
+      <w:lvlJc w:val="left"/>
+      <w:pPr>
+        <w:ind w:left="1800" w:hanging="1440"/>
+      </w:pPr>
+      <w:rPr>
+        <w:rFonts w:hint="default"/>
+      </w:rPr>
+    </w:lvl>
+    <w:lvl w:ilvl="7">
+      <w:start w:val="1"/>
+      <w:numFmt w:val="decimal"/>
+      <w:isLgl/>
+      <w:lvlText w:val="%1.%2.%3.%4.%5.%6.%7.%8."/>
+      <w:lvlJc w:val="left"/>
+      <w:pPr>
+        <w:ind w:left="2160" w:hanging="1800"/>
+      </w:pPr>
+      <w:rPr>
+        <w:rFonts w:hint="default"/>
+      </w:rPr>
+    </w:lvl>
+    <w:lvl w:ilvl="8">
+      <w:start w:val="1"/>
+      <w:numFmt w:val="decimal"/>
+      <w:isLgl/>
+      <w:lvlText w:val="%1.%2.%3.%4.%5.%6.%7.%8.%9."/>
+      <w:lvlJc w:val="left"/>
+      <w:pPr>
+        <w:ind w:left="2520" w:hanging="2160"/>
+      </w:pPr>
+      <w:rPr>
+        <w:rFonts w:hint="default"/>
+      </w:rPr>
     </w:lvl>
   </w:abstractNum>
-  <w:abstractNum w:abstractNumId="40" w15:restartNumberingAfterBreak="0">
+  <w:abstractNum w:abstractNumId="49" w15:restartNumberingAfterBreak="0">
     <w:nsid w:val="7FE970DE"/>
     <w:multiLevelType w:val="multilevel"/>
     <w:tmpl w:val="7FB488BE"/>
@@ -19296,127 +21343,154 @@
     </w:lvl>
   </w:abstractNum>
   <w:num w:numId="1" w16cid:durableId="1546985641">
+    <w:abstractNumId w:val="4"/>
+  </w:num>
+  <w:num w:numId="2" w16cid:durableId="1899438238">
+    <w:abstractNumId w:val="36"/>
+  </w:num>
+  <w:num w:numId="3" w16cid:durableId="446317888">
+    <w:abstractNumId w:val="21"/>
+  </w:num>
+  <w:num w:numId="4" w16cid:durableId="316812812">
+    <w:abstractNumId w:val="37"/>
+  </w:num>
+  <w:num w:numId="5" w16cid:durableId="2107534834">
+    <w:abstractNumId w:val="47"/>
+  </w:num>
+  <w:num w:numId="6" w16cid:durableId="1770198717">
+    <w:abstractNumId w:val="19"/>
+  </w:num>
+  <w:num w:numId="7" w16cid:durableId="944921588">
+    <w:abstractNumId w:val="42"/>
+  </w:num>
+  <w:num w:numId="8" w16cid:durableId="931546427">
+    <w:abstractNumId w:val="30"/>
+  </w:num>
+  <w:num w:numId="9" w16cid:durableId="1129938157">
+    <w:abstractNumId w:val="28"/>
+  </w:num>
+  <w:num w:numId="10" w16cid:durableId="1913076791">
+    <w:abstractNumId w:val="43"/>
+  </w:num>
+  <w:num w:numId="11" w16cid:durableId="1894153078">
     <w:abstractNumId w:val="2"/>
   </w:num>
-  <w:num w:numId="2" w16cid:durableId="1899438238">
-    <w:abstractNumId w:val="29"/>
+  <w:num w:numId="12" w16cid:durableId="428240603">
+    <w:abstractNumId w:val="8"/>
   </w:num>
-  <w:num w:numId="3" w16cid:durableId="446317888">
+  <w:num w:numId="13" w16cid:durableId="977153682">
+    <w:abstractNumId w:val="35"/>
+  </w:num>
+  <w:num w:numId="14" w16cid:durableId="1574897763">
+    <w:abstractNumId w:val="40"/>
+  </w:num>
+  <w:num w:numId="15" w16cid:durableId="1029601610">
+    <w:abstractNumId w:val="49"/>
+  </w:num>
+  <w:num w:numId="16" w16cid:durableId="148786897">
+    <w:abstractNumId w:val="39"/>
+  </w:num>
+  <w:num w:numId="17" w16cid:durableId="393508652">
+    <w:abstractNumId w:val="46"/>
+  </w:num>
+  <w:num w:numId="18" w16cid:durableId="288240786">
     <w:abstractNumId w:val="15"/>
   </w:num>
-  <w:num w:numId="4" w16cid:durableId="316812812">
-    <w:abstractNumId w:val="30"/>
+  <w:num w:numId="19" w16cid:durableId="1782529171">
+    <w:abstractNumId w:val="10"/>
   </w:num>
-  <w:num w:numId="5" w16cid:durableId="2107534834">
+  <w:num w:numId="20" w16cid:durableId="283343810">
+    <w:abstractNumId w:val="6"/>
+  </w:num>
+  <w:num w:numId="21" w16cid:durableId="1810592404">
+    <w:abstractNumId w:val="12"/>
+  </w:num>
+  <w:num w:numId="22" w16cid:durableId="981497355">
+    <w:abstractNumId w:val="17"/>
+  </w:num>
+  <w:num w:numId="23" w16cid:durableId="206532692">
+    <w:abstractNumId w:val="3"/>
+  </w:num>
+  <w:num w:numId="24" w16cid:durableId="1931232350">
+    <w:abstractNumId w:val="7"/>
+  </w:num>
+  <w:num w:numId="25" w16cid:durableId="1972859419">
+    <w:abstractNumId w:val="33"/>
+  </w:num>
+  <w:num w:numId="26" w16cid:durableId="855926518">
+    <w:abstractNumId w:val="23"/>
+  </w:num>
+  <w:num w:numId="27" w16cid:durableId="1188330951">
+    <w:abstractNumId w:val="25"/>
+  </w:num>
+  <w:num w:numId="28" w16cid:durableId="1379428095">
+    <w:abstractNumId w:val="13"/>
+  </w:num>
+  <w:num w:numId="29" w16cid:durableId="1265115766">
     <w:abstractNumId w:val="38"/>
   </w:num>
-  <w:num w:numId="6" w16cid:durableId="1770198717">
-    <w:abstractNumId w:val="13"/>
+  <w:num w:numId="30" w16cid:durableId="1092510417">
+    <w:abstractNumId w:val="31"/>
   </w:num>
-  <w:num w:numId="7" w16cid:durableId="944921588">
-    <w:abstractNumId w:val="35"/>
-  </w:num>
-  <w:num w:numId="8" w16cid:durableId="931546427">
-    <w:abstractNumId w:val="23"/>
-  </w:num>
-  <w:num w:numId="9" w16cid:durableId="1129938157">
+  <w:num w:numId="31" w16cid:durableId="1117792318">
     <w:abstractNumId w:val="22"/>
   </w:num>
-  <w:num w:numId="10" w16cid:durableId="1913076791">
-    <w:abstractNumId w:val="36"/>
+  <w:num w:numId="32" w16cid:durableId="1520657276">
+    <w:abstractNumId w:val="26"/>
   </w:num>
-  <w:num w:numId="11" w16cid:durableId="1894153078">
+  <w:num w:numId="33" w16cid:durableId="746850055">
+    <w:abstractNumId w:val="24"/>
+  </w:num>
+  <w:num w:numId="34" w16cid:durableId="1371149696">
+    <w:abstractNumId w:val="32"/>
+  </w:num>
+  <w:num w:numId="35" w16cid:durableId="318844701">
+    <w:abstractNumId w:val="9"/>
+  </w:num>
+  <w:num w:numId="36" w16cid:durableId="535311878">
+    <w:abstractNumId w:val="27"/>
+  </w:num>
+  <w:num w:numId="37" w16cid:durableId="1413429655">
+    <w:abstractNumId w:val="34"/>
+  </w:num>
+  <w:num w:numId="38" w16cid:durableId="992757240">
+    <w:abstractNumId w:val="48"/>
+  </w:num>
+  <w:num w:numId="39" w16cid:durableId="909971478">
+    <w:abstractNumId w:val="14"/>
+  </w:num>
+  <w:num w:numId="40" w16cid:durableId="27068207">
+    <w:abstractNumId w:val="41"/>
+  </w:num>
+  <w:num w:numId="41" w16cid:durableId="1692340260">
+    <w:abstractNumId w:val="20"/>
+  </w:num>
+  <w:num w:numId="42" w16cid:durableId="1067193222">
+    <w:abstractNumId w:val="44"/>
+  </w:num>
+  <w:num w:numId="43" w16cid:durableId="173571889">
+    <w:abstractNumId w:val="16"/>
+  </w:num>
+  <w:num w:numId="44" w16cid:durableId="228226055">
+    <w:abstractNumId w:val="5"/>
+  </w:num>
+  <w:num w:numId="45" w16cid:durableId="2059015177">
+    <w:abstractNumId w:val="11"/>
+  </w:num>
+  <w:num w:numId="46" w16cid:durableId="1726175823">
+    <w:abstractNumId w:val="45"/>
+  </w:num>
+  <w:num w:numId="47" w16cid:durableId="1881477727">
     <w:abstractNumId w:val="0"/>
   </w:num>
-  <w:num w:numId="12" w16cid:durableId="428240603">
-    <w:abstractNumId w:val="5"/>
+  <w:num w:numId="48" w16cid:durableId="423696396">
+    <w:abstractNumId w:val="18"/>
   </w:num>
-  <w:num w:numId="13" w16cid:durableId="977153682">
-    <w:abstractNumId w:val="28"/>
-  </w:num>
-  <w:num w:numId="14" w16cid:durableId="1574897763">
-    <w:abstractNumId w:val="33"/>
-  </w:num>
-  <w:num w:numId="15" w16cid:durableId="1029601610">
-    <w:abstractNumId w:val="40"/>
-  </w:num>
-  <w:num w:numId="16" w16cid:durableId="148786897">
-    <w:abstractNumId w:val="32"/>
-  </w:num>
-  <w:num w:numId="17" w16cid:durableId="393508652">
-    <w:abstractNumId w:val="37"/>
-  </w:num>
-  <w:num w:numId="18" w16cid:durableId="288240786">
-    <w:abstractNumId w:val="11"/>
-  </w:num>
-  <w:num w:numId="19" w16cid:durableId="1782529171">
-    <w:abstractNumId w:val="7"/>
-  </w:num>
-  <w:num w:numId="20" w16cid:durableId="283343810">
-    <w:abstractNumId w:val="3"/>
-  </w:num>
-  <w:num w:numId="21" w16cid:durableId="1810592404">
-    <w:abstractNumId w:val="8"/>
-  </w:num>
-  <w:num w:numId="22" w16cid:durableId="981497355">
-    <w:abstractNumId w:val="12"/>
-  </w:num>
-  <w:num w:numId="23" w16cid:durableId="206532692">
+  <w:num w:numId="49" w16cid:durableId="971835345">
     <w:abstractNumId w:val="1"/>
   </w:num>
-  <w:num w:numId="24" w16cid:durableId="1931232350">
-    <w:abstractNumId w:val="4"/>
-  </w:num>
-  <w:num w:numId="25" w16cid:durableId="1972859419">
-    <w:abstractNumId w:val="26"/>
-  </w:num>
-  <w:num w:numId="26" w16cid:durableId="855926518">
-    <w:abstractNumId w:val="17"/>
-  </w:num>
-  <w:num w:numId="27" w16cid:durableId="1188330951">
-    <w:abstractNumId w:val="19"/>
-  </w:num>
-  <w:num w:numId="28" w16cid:durableId="1379428095">
-    <w:abstractNumId w:val="9"/>
-  </w:num>
-  <w:num w:numId="29" w16cid:durableId="1265115766">
-    <w:abstractNumId w:val="31"/>
-  </w:num>
-  <w:num w:numId="30" w16cid:durableId="1092510417">
-    <w:abstractNumId w:val="24"/>
-  </w:num>
-  <w:num w:numId="31" w16cid:durableId="1117792318">
-    <w:abstractNumId w:val="16"/>
-  </w:num>
-  <w:num w:numId="32" w16cid:durableId="1520657276">
-    <w:abstractNumId w:val="20"/>
-  </w:num>
-  <w:num w:numId="33" w16cid:durableId="746850055">
-    <w:abstractNumId w:val="18"/>
-  </w:num>
-  <w:num w:numId="34" w16cid:durableId="1371149696">
-    <w:abstractNumId w:val="25"/>
-  </w:num>
-  <w:num w:numId="35" w16cid:durableId="318844701">
-    <w:abstractNumId w:val="6"/>
-  </w:num>
-  <w:num w:numId="36" w16cid:durableId="535311878">
-    <w:abstractNumId w:val="21"/>
-  </w:num>
-  <w:num w:numId="37" w16cid:durableId="1413429655">
-    <w:abstractNumId w:val="27"/>
-  </w:num>
-  <w:num w:numId="38" w16cid:durableId="992757240">
-    <w:abstractNumId w:val="39"/>
-  </w:num>
-  <w:num w:numId="39" w16cid:durableId="909971478">
-    <w:abstractNumId w:val="10"/>
-  </w:num>
-  <w:num w:numId="40" w16cid:durableId="27068207">
-    <w:abstractNumId w:val="34"/>
-  </w:num>
-  <w:num w:numId="41" w16cid:durableId="1692340260">
-    <w:abstractNumId w:val="14"/>
+  <w:num w:numId="50" w16cid:durableId="1185438867">
+    <w:abstractNumId w:val="29"/>
   </w:num>
 </w:numbering>
 </file>

</xml_diff>